<commit_message>
Male upravy v textu
</commit_message>
<xml_diff>
--- a/maturitni_prace.docx
+++ b/maturitni_prace.docx
@@ -10,6 +10,7 @@
       <w:bookmarkStart w:id="1" w:name="_Hlk145405862"/>
       <w:r>
         <w:rPr>
+          <w:noProof/>
           <w:sz w:val="36"/>
         </w:rPr>
         <w:drawing>
@@ -102,9 +103,6 @@
         </w:sectPr>
       </w:pPr>
       <w:r>
-        <w:rPr>
-          <w:noProof w:val="0"/>
-        </w:rPr>
         <mc:AlternateContent>
           <mc:Choice Requires="wps">
             <w:drawing>
@@ -234,9 +232,6 @@
         </mc:AlternateContent>
       </w:r>
       <w:r>
-        <w:rPr>
-          <w:noProof w:val="0"/>
-        </w:rPr>
         <mc:AlternateContent>
           <mc:Choice Requires="wps">
             <w:drawing>
@@ -975,7 +970,10 @@
         <w:fldChar w:fldCharType="separate"/>
       </w:r>
       <w:r>
-        <w:t>24. ledna 2026</w:t>
+        <w:rPr>
+          <w:noProof/>
+        </w:rPr>
+        <w:t>5. února 2026</w:t>
       </w:r>
       <w:r>
         <w:fldChar w:fldCharType="end"/>
@@ -1034,7 +1032,10 @@
         <w:fldChar w:fldCharType="separate"/>
       </w:r>
       <w:r>
-        <w:t>24. ledna 2026</w:t>
+        <w:rPr>
+          <w:noProof/>
+        </w:rPr>
+        <w:t>5. února 2026</w:t>
       </w:r>
       <w:r>
         <w:fldChar w:fldCharType="end"/>
@@ -6092,7 +6093,6 @@
         <w:fldChar w:fldCharType="end"/>
       </w:r>
     </w:p>
-    <w:p/>
     <w:p>
       <w:r>
         <w:t>Jako alternativa se doporučuje použití </w:t>
@@ -6127,7 +6127,6 @@
         <w:fldChar w:fldCharType="end"/>
       </w:r>
     </w:p>
-    <w:p/>
     <w:p>
       <w:r>
         <w:t>Je dobré taky používat více faktorové ověřování (MFA), pokud je to možné. MFA při přihlašování k účtu vyžaduje více druhů ověření. Jako například je klasické jméno a</w:t>
@@ -6157,7 +6156,6 @@
         <w:fldChar w:fldCharType="end"/>
       </w:r>
     </w:p>
-    <w:p/>
     <w:p>
       <w:pPr>
         <w:pStyle w:val="Nadpis2"/>
@@ -6170,6 +6168,7 @@
         <w:rPr>
           <w:rFonts w:eastAsiaTheme="minorEastAsia"/>
         </w:rPr>
+        <w:lastRenderedPageBreak/>
         <w:t>Architektura aplikací</w:t>
       </w:r>
       <w:bookmarkEnd w:id="23"/>
@@ -6350,16 +6349,375 @@
     </w:p>
     <w:p>
       <w:pPr>
+        <w:pStyle w:val="Nadpis3"/>
+      </w:pPr>
+      <w:bookmarkStart w:id="25" w:name="_Toc220153166"/>
+      <w:r>
+        <w:t>Desktop vs</w:t>
+      </w:r>
+      <w:r>
+        <w:t>.</w:t>
+      </w:r>
+      <w:r>
+        <w:t xml:space="preserve"> </w:t>
+      </w:r>
+      <w:proofErr w:type="gramStart"/>
+      <w:r>
+        <w:t>W</w:t>
+      </w:r>
+      <w:r>
+        <w:t>eb</w:t>
+      </w:r>
+      <w:bookmarkEnd w:id="25"/>
+      <w:proofErr w:type="gramEnd"/>
+    </w:p>
+    <w:p>
+      <w:pPr>
         <w:pStyle w:val="Pokraovn"/>
       </w:pPr>
+      <w:r>
+        <w:t>Základní rozdíl mezi webovými a desktopovými aplikacemi spočívá v způsobu přístupu a interakce. Webové aplikace se používají přímo v prohlížeči a jsou podmíněny funkčním internetovým připojením, což přináší výhody univerzální dostupnosti, ale i riziko závislosti na síti.</w:t>
+      </w:r>
+      <w:r>
+        <w:t xml:space="preserve"> </w:t>
+      </w:r>
+      <w:r>
+        <w:fldChar w:fldCharType="begin"/>
+      </w:r>
+      <w:r>
+        <w:instrText xml:space="preserve"> REF _Ref218420319 \r \h </w:instrText>
+      </w:r>
+      <w:r>
+        <w:fldChar w:fldCharType="separate"/>
+      </w:r>
+      <w:r>
+        <w:t>[6]</w:t>
+      </w:r>
+      <w:r>
+        <w:fldChar w:fldCharType="end"/>
+      </w:r>
+    </w:p>
+    <w:p>
+      <w:pPr>
+        <w:pStyle w:val="Pokraovn"/>
+      </w:pPr>
+      <w:r>
+        <w:t xml:space="preserve">V oblasti výkonu a využití systémových prostředků mají desktopové aplikace výhodu díky přímému přístupu k hardwaru počítače. To jim umožňuje efektivněji zvládat </w:t>
+      </w:r>
+      <w:r>
+        <w:lastRenderedPageBreak/>
+        <w:t xml:space="preserve">výpočetně náročné operace, jako je složité zpracování dat nebo grafické </w:t>
+      </w:r>
+      <w:proofErr w:type="spellStart"/>
+      <w:r>
+        <w:t>renderingy</w:t>
+      </w:r>
+      <w:proofErr w:type="spellEnd"/>
+      <w:r>
+        <w:t>.</w:t>
+      </w:r>
+      <w:r>
+        <w:t xml:space="preserve"> </w:t>
+      </w:r>
+      <w:r>
+        <w:fldChar w:fldCharType="begin"/>
+      </w:r>
+      <w:r>
+        <w:instrText xml:space="preserve"> REF _Ref218420319 \r \h </w:instrText>
+      </w:r>
+      <w:r>
+        <w:fldChar w:fldCharType="separate"/>
+      </w:r>
+      <w:r>
+        <w:t>[6]</w:t>
+      </w:r>
+      <w:r>
+        <w:fldChar w:fldCharType="end"/>
+      </w:r>
+    </w:p>
+    <w:p>
+      <w:pPr>
+        <w:pStyle w:val="Pokraovn"/>
+      </w:pPr>
+      <w:r>
+        <w:t>Další významný rozdíl se týká aktualizací a údržby. Zatímco desktopové aplikace často vyžadují aktivní instalaci nových verzí od uživatele, webové aplikace lze aktualizovat centrálně na straně serveru, což zajišťuje okamžitou a jednotnou verzi pro všechny koncové uživatele.</w:t>
+      </w:r>
+      <w:r>
+        <w:fldChar w:fldCharType="begin"/>
+      </w:r>
+      <w:r>
+        <w:instrText xml:space="preserve"> REF _Ref218420319 \r \h </w:instrText>
+      </w:r>
+      <w:r>
+        <w:fldChar w:fldCharType="separate"/>
+      </w:r>
+      <w:r>
+        <w:t>[6]</w:t>
+      </w:r>
+      <w:r>
+        <w:fldChar w:fldCharType="end"/>
+      </w:r>
+    </w:p>
+    <w:p>
+      <w:pPr>
+        <w:pStyle w:val="Pokraovn"/>
+      </w:pPr>
+      <w:r>
+        <w:t xml:space="preserve">Do budoucna se očekává, že hranice mezi oběma přístupy bude dále zmenšovat ve prospěch hybridních, </w:t>
+      </w:r>
+      <w:r>
+        <w:t>platformě</w:t>
+      </w:r>
+      <w:r>
+        <w:t xml:space="preserve"> nezávislých řešení. Pro vývojáře i firmy je proto klíčové sledovat technologický vývoj a přizpůsobovat své strategie tak, aby mohli efektivně využívat nové </w:t>
+      </w:r>
+      <w:r>
+        <w:t xml:space="preserve">možnosti. </w:t>
+      </w:r>
+      <w:r>
+        <w:fldChar w:fldCharType="begin"/>
+      </w:r>
+      <w:r>
+        <w:instrText xml:space="preserve"> REF _Ref218420319 \r \h </w:instrText>
+      </w:r>
+      <w:r>
+        <w:fldChar w:fldCharType="separate"/>
+      </w:r>
+      <w:r>
+        <w:t>[6]</w:t>
+      </w:r>
+      <w:r>
+        <w:fldChar w:fldCharType="end"/>
+      </w:r>
     </w:p>
     <w:p>
       <w:pPr>
         <w:pStyle w:val="Nadpis3"/>
-      </w:pPr>
-      <w:bookmarkStart w:id="25" w:name="_Toc220153166"/>
-      <w:r>
-        <w:t>Desktop vs</w:t>
+        <w:rPr>
+          <w:color w:val="auto"/>
+        </w:rPr>
+      </w:pPr>
+      <w:bookmarkStart w:id="26" w:name="_Toc220153167"/>
+      <w:r>
+        <w:rPr>
+          <w:color w:val="auto"/>
+        </w:rPr>
+        <w:t>U</w:t>
+      </w:r>
+      <w:r>
+        <w:rPr>
+          <w:color w:val="auto"/>
+        </w:rPr>
+        <w:t>X</w:t>
+      </w:r>
+      <w:r>
+        <w:rPr>
+          <w:color w:val="auto"/>
+        </w:rPr>
+        <w:t xml:space="preserve"> zásady</w:t>
+      </w:r>
+      <w:bookmarkEnd w:id="26"/>
+    </w:p>
+    <w:p>
+      <w:pPr>
+        <w:pStyle w:val="Pokraovn"/>
+      </w:pPr>
+      <w:r>
+        <w:t xml:space="preserve">User </w:t>
+      </w:r>
+      <w:proofErr w:type="spellStart"/>
+      <w:r>
+        <w:t>Experience</w:t>
+      </w:r>
+      <w:proofErr w:type="spellEnd"/>
+      <w:r>
+        <w:t xml:space="preserve"> (UX</w:t>
+      </w:r>
+      <w:r>
+        <w:t>), neboli uživatelská zkušenost, představuje souhrn pocitů a</w:t>
+      </w:r>
+      <w:r>
+        <w:t> </w:t>
+      </w:r>
+      <w:r>
+        <w:t>dojmů, které člověk získá při interakci s digitálním produktem – ať už je to web, mobilní aplikace nebo e-shop. Hlavním úkolem UX designera je vytvořit takovou podobu produktu, která uživatele přirozeně, intuitivně a bez zbytečných překážek dovede k jeho cíli. Tento návrh musí úspěšně spojovat funkčnost a</w:t>
+      </w:r>
+      <w:r>
+        <w:t> </w:t>
+      </w:r>
+      <w:r>
+        <w:t>použitelnost</w:t>
+      </w:r>
+      <w:r>
+        <w:t xml:space="preserve"> </w:t>
+      </w:r>
+      <w:r>
+        <w:t>s</w:t>
+      </w:r>
+      <w:r>
+        <w:t> </w:t>
+      </w:r>
+      <w:r>
+        <w:t>estetickou</w:t>
+      </w:r>
+      <w:r>
+        <w:t xml:space="preserve"> hodnotou a užitečností. Celý proces UX designu je založen na hlubokém porozumění cílovému uživateli, jeho potřebám, záměrům a</w:t>
+      </w:r>
+      <w:r>
+        <w:t> </w:t>
+      </w:r>
+      <w:r>
+        <w:t>technologické zběhlosti.</w:t>
+      </w:r>
+      <w:r>
+        <w:t xml:space="preserve"> </w:t>
+      </w:r>
+      <w:r>
+        <w:fldChar w:fldCharType="begin"/>
+      </w:r>
+      <w:r>
+        <w:instrText xml:space="preserve"> REF _Ref218865285 \r \h </w:instrText>
+      </w:r>
+      <w:r>
+        <w:fldChar w:fldCharType="separate"/>
+      </w:r>
+      <w:r>
+        <w:t>[7]</w:t>
+      </w:r>
+      <w:r>
+        <w:fldChar w:fldCharType="end"/>
+      </w:r>
+    </w:p>
+    <w:p>
+      <w:pPr>
+        <w:pStyle w:val="Nadpis3"/>
+      </w:pPr>
+      <w:bookmarkStart w:id="27" w:name="_Toc220153168"/>
+      <w:r>
+        <w:t>UI zásady</w:t>
+      </w:r>
+      <w:bookmarkEnd w:id="27"/>
+    </w:p>
+    <w:p>
+      <w:pPr>
+        <w:pStyle w:val="Pokraovn"/>
+      </w:pPr>
+      <w:r>
+        <w:t>User Interface</w:t>
+      </w:r>
+      <w:r>
+        <w:t xml:space="preserve"> (UI</w:t>
+      </w:r>
+      <w:r>
+        <w:t>), neboli uživatelské rozhraní, představuje vizuální a interakční vrstvu digitálního produktu. Definuje podobu a chování prvků, které uživatel vidí a na které kliká – ať už na webové stránce, v mobilní aplikaci nebo v softwaru. Ústředním cílem návrhu uživatelského rozhraní je vytvořit prostředí, které je pro koncového uživatele maximálně intuitivní, přehledné a snadno ovladatelné.</w:t>
+      </w:r>
+      <w:r>
+        <w:t xml:space="preserve"> </w:t>
+      </w:r>
+      <w:r>
+        <w:fldChar w:fldCharType="begin"/>
+      </w:r>
+      <w:r>
+        <w:instrText xml:space="preserve"> REF _Ref218865285 \r \h </w:instrText>
+      </w:r>
+      <w:r>
+        <w:fldChar w:fldCharType="separate"/>
+      </w:r>
+      <w:r>
+        <w:t>[7]</w:t>
+      </w:r>
+      <w:r>
+        <w:fldChar w:fldCharType="end"/>
+      </w:r>
+    </w:p>
+    <w:p>
+      <w:pPr>
+        <w:pStyle w:val="Pokraovn"/>
+      </w:pPr>
+      <w:r>
+        <w:t>Klíč k takovému designu spočívá v důsledném uplatňování několika vzájemně propojených zásad. Návrh musí vycházet z přesně definované cílové skupiny a brát v</w:t>
+      </w:r>
+      <w:r>
+        <w:t> </w:t>
+      </w:r>
+      <w:r>
+        <w:t>úvahu její technické znalosti a zkušenosti. Rozhraní by mělo prezentovat funkce jednoznačně</w:t>
+      </w:r>
+      <w:r>
+        <w:t>,</w:t>
+      </w:r>
+      <w:r>
+        <w:t xml:space="preserve"> jednoduše</w:t>
+      </w:r>
+      <w:r>
+        <w:t xml:space="preserve"> a</w:t>
+      </w:r>
+      <w:r>
+        <w:t xml:space="preserve"> umožňovat okamžitou orientaci. Nedílnou součástí je </w:t>
+      </w:r>
+      <w:r>
+        <w:lastRenderedPageBreak/>
+        <w:t>i</w:t>
+      </w:r>
+      <w:r>
+        <w:t> </w:t>
+      </w:r>
+      <w:r>
+        <w:t xml:space="preserve">estetická </w:t>
+      </w:r>
+      <w:r>
+        <w:t>působivost,</w:t>
+      </w:r>
+      <w:r>
+        <w:t xml:space="preserve"> a především neustálé ověřování celé koncepce prostřednictvím testování s reálnými uživateli.</w:t>
+      </w:r>
+      <w:r>
+        <w:t xml:space="preserve"> </w:t>
+      </w:r>
+      <w:r>
+        <w:fldChar w:fldCharType="begin"/>
+      </w:r>
+      <w:r>
+        <w:instrText xml:space="preserve"> REF _Ref218865285 \r \h </w:instrText>
+      </w:r>
+      <w:r>
+        <w:fldChar w:fldCharType="separate"/>
+      </w:r>
+      <w:r>
+        <w:t>[7</w:t>
+      </w:r>
+      <w:r>
+        <w:t>]</w:t>
+      </w:r>
+      <w:r>
+        <w:fldChar w:fldCharType="end"/>
+      </w:r>
+    </w:p>
+    <w:p>
+      <w:pPr>
+        <w:pStyle w:val="Nadpis2"/>
+        <w:rPr>
+          <w:color w:val="auto"/>
+        </w:rPr>
+      </w:pPr>
+      <w:bookmarkStart w:id="28" w:name="_Toc220153169"/>
+      <w:r>
+        <w:rPr>
+          <w:color w:val="auto"/>
+        </w:rPr>
+        <w:t>Databáze</w:t>
+      </w:r>
+      <w:bookmarkEnd w:id="28"/>
+    </w:p>
+    <w:p>
+      <w:pPr>
+        <w:pStyle w:val="Pokraovn"/>
+      </w:pPr>
+      <w:r>
+        <w:t>Databáze slouží ke sběru a organizaci informací. Uchovávají data o lidech, produktech, objednávkách či čemkoli jiném. Počítačová databáze je kontejnerem objektů. Jedna databáze může zahrnovat více tabulek. Často vznikají z jednoduchého seznamu v textovém editoru nebo tabulkovém kalkulátoru. Když seznam narůstá, objevují se v datech duplicity a nesrovnalosti. Seznamová data pak ztrácejí přehlednost, stávají se hůře srozumitelnými a možnosti jejich vyhledávání nebo výběru částí ke kontrole jsou omezené. V okamžiku, kdy se tyto potíže projeví, je vhodné data přesunout do databáze vytvořené pomocí systému pro správu databází</w:t>
+      </w:r>
+      <w:r>
+        <w:t xml:space="preserve"> (DBMS)</w:t>
       </w:r>
       <w:r>
         <w:t>.</w:t>
@@ -6368,19 +6726,46 @@
         <w:t xml:space="preserve"> </w:t>
       </w:r>
       <w:r>
-        <w:t>W</w:t>
-      </w:r>
-      <w:r>
-        <w:t>eb</w:t>
-      </w:r>
-      <w:bookmarkEnd w:id="25"/>
+        <w:fldChar w:fldCharType="begin"/>
+      </w:r>
+      <w:r>
+        <w:instrText xml:space="preserve"> REF _Ref218865257 \r \h </w:instrText>
+      </w:r>
+      <w:r>
+        <w:fldChar w:fldCharType="separate"/>
+      </w:r>
+      <w:r>
+        <w:t>[8]</w:t>
+      </w:r>
+      <w:r>
+        <w:fldChar w:fldCharType="end"/>
+      </w:r>
+    </w:p>
+    <w:p>
+      <w:pPr>
+        <w:pStyle w:val="Nadpis3"/>
+      </w:pPr>
+      <w:bookmarkStart w:id="29" w:name="_Toc220153170"/>
+      <w:r>
+        <w:t>Relační model</w:t>
+      </w:r>
+      <w:bookmarkEnd w:id="29"/>
+      <w:r>
+        <w:t xml:space="preserve"> </w:t>
+      </w:r>
     </w:p>
     <w:p>
       <w:pPr>
         <w:pStyle w:val="Pokraovn"/>
       </w:pPr>
       <w:r>
-        <w:t>Základní rozdíl mezi webovými a desktopovými aplikacemi spočívá v způsobu přístupu a interakce. Webové aplikace se používají přímo v prohlížeči a jsou podmíněny funkčním internetovým připojením, což přináší výhody univerzální dostupnosti, ale i riziko závislosti na síti.</w:t>
+        <w:t>Relační databáze je databázový systém založený na vztazích mezi daty. Skládá se z</w:t>
+      </w:r>
+      <w:r>
+        <w:t> </w:t>
+      </w:r>
+      <w:r>
+        <w:t>jednotlivých tabulek, které jsou vzájemně propojeny. Každá tabulka uchovává strukturované informace pouze o jedné konkrétní oblasti. Základem tohoto typu databáze je relační model, který tvoří základ většiny současných komerčních databázových systémů.</w:t>
       </w:r>
       <w:r>
         <w:t xml:space="preserve"> </w:t>
@@ -6389,13 +6774,13 @@
         <w:fldChar w:fldCharType="begin"/>
       </w:r>
       <w:r>
-        <w:instrText xml:space="preserve"> REF _Ref218420319 \r \h </w:instrText>
+        <w:instrText xml:space="preserve"> REF _Ref218865222 \r \h </w:instrText>
       </w:r>
       <w:r>
         <w:fldChar w:fldCharType="separate"/>
       </w:r>
       <w:r>
-        <w:t>[6]</w:t>
+        <w:t>[9]</w:t>
       </w:r>
       <w:r>
         <w:fldChar w:fldCharType="end"/>
@@ -6406,489 +6791,127 @@
         <w:pStyle w:val="Pokraovn"/>
       </w:pPr>
       <w:r>
+        <w:t>Tabulky, které jsou stavebním kamenem relačních databází, jsou propojeny předem definovanými vazbami. Strukturu tabulky tvoří sloupce neboli atributy a řádky představující záznamy. Atributy určují vlastnosti entit, které jsou do tabulky ukládány</w:t>
+      </w:r>
+      <w:r>
+        <w:t>,</w:t>
+      </w:r>
+      <w:r>
+        <w:t xml:space="preserve"> v jedné tabulce se nacházejí entity stejného typu, přičemž každá je zaznamenána pouze jedinkrát. Relace pak vyjadřuje vazbu mezi prvky jedné či více množin. Lze ji popsat jako dvourozměrnou strukturu složenou z řádků a sloupců.</w:t>
+      </w:r>
+      <w:r>
+        <w:t xml:space="preserve"> </w:t>
+      </w:r>
+      <w:r>
+        <w:fldChar w:fldCharType="begin"/>
+      </w:r>
+      <w:r>
+        <w:instrText xml:space="preserve"> REF _Ref218865222 \r \h </w:instrText>
+      </w:r>
+      <w:r>
+        <w:fldChar w:fldCharType="separate"/>
+      </w:r>
+      <w:r>
+        <w:t>[9]</w:t>
+      </w:r>
+      <w:r>
+        <w:fldChar w:fldCharType="end"/>
+      </w:r>
+    </w:p>
+    <w:p>
+      <w:pPr>
+        <w:pStyle w:val="Nadpis3"/>
+        <w:rPr>
+          <w:color w:val="auto"/>
+        </w:rPr>
+      </w:pPr>
+      <w:bookmarkStart w:id="30" w:name="_Toc220153171"/>
+      <w:r>
+        <w:rPr>
+          <w:color w:val="auto"/>
+        </w:rPr>
+        <w:t>SQL příkazy</w:t>
+      </w:r>
+      <w:bookmarkEnd w:id="30"/>
+      <w:r>
+        <w:rPr>
+          <w:color w:val="auto"/>
+        </w:rPr>
+        <w:t xml:space="preserve"> </w:t>
+      </w:r>
+    </w:p>
+    <w:p>
+      <w:pPr>
+        <w:pStyle w:val="Pokraovn"/>
+      </w:pPr>
+      <w:r>
+        <w:t>Jazyk SQL využívá pro tvorbu příkazů a dotazů řadu klíčových slov.</w:t>
+      </w:r>
+      <w:r>
+        <w:fldChar w:fldCharType="begin"/>
+      </w:r>
+      <w:r>
+        <w:instrText xml:space="preserve"> REF _Ref218420855 \r \h </w:instrText>
+      </w:r>
+      <w:r>
+        <w:fldChar w:fldCharType="separate"/>
+      </w:r>
+      <w:r>
+        <w:t>[10]</w:t>
+      </w:r>
+      <w:r>
+        <w:fldChar w:fldCharType="end"/>
+      </w:r>
+      <w:r>
+        <w:t xml:space="preserve"> </w:t>
+      </w:r>
+    </w:p>
+    <w:p>
+      <w:pPr>
+        <w:pStyle w:val="Pokraovn"/>
+      </w:pPr>
+      <w:r>
+        <w:t>Příkaz (</w:t>
+      </w:r>
+      <w:proofErr w:type="spellStart"/>
+      <w:r>
+        <w:t>statement</w:t>
+      </w:r>
+      <w:proofErr w:type="spellEnd"/>
+      <w:r>
+        <w:t>) tvoří posloupnost znaků a klíčových slov SQL, která dodržuje pravidla syntaxe a formátování jazyka. Tento příkaz může ovlivňovat data nebo řídit s</w:t>
+      </w:r>
+      <w:r>
+        <w:t> </w:t>
+      </w:r>
+      <w:r>
+        <w:t>nimi související procesy. Lze si ho představit jako "úplnou větu" v SQL, kterou lze úspěšně předat systému pro správu databáze.</w:t>
+      </w:r>
+      <w:r>
+        <w:t xml:space="preserve"> </w:t>
+      </w:r>
+      <w:r>
+        <w:fldChar w:fldCharType="begin"/>
+      </w:r>
+      <w:r>
+        <w:instrText xml:space="preserve"> REF _Ref218420855 \r \h </w:instrText>
+      </w:r>
+      <w:r>
+        <w:fldChar w:fldCharType="separate"/>
+      </w:r>
+      <w:r>
+        <w:t>[10]</w:t>
+      </w:r>
+      <w:r>
+        <w:fldChar w:fldCharType="end"/>
+      </w:r>
+    </w:p>
+    <w:p>
+      <w:pPr>
+        <w:pStyle w:val="Pokraovn"/>
+      </w:pPr>
+      <w:r>
         <w:lastRenderedPageBreak/>
-        <w:t xml:space="preserve">V oblasti výkonu a využití systémových prostředků mají desktopové aplikace výhodu díky přímému přístupu k hardwaru počítače. To jim umožňuje efektivněji zvládat výpočetně náročné operace, jako je složité zpracování dat nebo grafické </w:t>
-      </w:r>
-      <w:proofErr w:type="spellStart"/>
-      <w:r>
-        <w:t>renderingy</w:t>
-      </w:r>
-      <w:proofErr w:type="spellEnd"/>
-      <w:r>
-        <w:t>.</w:t>
-      </w:r>
-      <w:r>
-        <w:t xml:space="preserve"> </w:t>
-      </w:r>
-      <w:r>
-        <w:fldChar w:fldCharType="begin"/>
-      </w:r>
-      <w:r>
-        <w:instrText xml:space="preserve"> REF _Ref218420319 \r \h </w:instrText>
-      </w:r>
-      <w:r>
-        <w:fldChar w:fldCharType="separate"/>
-      </w:r>
-      <w:r>
-        <w:t>[6]</w:t>
-      </w:r>
-      <w:r>
-        <w:fldChar w:fldCharType="end"/>
-      </w:r>
-    </w:p>
-    <w:p>
-      <w:pPr>
-        <w:pStyle w:val="Pokraovn"/>
-      </w:pPr>
-      <w:r>
-        <w:t>Další významný rozdíl se týká aktualizací a údržby. Zatímco desktopové aplikace často vyžadují aktivní instalaci nových verzí od uživatele, webové aplikace lze aktualizovat centrálně na straně serveru, což zajišťuje okamžitou a jednotnou verzi pro všechny koncové uživatele.</w:t>
-      </w:r>
-      <w:r>
-        <w:fldChar w:fldCharType="begin"/>
-      </w:r>
-      <w:r>
-        <w:instrText xml:space="preserve"> REF _Ref218420319 \r \h </w:instrText>
-      </w:r>
-      <w:r>
-        <w:fldChar w:fldCharType="separate"/>
-      </w:r>
-      <w:r>
-        <w:t>[6]</w:t>
-      </w:r>
-      <w:r>
-        <w:fldChar w:fldCharType="end"/>
-      </w:r>
-    </w:p>
-    <w:p>
-      <w:pPr>
-        <w:pStyle w:val="Pokraovn"/>
-      </w:pPr>
-      <w:r>
-        <w:t xml:space="preserve">Do budoucna se očekává, že hranice mezi oběma přístupy bude dále zmenšovat ve prospěch hybridních, </w:t>
-      </w:r>
-      <w:proofErr w:type="spellStart"/>
-      <w:r>
-        <w:t>platformně</w:t>
-      </w:r>
-      <w:proofErr w:type="spellEnd"/>
-      <w:r>
-        <w:t xml:space="preserve"> nezávislých řešení. Pro vývojáře i firmy je proto klíčové sledovat technologický vývoj a přizpůsobovat své strategie tak, aby mohli efektivně využívat nové </w:t>
-      </w:r>
-      <w:r>
-        <w:t xml:space="preserve">možnosti. </w:t>
-      </w:r>
-      <w:r>
-        <w:fldChar w:fldCharType="begin"/>
-      </w:r>
-      <w:r>
-        <w:instrText xml:space="preserve"> REF _Ref218420319 \r \h </w:instrText>
-      </w:r>
-      <w:r>
-        <w:fldChar w:fldCharType="separate"/>
-      </w:r>
-      <w:r>
-        <w:t>[6]</w:t>
-      </w:r>
-      <w:r>
-        <w:fldChar w:fldCharType="end"/>
-      </w:r>
-    </w:p>
-    <w:p>
-      <w:pPr>
-        <w:pStyle w:val="Nadpis3"/>
-        <w:rPr>
-          <w:color w:val="auto"/>
-        </w:rPr>
-      </w:pPr>
-      <w:bookmarkStart w:id="26" w:name="_Toc220153167"/>
-      <w:r>
-        <w:rPr>
-          <w:color w:val="auto"/>
-        </w:rPr>
-        <w:t>U</w:t>
-      </w:r>
-      <w:r>
-        <w:rPr>
-          <w:color w:val="auto"/>
-        </w:rPr>
-        <w:t>X</w:t>
-      </w:r>
-      <w:r>
-        <w:rPr>
-          <w:color w:val="auto"/>
-        </w:rPr>
-        <w:t xml:space="preserve"> zásady</w:t>
-      </w:r>
-      <w:bookmarkEnd w:id="26"/>
-    </w:p>
-    <w:p>
-      <w:pPr>
-        <w:pStyle w:val="Pokraovn"/>
-      </w:pPr>
-      <w:r>
-        <w:t xml:space="preserve">User </w:t>
-      </w:r>
-      <w:proofErr w:type="spellStart"/>
-      <w:r>
-        <w:t>Experience</w:t>
-      </w:r>
-      <w:proofErr w:type="spellEnd"/>
-      <w:r>
-        <w:t xml:space="preserve"> (UX</w:t>
-      </w:r>
-      <w:r>
-        <w:t>), neboli uživatelská zkušenost, představuje souhrn pocitů a</w:t>
-      </w:r>
-      <w:r>
-        <w:t> </w:t>
-      </w:r>
-      <w:r>
-        <w:t>dojmů, které člověk získá při interakci s digitálním produktem – ať už je to web, mobilní aplikace nebo e-shop. Hlavním úkolem UX designera je vytvořit takovou podobu produktu, která uživatele přirozeně, intuitivně a bez zbytečných překážek dovede k jeho cíli. Tento návrh musí úspěšně spojovat funkčnost a</w:t>
-      </w:r>
-      <w:r>
-        <w:t> </w:t>
-      </w:r>
-      <w:r>
-        <w:t>použitelnost s estetickou hodnotou a užitečností. Celý proces UX designu je založen na hlubokém porozumění cílovému uživateli, jeho potřebám, záměrům a</w:t>
-      </w:r>
-      <w:r>
-        <w:t> </w:t>
-      </w:r>
-      <w:r>
-        <w:t>technologické zběhlosti.</w:t>
-      </w:r>
-      <w:r>
-        <w:t xml:space="preserve"> </w:t>
-      </w:r>
-      <w:r>
-        <w:fldChar w:fldCharType="begin"/>
-      </w:r>
-      <w:r>
-        <w:instrText xml:space="preserve"> REF _Ref218865285 \r \h </w:instrText>
-      </w:r>
-      <w:r>
-        <w:fldChar w:fldCharType="separate"/>
-      </w:r>
-      <w:r>
-        <w:t>[7]</w:t>
-      </w:r>
-      <w:r>
-        <w:fldChar w:fldCharType="end"/>
-      </w:r>
-    </w:p>
-    <w:p>
-      <w:pPr>
-        <w:pStyle w:val="Nadpis3"/>
-      </w:pPr>
-      <w:bookmarkStart w:id="27" w:name="_Toc220153168"/>
-      <w:r>
-        <w:t>UI zásady</w:t>
-      </w:r>
-      <w:bookmarkEnd w:id="27"/>
-    </w:p>
-    <w:p>
-      <w:pPr>
-        <w:pStyle w:val="Pokraovn"/>
-      </w:pPr>
-      <w:r>
-        <w:t>User Interface</w:t>
-      </w:r>
-      <w:r>
-        <w:t xml:space="preserve"> (UI</w:t>
-      </w:r>
-      <w:r>
-        <w:t>), neboli uživatelské rozhraní, představuje vizuální a interakční vrstvu digitálního produktu. Definuje podobu a chování prvků, které uživatel vidí a na které kliká – ať už na webové stránce, v mobilní aplikaci nebo v softwaru. Ústředním cílem návrhu uživatelského rozhraní je vytvořit prostředí, které je pro koncového uživatele maximálně intuitivní, přehledné a snadno ovladatelné.</w:t>
-      </w:r>
-      <w:r>
-        <w:t xml:space="preserve"> </w:t>
-      </w:r>
-      <w:r>
-        <w:fldChar w:fldCharType="begin"/>
-      </w:r>
-      <w:r>
-        <w:instrText xml:space="preserve"> REF _Ref218865285 \r \h </w:instrText>
-      </w:r>
-      <w:r>
-        <w:fldChar w:fldCharType="separate"/>
-      </w:r>
-      <w:r>
-        <w:t>[7]</w:t>
-      </w:r>
-      <w:r>
-        <w:fldChar w:fldCharType="end"/>
-      </w:r>
-    </w:p>
-    <w:p>
-      <w:pPr>
-        <w:pStyle w:val="Pokraovn"/>
-      </w:pPr>
-      <w:r>
-        <w:t>Klíč k takovému designu spočívá v důsledném uplatňování několika vzájemně propojených zásad. Návrh musí vycházet z přesně definované cílové skupiny a brát v</w:t>
-      </w:r>
-      <w:r>
-        <w:t> </w:t>
-      </w:r>
-      <w:r>
-        <w:t xml:space="preserve">úvahu její technické znalosti a zkušenosti. Rozhraní by mělo prezentovat funkce </w:t>
-      </w:r>
-      <w:r>
-        <w:lastRenderedPageBreak/>
-        <w:t xml:space="preserve">jednoznačně a jednoduše, umožňovat okamžitou orientaci a navozovat u uživatele pocit jistoty a bezpečí. Nedílnou součástí je i estetická </w:t>
-      </w:r>
-      <w:r>
-        <w:t>působivost,</w:t>
-      </w:r>
-      <w:r>
-        <w:t xml:space="preserve"> a především neustálé ověřování celé koncepce prostřednictvím testování s reálnými uživateli.</w:t>
-      </w:r>
-      <w:r>
-        <w:t xml:space="preserve"> </w:t>
-      </w:r>
-      <w:r>
-        <w:fldChar w:fldCharType="begin"/>
-      </w:r>
-      <w:r>
-        <w:instrText xml:space="preserve"> REF _Ref218865285 \r \h </w:instrText>
-      </w:r>
-      <w:r>
-        <w:fldChar w:fldCharType="separate"/>
-      </w:r>
-      <w:r>
-        <w:t>[7]</w:t>
-      </w:r>
-      <w:r>
-        <w:fldChar w:fldCharType="end"/>
-      </w:r>
-    </w:p>
-    <w:p>
-      <w:pPr>
-        <w:pStyle w:val="Pokraovn"/>
-      </w:pPr>
-    </w:p>
-    <w:p>
-      <w:pPr>
-        <w:pStyle w:val="Nadpis2"/>
-        <w:rPr>
-          <w:color w:val="auto"/>
-        </w:rPr>
-      </w:pPr>
-      <w:bookmarkStart w:id="28" w:name="_Toc220153169"/>
-      <w:r>
-        <w:rPr>
-          <w:color w:val="auto"/>
-        </w:rPr>
-        <w:t>Databáze</w:t>
-      </w:r>
-      <w:bookmarkEnd w:id="28"/>
-    </w:p>
-    <w:p>
-      <w:pPr>
-        <w:pStyle w:val="Pokraovn"/>
-      </w:pPr>
-      <w:r>
-        <w:t>Databáze slouží ke sběru a organizaci informací. Uchovávají data o lidech, produktech, objednávkách či čemkoli jiném. Počítačová databáze je kontejnerem objektů. Jedna databáze může zahrnovat více tabulek. Často vznikají z jednoduchého seznamu v textovém editoru nebo tabulkovém kalkulátoru. Když seznam narůstá, objevují se v datech duplicity a nesrovnalosti. Seznamová data pak ztrácejí přehlednost, stávají se hůře srozumitelnými a možnosti jejich vyhledávání nebo výběru částí ke kontrole jsou omezené. V okamžiku, kdy se tyto potíže projeví, je vhodné data přesunout do databáze vytvořené pomocí systému pro správu databází</w:t>
-      </w:r>
-      <w:r>
-        <w:t xml:space="preserve"> (DBMS)</w:t>
-      </w:r>
-      <w:r>
-        <w:t>.</w:t>
-      </w:r>
-      <w:r>
-        <w:t xml:space="preserve"> </w:t>
-      </w:r>
-      <w:r>
-        <w:fldChar w:fldCharType="begin"/>
-      </w:r>
-      <w:r>
-        <w:instrText xml:space="preserve"> REF _Ref218865257 \r \h </w:instrText>
-      </w:r>
-      <w:r>
-        <w:fldChar w:fldCharType="separate"/>
-      </w:r>
-      <w:r>
-        <w:t>[8]</w:t>
-      </w:r>
-      <w:r>
-        <w:fldChar w:fldCharType="end"/>
-      </w:r>
-    </w:p>
-    <w:p>
-      <w:pPr>
-        <w:pStyle w:val="Nadpis3"/>
-      </w:pPr>
-      <w:bookmarkStart w:id="29" w:name="_Toc220153170"/>
-      <w:r>
-        <w:t>Relační model</w:t>
-      </w:r>
-      <w:bookmarkEnd w:id="29"/>
-      <w:r>
-        <w:t xml:space="preserve"> </w:t>
-      </w:r>
-    </w:p>
-    <w:p>
-      <w:pPr>
-        <w:pStyle w:val="Pokraovn"/>
-      </w:pPr>
-      <w:r>
-        <w:t>Relační databáze je databázový systém založený na vztazích mezi daty. Skládá se z</w:t>
-      </w:r>
-      <w:r>
-        <w:t> </w:t>
-      </w:r>
-      <w:r>
-        <w:t>jednotlivých tabulek, které jsou vzájemně propojeny. Každá tabulka uchovává strukturované informace pouze o jedné konkrétní oblasti. Základem tohoto typu databáze je relační model, který tvoří základ většiny současných komerčních databázových systémů.</w:t>
-      </w:r>
-      <w:r>
-        <w:t xml:space="preserve"> </w:t>
-      </w:r>
-      <w:r>
-        <w:fldChar w:fldCharType="begin"/>
-      </w:r>
-      <w:r>
-        <w:instrText xml:space="preserve"> REF _Ref218865222 \r \h </w:instrText>
-      </w:r>
-      <w:r>
-        <w:fldChar w:fldCharType="separate"/>
-      </w:r>
-      <w:r>
-        <w:t>[9]</w:t>
-      </w:r>
-      <w:r>
-        <w:fldChar w:fldCharType="end"/>
-      </w:r>
-    </w:p>
-    <w:p>
-      <w:pPr>
-        <w:pStyle w:val="Pokraovn"/>
-      </w:pPr>
-      <w:r>
-        <w:t>Tabulky, které jsou stavebním kamenem relačních databází, jsou propojeny předem definovanými vazbami. Strukturu tabulky tvoří sloupce neboli atributy a řádky představující záznamy. Atributy určují vlastnosti entit, které jsou do tabulky ukládány</w:t>
-      </w:r>
-      <w:r>
-        <w:t>,</w:t>
-      </w:r>
-      <w:r>
-        <w:t xml:space="preserve"> v jedné tabulce se nacházejí entity stejného typu, přičemž každá je zaznamenána pouze jedinkrát. Relace pak vyjadřuje vazbu mezi prvky jedné či více množin. Lze ji popsat jako dvourozměrnou strukturu složenou z řádků a sloupců.</w:t>
-      </w:r>
-      <w:r>
-        <w:t xml:space="preserve"> </w:t>
-      </w:r>
-      <w:r>
-        <w:fldChar w:fldCharType="begin"/>
-      </w:r>
-      <w:r>
-        <w:instrText xml:space="preserve"> REF _Ref218865222 \r \h </w:instrText>
-      </w:r>
-      <w:r>
-        <w:fldChar w:fldCharType="separate"/>
-      </w:r>
-      <w:r>
-        <w:t>[9]</w:t>
-      </w:r>
-      <w:r>
-        <w:fldChar w:fldCharType="end"/>
-      </w:r>
-    </w:p>
-    <w:p>
-      <w:pPr>
-        <w:pStyle w:val="Pokraovn"/>
-      </w:pPr>
-    </w:p>
-    <w:p>
-      <w:pPr>
-        <w:pStyle w:val="Nadpis3"/>
-        <w:rPr>
-          <w:color w:val="auto"/>
-        </w:rPr>
-      </w:pPr>
-      <w:bookmarkStart w:id="30" w:name="_Toc220153171"/>
-      <w:r>
-        <w:rPr>
-          <w:color w:val="auto"/>
-        </w:rPr>
-        <w:t>SQL příkazy</w:t>
-      </w:r>
-      <w:bookmarkEnd w:id="30"/>
-      <w:r>
-        <w:rPr>
-          <w:color w:val="auto"/>
-        </w:rPr>
-        <w:t xml:space="preserve"> </w:t>
-      </w:r>
-    </w:p>
-    <w:p>
-      <w:pPr>
-        <w:pStyle w:val="Pokraovn"/>
-      </w:pPr>
-      <w:r>
-        <w:t>Jazyk SQL využívá pro tvorbu příkazů a dotazů řadu klíčových slov.</w:t>
-      </w:r>
-      <w:r>
-        <w:fldChar w:fldCharType="begin"/>
-      </w:r>
-      <w:r>
-        <w:instrText xml:space="preserve"> REF _Ref218420855 \r \h </w:instrText>
-      </w:r>
-      <w:r>
-        <w:fldChar w:fldCharType="separate"/>
-      </w:r>
-      <w:r>
-        <w:t>[10]</w:t>
-      </w:r>
-      <w:r>
-        <w:fldChar w:fldCharType="end"/>
-      </w:r>
-      <w:r>
-        <w:t xml:space="preserve"> </w:t>
-      </w:r>
-    </w:p>
-    <w:p>
-      <w:pPr>
-        <w:pStyle w:val="Pokraovn"/>
-      </w:pPr>
-      <w:r>
-        <w:lastRenderedPageBreak/>
-        <w:t>Příkaz (</w:t>
-      </w:r>
-      <w:proofErr w:type="spellStart"/>
-      <w:r>
-        <w:t>statement</w:t>
-      </w:r>
-      <w:proofErr w:type="spellEnd"/>
-      <w:r>
-        <w:t>) tvoří posloupnost znaků a klíčových slov SQL, která dodržuje pravidla syntaxe a formátování jazyka. Tento příkaz může ovlivňovat data nebo řídit s</w:t>
-      </w:r>
-      <w:r>
-        <w:t> </w:t>
-      </w:r>
-      <w:r>
-        <w:t>nimi související procesy. Lze si ho představit jako "úplnou větu" v SQL, kterou lze úspěšně předat systému pro správu databáze.</w:t>
-      </w:r>
-      <w:r>
-        <w:t xml:space="preserve"> </w:t>
-      </w:r>
-      <w:r>
-        <w:fldChar w:fldCharType="begin"/>
-      </w:r>
-      <w:r>
-        <w:instrText xml:space="preserve"> REF _Ref218420855 \r \h </w:instrText>
-      </w:r>
-      <w:r>
-        <w:fldChar w:fldCharType="separate"/>
-      </w:r>
-      <w:r>
-        <w:t>[10]</w:t>
-      </w:r>
-      <w:r>
-        <w:fldChar w:fldCharType="end"/>
-      </w:r>
-    </w:p>
-    <w:p>
-      <w:pPr>
-        <w:pStyle w:val="Pokraovn"/>
-      </w:pPr>
-      <w:r>
         <w:t>Dotaz (</w:t>
       </w:r>
       <w:proofErr w:type="spellStart"/>
@@ -7048,7 +7071,6 @@
           <w:ilvl w:val="0"/>
           <w:numId w:val="32"/>
         </w:numPr>
-        <w:ind w:left="360"/>
         <w:rPr>
           <w:b/>
           <w:bCs/>
@@ -7076,7 +7098,6 @@
           <w:ilvl w:val="0"/>
           <w:numId w:val="32"/>
         </w:numPr>
-        <w:ind w:left="360"/>
         <w:rPr>
           <w:b/>
           <w:bCs/>
@@ -7100,7 +7121,6 @@
           <w:ilvl w:val="0"/>
           <w:numId w:val="32"/>
         </w:numPr>
-        <w:ind w:left="360"/>
         <w:rPr>
           <w:b/>
           <w:bCs/>
@@ -7145,201 +7165,281 @@
           <w:color w:val="auto"/>
           <w:lang w:eastAsia="sk-SK"/>
         </w:rPr>
-        <w:t xml:space="preserve">V prostředí .NET Framework je pro práci se SQL Server k dispozici datový poskytovatel, který využívá formát připojovacího řetězce podobný standardu OLE DB </w:t>
-      </w:r>
+        <w:t>V prostředí .NET Framework je pro práci se SQL Server k dispozici datový poskytovatel, který využívá formát připojovacího řetězce podobný standardu OLE DB (ADO). Konkrétní povolené parametry a jejich hodnoty pro toto spojení jsou definovány ve vlastnosti </w:t>
+      </w:r>
+      <w:proofErr w:type="spellStart"/>
       <w:r>
         <w:rPr>
           <w:color w:val="auto"/>
           <w:lang w:eastAsia="sk-SK"/>
         </w:rPr>
-        <w:lastRenderedPageBreak/>
-        <w:t>(ADO). Konkrétní povolené parametry a jejich hodnoty pro toto spojení jsou definovány ve vlastnosti </w:t>
-      </w:r>
-      <w:proofErr w:type="spellStart"/>
+        <w:t>ConnectionString</w:t>
+      </w:r>
+      <w:proofErr w:type="spellEnd"/>
       <w:r>
         <w:rPr>
           <w:color w:val="auto"/>
           <w:lang w:eastAsia="sk-SK"/>
         </w:rPr>
-        <w:t>ConnectionString</w:t>
-      </w:r>
-      <w:proofErr w:type="spellEnd"/>
+        <w:t> třídy </w:t>
+      </w:r>
+      <w:proofErr w:type="spellStart"/>
       <w:r>
         <w:rPr>
           <w:color w:val="auto"/>
           <w:lang w:eastAsia="sk-SK"/>
         </w:rPr>
-        <w:t> třídy </w:t>
-      </w:r>
-      <w:proofErr w:type="spellStart"/>
+        <w:t>SqlConnection</w:t>
+      </w:r>
+      <w:proofErr w:type="spellEnd"/>
       <w:r>
         <w:rPr>
           <w:color w:val="auto"/>
           <w:lang w:eastAsia="sk-SK"/>
         </w:rPr>
-        <w:t>SqlConnection</w:t>
-      </w:r>
-      <w:proofErr w:type="spellEnd"/>
+        <w:t>. Pro dynamické sestavování správně formátovaných připojovacích řetězců během běhu programu lze využít třídu </w:t>
+      </w:r>
+      <w:proofErr w:type="spellStart"/>
       <w:r>
         <w:rPr>
           <w:color w:val="auto"/>
           <w:lang w:eastAsia="sk-SK"/>
         </w:rPr>
-        <w:t>. Pro dynamické sestavování správně formátovaných připojovacích řetězců během běhu programu lze využít třídu </w:t>
-      </w:r>
-      <w:proofErr w:type="spellStart"/>
+        <w:t>SqlConnectionStringBuilder</w:t>
+      </w:r>
+      <w:proofErr w:type="spellEnd"/>
       <w:r>
         <w:rPr>
           <w:color w:val="auto"/>
           <w:lang w:eastAsia="sk-SK"/>
         </w:rPr>
-        <w:t>SqlConnectionStringBuilder</w:t>
-      </w:r>
-      <w:proofErr w:type="spellEnd"/>
+        <w:t>.</w:t>
+      </w:r>
       <w:r>
         <w:rPr>
           <w:color w:val="auto"/>
           <w:lang w:eastAsia="sk-SK"/>
         </w:rPr>
-        <w:t>.</w:t>
+        <w:t xml:space="preserve"> </w:t>
       </w:r>
       <w:r>
         <w:rPr>
           <w:color w:val="auto"/>
           <w:lang w:eastAsia="sk-SK"/>
         </w:rPr>
-        <w:t xml:space="preserve"> </w:t>
+        <w:fldChar w:fldCharType="begin"/>
       </w:r>
       <w:r>
         <w:rPr>
           <w:color w:val="auto"/>
           <w:lang w:eastAsia="sk-SK"/>
         </w:rPr>
-        <w:fldChar w:fldCharType="begin"/>
+        <w:instrText xml:space="preserve"> REF _Ref218421039 \r \h </w:instrText>
       </w:r>
       <w:r>
         <w:rPr>
           <w:color w:val="auto"/>
           <w:lang w:eastAsia="sk-SK"/>
         </w:rPr>
-        <w:instrText xml:space="preserve"> REF _Ref218421039 \r \h </w:instrText>
       </w:r>
       <w:r>
         <w:rPr>
           <w:color w:val="auto"/>
           <w:lang w:eastAsia="sk-SK"/>
         </w:rPr>
+        <w:fldChar w:fldCharType="separate"/>
       </w:r>
       <w:r>
         <w:rPr>
           <w:color w:val="auto"/>
           <w:lang w:eastAsia="sk-SK"/>
         </w:rPr>
-        <w:fldChar w:fldCharType="separate"/>
+        <w:t>[11]</w:t>
       </w:r>
       <w:r>
         <w:rPr>
           <w:color w:val="auto"/>
           <w:lang w:eastAsia="sk-SK"/>
         </w:rPr>
-        <w:t>[11]</w:t>
-      </w:r>
-      <w:r>
+        <w:fldChar w:fldCharType="end"/>
+      </w:r>
+    </w:p>
+    <w:p>
+      <w:pPr>
         <w:rPr>
           <w:color w:val="auto"/>
           <w:lang w:eastAsia="sk-SK"/>
         </w:rPr>
-        <w:fldChar w:fldCharType="end"/>
-      </w:r>
-    </w:p>
-    <w:p>
-      <w:pPr>
+      </w:pPr>
+      <w:r>
         <w:rPr>
           <w:color w:val="auto"/>
           <w:lang w:eastAsia="sk-SK"/>
         </w:rPr>
-      </w:pPr>
+        <w:lastRenderedPageBreak/>
+        <w:t>Pro ověřování spojení se doporučuje používat integrované zabezpečení SQL Serveru, někdy označované jako důvěryhodné připojení. Tato metoda zvyšuje bezpečnost, protože se v připojovacím řetězci nepřenáší uživatelské jméno a heslo. Místo toho využívá bezpečnostní identitu (token) aktuálně spuštěného procesu. V případě desktopových aplikací je touto identitou obvykle právě přihlášený uživatel systému.</w:t>
+      </w:r>
       <w:r>
         <w:rPr>
           <w:color w:val="auto"/>
           <w:lang w:eastAsia="sk-SK"/>
         </w:rPr>
-        <w:t>Pro ověřování spojení se doporučuje používat integrované zabezpečení SQL Serveru, někdy označované jako důvěryhodné připojení. Tato metoda zvyšuje bezpečnost, protože se v připojovacím řetězci nepřenáší uživatelské jméno a heslo. Místo toho využívá bezpečnostní identitu (token) aktuálně spuštěného procesu. V případě desktopových aplikací je touto identitou obvykle právě přihlášený uživatel systému.</w:t>
+        <w:fldChar w:fldCharType="begin"/>
       </w:r>
       <w:r>
         <w:rPr>
           <w:color w:val="auto"/>
           <w:lang w:eastAsia="sk-SK"/>
         </w:rPr>
-        <w:fldChar w:fldCharType="begin"/>
+        <w:instrText xml:space="preserve"> REF _Ref218421039 \r \h </w:instrText>
       </w:r>
       <w:r>
         <w:rPr>
           <w:color w:val="auto"/>
           <w:lang w:eastAsia="sk-SK"/>
         </w:rPr>
-        <w:instrText xml:space="preserve"> REF _Ref218421039 \r \h </w:instrText>
       </w:r>
       <w:r>
         <w:rPr>
           <w:color w:val="auto"/>
           <w:lang w:eastAsia="sk-SK"/>
         </w:rPr>
+        <w:fldChar w:fldCharType="separate"/>
       </w:r>
       <w:r>
         <w:rPr>
           <w:color w:val="auto"/>
           <w:lang w:eastAsia="sk-SK"/>
         </w:rPr>
-        <w:fldChar w:fldCharType="separate"/>
+        <w:t>[11]</w:t>
       </w:r>
       <w:r>
         <w:rPr>
           <w:color w:val="auto"/>
           <w:lang w:eastAsia="sk-SK"/>
         </w:rPr>
-        <w:t>[11]</w:t>
+        <w:fldChar w:fldCharType="end"/>
       </w:r>
       <w:r>
         <w:rPr>
           <w:color w:val="auto"/>
           <w:lang w:eastAsia="sk-SK"/>
         </w:rPr>
+        <w:t xml:space="preserve"> </w:t>
+      </w:r>
+    </w:p>
+    <w:p>
+      <w:pPr>
+        <w:pStyle w:val="Nadpis2"/>
+      </w:pPr>
+      <w:bookmarkStart w:id="32" w:name="_Toc220153173"/>
+      <w:r>
+        <w:t>Zabezpečení dat</w:t>
+      </w:r>
+      <w:bookmarkEnd w:id="32"/>
+    </w:p>
+    <w:p>
+      <w:r>
+        <w:t>Zabezpečení aplikací je soubor opatření na ochranu aplikací před útoky, zneužitím nebo nechtěným sledováním. Patří sem například odhalení a odstranění škodlivého softwaru, prevence neautorizovaného přístupu a ochrana uživatelských dat před jejich odcizením nebo zneužitím.</w:t>
+      </w:r>
+      <w:r>
+        <w:fldChar w:fldCharType="begin"/>
+      </w:r>
+      <w:r>
+        <w:instrText xml:space="preserve"> REF _Ref218421602 \r \h </w:instrText>
+      </w:r>
+      <w:r>
+        <w:fldChar w:fldCharType="separate"/>
+      </w:r>
+      <w:r>
+        <w:t>[12]</w:t>
+      </w:r>
+      <w:r>
         <w:fldChar w:fldCharType="end"/>
       </w:r>
-      <w:r>
-        <w:rPr>
-          <w:color w:val="auto"/>
-          <w:lang w:eastAsia="sk-SK"/>
-        </w:rPr>
+    </w:p>
+    <w:p>
+      <w:pPr>
+        <w:pStyle w:val="Nadpis3"/>
+      </w:pPr>
+      <w:bookmarkStart w:id="33" w:name="_Toc220153174"/>
+      <w:proofErr w:type="spellStart"/>
+      <w:r>
+        <w:t>Hashov</w:t>
+      </w:r>
+      <w:r>
+        <w:t>á</w:t>
+      </w:r>
+      <w:r>
+        <w:t>ní</w:t>
+      </w:r>
+      <w:proofErr w:type="spellEnd"/>
+      <w:r>
+        <w:t xml:space="preserve"> hesel</w:t>
+      </w:r>
+      <w:bookmarkEnd w:id="33"/>
+      <w:r>
         <w:t xml:space="preserve"> </w:t>
       </w:r>
     </w:p>
     <w:p>
       <w:pPr>
-        <w:pStyle w:val="Nadpis2"/>
-      </w:pPr>
-      <w:bookmarkStart w:id="32" w:name="_Toc220153173"/>
-      <w:r>
-        <w:t>Zabezpečení dat</w:t>
-      </w:r>
-      <w:bookmarkEnd w:id="32"/>
-    </w:p>
-    <w:p>
-      <w:r>
-        <w:t>Zabezpečení aplikací je soubor opatření na ochranu aplikací před útoky, zneužitím nebo nechtěným sledováním. Patří sem například odhalení a odstranění škodlivého softwaru, prevence neautorizovaného přístupu a ochrana uživatelských dat před jejich odcizením nebo zneužitím.</w:t>
+        <w:pStyle w:val="Pokraovn"/>
+      </w:pPr>
+      <w:r>
+        <w:t>Vývojáři používají termín „</w:t>
+      </w:r>
+      <w:proofErr w:type="spellStart"/>
+      <w:r>
+        <w:t>hash</w:t>
+      </w:r>
+      <w:proofErr w:type="spellEnd"/>
+      <w:r>
+        <w:t xml:space="preserve">“ pro krátký znakový kód složený z písmen a čísel. Tento kód vzniká zpracováním libovolných vstupních dat (textu, souboru) pomocí speciální matematické funkce – hashovací funkce. Ta funguje jednosměrně: stejný vstup vždy vytvoří stejný </w:t>
+      </w:r>
+      <w:proofErr w:type="spellStart"/>
+      <w:r>
+        <w:t>hash</w:t>
+      </w:r>
+      <w:proofErr w:type="spellEnd"/>
+      <w:r>
+        <w:t xml:space="preserve">, ale z </w:t>
+      </w:r>
+      <w:proofErr w:type="spellStart"/>
+      <w:r>
+        <w:t>hashe</w:t>
+      </w:r>
+      <w:proofErr w:type="spellEnd"/>
+      <w:r>
+        <w:t xml:space="preserve"> nelze původní data zpětně odvodit. </w:t>
+      </w:r>
+      <w:proofErr w:type="spellStart"/>
+      <w:r>
+        <w:t>Hash</w:t>
+      </w:r>
+      <w:proofErr w:type="spellEnd"/>
+      <w:r>
+        <w:t xml:space="preserve"> tak představuje jakýsi jedinečný „otisk prstu“ pro konkrétní data. </w:t>
+      </w:r>
+      <w:proofErr w:type="spellStart"/>
+      <w:r>
+        <w:t>Hashování</w:t>
+      </w:r>
+      <w:proofErr w:type="spellEnd"/>
+      <w:r>
+        <w:t xml:space="preserve"> má klíčové uplatnění v asymetrické kryptografii a je nezbytné při vývoji softwaru – používá se například pro bezpečné ukládání hesel nebo pro kontrolu, zda data nebyla poškozena či změněna. </w:t>
       </w:r>
       <w:r>
         <w:fldChar w:fldCharType="begin"/>
       </w:r>
       <w:r>
-        <w:instrText xml:space="preserve"> REF _Ref218421602 \r \h </w:instrText>
+        <w:instrText xml:space="preserve"> REF _Ref220161767 \r \h </w:instrText>
       </w:r>
       <w:r>
         <w:fldChar w:fldCharType="separate"/>
       </w:r>
       <w:r>
-        <w:t>[12]</w:t>
+        <w:t>[13]</w:t>
       </w:r>
       <w:r>
         <w:fldChar w:fldCharType="end"/>
@@ -7349,22 +7449,14 @@
       <w:pPr>
         <w:pStyle w:val="Nadpis3"/>
       </w:pPr>
-      <w:bookmarkStart w:id="33" w:name="_Toc220153174"/>
-      <w:proofErr w:type="spellStart"/>
-      <w:r>
-        <w:t>Hashov</w:t>
-      </w:r>
-      <w:r>
-        <w:t>á</w:t>
-      </w:r>
-      <w:r>
-        <w:t>ní</w:t>
-      </w:r>
-      <w:proofErr w:type="spellEnd"/>
-      <w:r>
-        <w:t xml:space="preserve"> hesel</w:t>
-      </w:r>
-      <w:bookmarkEnd w:id="33"/>
+      <w:bookmarkStart w:id="34" w:name="_Toc220153175"/>
+      <w:r>
+        <w:t>O</w:t>
+      </w:r>
+      <w:r>
+        <w:t>věření uživatele</w:t>
+      </w:r>
+      <w:bookmarkEnd w:id="34"/>
       <w:r>
         <w:t xml:space="preserve"> </w:t>
       </w:r>
@@ -7374,47 +7466,31 @@
         <w:pStyle w:val="Pokraovn"/>
       </w:pPr>
       <w:r>
-        <w:t>Vývojáři používají termín „</w:t>
-      </w:r>
-      <w:proofErr w:type="spellStart"/>
-      <w:r>
-        <w:t>hash</w:t>
-      </w:r>
-      <w:proofErr w:type="spellEnd"/>
-      <w:r>
-        <w:t xml:space="preserve">“ pro krátký znakový kód složený z písmen a čísel. Tento kód vzniká zpracováním libovolných vstupních dat (textu, souboru) pomocí speciální matematické funkce – hashovací funkce. Ta funguje jednosměrně: stejný vstup vždy vytvoří stejný </w:t>
-      </w:r>
-      <w:proofErr w:type="spellStart"/>
-      <w:r>
-        <w:t>hash</w:t>
-      </w:r>
-      <w:proofErr w:type="spellEnd"/>
-      <w:r>
-        <w:t xml:space="preserve">, ale z </w:t>
-      </w:r>
-      <w:proofErr w:type="spellStart"/>
-      <w:r>
-        <w:t>hashe</w:t>
-      </w:r>
-      <w:proofErr w:type="spellEnd"/>
-      <w:r>
-        <w:t xml:space="preserve"> nelze původní data zpětně odvodit. </w:t>
-      </w:r>
-      <w:proofErr w:type="spellStart"/>
-      <w:r>
-        <w:t>Hash</w:t>
-      </w:r>
-      <w:proofErr w:type="spellEnd"/>
-      <w:r>
-        <w:t xml:space="preserve"> tak představuje jakýsi jedinečný „otisk prstu“ pro konkrétní data. </w:t>
-      </w:r>
-      <w:proofErr w:type="spellStart"/>
-      <w:r>
-        <w:t>Hashování</w:t>
-      </w:r>
-      <w:proofErr w:type="spellEnd"/>
-      <w:r>
-        <w:t xml:space="preserve"> má klíčové uplatnění v asymetrické kryptografii a je nezbytné při vývoji softwaru – používá se například pro bezpečné ukládání hesel nebo pro kontrolu, zda data nebyla poškozena či změněna.</w:t>
+        <w:t xml:space="preserve">Ověřování totožnosti uživatele zahrnuje nastavení uživatelského jména, hesla a dalších metod, jako je rozpoznávání obličeje, otisk prstu nebo PIN kód. Z bezpečnostních důvodů se žádná z těchto přihlašovacích údajů neukládá v čitelné podobě do databáze služby. Existuje mnoho způsobu ověření totožnosti uživatele jako je heslové ověřování, certifikátové ověřování, biometrické ověřování, </w:t>
+      </w:r>
+      <w:proofErr w:type="spellStart"/>
+      <w:r>
+        <w:t>tokenové</w:t>
+      </w:r>
+      <w:proofErr w:type="spellEnd"/>
+      <w:r>
+        <w:t xml:space="preserve"> ověřování, jednorázové heslo, </w:t>
+      </w:r>
+      <w:proofErr w:type="spellStart"/>
+      <w:r>
+        <w:t>push</w:t>
+      </w:r>
+      <w:proofErr w:type="spellEnd"/>
+      <w:r>
+        <w:t xml:space="preserve"> oznámení, hlasové ověřování a </w:t>
+      </w:r>
+      <w:proofErr w:type="spellStart"/>
+      <w:r>
+        <w:t>vícefaktorové</w:t>
+      </w:r>
+      <w:proofErr w:type="spellEnd"/>
+      <w:r>
+        <w:t xml:space="preserve"> ověřování.</w:t>
       </w:r>
       <w:r>
         <w:t xml:space="preserve"> </w:t>
@@ -7423,325 +7499,279 @@
         <w:fldChar w:fldCharType="begin"/>
       </w:r>
       <w:r>
-        <w:instrText xml:space="preserve"> REF _Ref220161767 \r \h </w:instrText>
+        <w:instrText xml:space="preserve"> REF _Ref218865124 \r \h </w:instrText>
       </w:r>
       <w:r>
         <w:fldChar w:fldCharType="separate"/>
       </w:r>
       <w:r>
-        <w:t>[13]</w:t>
+        <w:t>[14]</w:t>
       </w:r>
       <w:r>
         <w:fldChar w:fldCharType="end"/>
       </w:r>
     </w:p>
     <w:p>
+      <w:r>
+        <w:t>Ověřování (</w:t>
+      </w:r>
+      <w:proofErr w:type="spellStart"/>
+      <w:r>
+        <w:t>AuthN</w:t>
+      </w:r>
+      <w:proofErr w:type="spellEnd"/>
+      <w:r>
+        <w:t>) potvrzuje totožnost uživatele – zda je skutečně tím, za koho se vydává, například pomocí hesla nebo biometrie. Autorizace (</w:t>
+      </w:r>
+      <w:proofErr w:type="spellStart"/>
+      <w:r>
+        <w:t>AuthZ</w:t>
+      </w:r>
+      <w:proofErr w:type="spellEnd"/>
+      <w:r>
+        <w:t xml:space="preserve">) následně určuje, k jakým zdrojům a akcím má ověřený uživatel právo přistupovat. </w:t>
+      </w:r>
+      <w:r>
+        <w:rPr>
+          <w:color w:val="EE0000"/>
+        </w:rPr>
+        <w:fldChar w:fldCharType="begin"/>
+      </w:r>
+      <w:r>
+        <w:instrText xml:space="preserve"> REF _Ref218865124 \r \h </w:instrText>
+      </w:r>
+      <w:r>
+        <w:rPr>
+          <w:color w:val="EE0000"/>
+        </w:rPr>
+      </w:r>
+      <w:r>
+        <w:rPr>
+          <w:color w:val="EE0000"/>
+        </w:rPr>
+        <w:fldChar w:fldCharType="separate"/>
+      </w:r>
+      <w:r>
+        <w:t>[14]</w:t>
+      </w:r>
+      <w:r>
+        <w:rPr>
+          <w:color w:val="EE0000"/>
+        </w:rPr>
+        <w:fldChar w:fldCharType="end"/>
+      </w:r>
+    </w:p>
+    <w:p>
       <w:pPr>
         <w:pStyle w:val="Nadpis3"/>
       </w:pPr>
-      <w:bookmarkStart w:id="34" w:name="_Toc220153175"/>
-      <w:r>
-        <w:t>O</w:t>
-      </w:r>
-      <w:r>
-        <w:t>věření uživatele</w:t>
-      </w:r>
-      <w:bookmarkEnd w:id="34"/>
+      <w:bookmarkStart w:id="35" w:name="_Toc220153176"/>
+      <w:r>
+        <w:lastRenderedPageBreak/>
+        <w:t>CAPTCHA ochrana</w:t>
+      </w:r>
+      <w:bookmarkEnd w:id="35"/>
+    </w:p>
+    <w:p>
+      <w:pPr>
+        <w:pStyle w:val="Pokraovn"/>
+      </w:pPr>
+      <w:r>
+        <w:t>CAPTCHA je bezpečnostní</w:t>
+      </w:r>
+      <w:r>
+        <w:t xml:space="preserve"> test</w:t>
+      </w:r>
+      <w:r>
+        <w:t xml:space="preserve"> určený k rozlišení skutečného člověka od automatizovaného počítačového programu (bota). Tato zkratka znamená "</w:t>
+      </w:r>
+      <w:proofErr w:type="spellStart"/>
+      <w:r>
+        <w:t>Completely</w:t>
+      </w:r>
+      <w:proofErr w:type="spellEnd"/>
       <w:r>
         <w:t xml:space="preserve"> </w:t>
       </w:r>
+      <w:proofErr w:type="spellStart"/>
+      <w:r>
+        <w:t>Automated</w:t>
+      </w:r>
+      <w:proofErr w:type="spellEnd"/>
+      <w:r>
+        <w:t xml:space="preserve"> Public </w:t>
+      </w:r>
+      <w:proofErr w:type="spellStart"/>
+      <w:r>
+        <w:t>Turing</w:t>
+      </w:r>
+      <w:proofErr w:type="spellEnd"/>
+      <w:r>
+        <w:t xml:space="preserve"> test to </w:t>
+      </w:r>
+      <w:proofErr w:type="spellStart"/>
+      <w:r>
+        <w:t>tell</w:t>
+      </w:r>
+      <w:proofErr w:type="spellEnd"/>
+      <w:r>
+        <w:t xml:space="preserve"> </w:t>
+      </w:r>
+      <w:proofErr w:type="spellStart"/>
+      <w:r>
+        <w:t>Computers</w:t>
+      </w:r>
+      <w:proofErr w:type="spellEnd"/>
+      <w:r>
+        <w:t xml:space="preserve"> and </w:t>
+      </w:r>
+      <w:proofErr w:type="spellStart"/>
+      <w:r>
+        <w:t>Humans</w:t>
+      </w:r>
+      <w:proofErr w:type="spellEnd"/>
+      <w:r>
+        <w:t xml:space="preserve"> </w:t>
+      </w:r>
+      <w:proofErr w:type="spellStart"/>
+      <w:r>
+        <w:t>Apart</w:t>
+      </w:r>
+      <w:proofErr w:type="spellEnd"/>
+      <w:r>
+        <w:t xml:space="preserve">", tedy veřejný, plně automatizovaný </w:t>
+      </w:r>
+      <w:proofErr w:type="spellStart"/>
+      <w:r>
+        <w:t>Turingův</w:t>
+      </w:r>
+      <w:proofErr w:type="spellEnd"/>
+      <w:r>
+        <w:t xml:space="preserve"> test k rozpoznání počítačů a lidí. Funguje tak, že uživateli předloží úkol, který je pro člověka jednoduchý, ale pro současné počítačové algoritmy obtížný. Typicky jde o přepis zkresleného textu, výběr obrázků podle zadání (např. "klikněte na všechny semafory") nebo vyřešení základní matematické úlohy. Dokud uživatel úkol nevyřeší správně, systém jej považuje za robota. Dnešní situace je však jiná díky pokroku v umělé inteligenci, neuronových sítích a strojovém učení. Tyto technologie se staly natolik vyspělými, že dokážou spolehlivě překonat i moderní typy CAPTCHA. Například již v roce 2016 společnost Google zavedla metodu, kde stačilo kliknout na zaškrtávací políčko "Nejsem robot". Ovšem velmi brzy poté dokázala neuronová síť od stejné společnosti tento mechanismus úspěšně obejít. Teď se objevuje spousta různých typů CAPTCHA jako například textová, zvuková, obrázková, logická, </w:t>
+      </w:r>
+      <w:proofErr w:type="spellStart"/>
+      <w:r>
+        <w:t>reCAPTCHA</w:t>
+      </w:r>
+      <w:proofErr w:type="spellEnd"/>
+      <w:r>
+        <w:t>, herní, tvarová, se skrytým polem a s děleným obrázkem.</w:t>
+      </w:r>
+      <w:r>
+        <w:t xml:space="preserve"> </w:t>
+      </w:r>
+      <w:r>
+        <w:fldChar w:fldCharType="begin"/>
+      </w:r>
+      <w:r>
+        <w:instrText xml:space="preserve"> REF _Ref218422153 \r \h </w:instrText>
+      </w:r>
+      <w:r>
+        <w:fldChar w:fldCharType="separate"/>
+      </w:r>
+      <w:r>
+        <w:t>[15]</w:t>
+      </w:r>
+      <w:r>
+        <w:fldChar w:fldCharType="end"/>
+      </w:r>
+    </w:p>
+    <w:p>
+      <w:pPr>
+        <w:pStyle w:val="Nadpis3"/>
+      </w:pPr>
+      <w:bookmarkStart w:id="36" w:name="_Toc220153177"/>
+      <w:r>
+        <w:t xml:space="preserve">SQL </w:t>
+      </w:r>
+      <w:proofErr w:type="spellStart"/>
+      <w:r>
+        <w:t>injection</w:t>
+      </w:r>
+      <w:proofErr w:type="spellEnd"/>
+      <w:r>
+        <w:t xml:space="preserve"> obrana</w:t>
+      </w:r>
+      <w:bookmarkEnd w:id="36"/>
     </w:p>
     <w:p>
       <w:pPr>
         <w:pStyle w:val="Pokraovn"/>
       </w:pPr>
       <w:r>
-        <w:t xml:space="preserve">Ověřování totožnosti uživatele zahrnuje nastavení uživatelského jména, hesla a dalších metod, jako je rozpoznávání obličeje, otisk prstu nebo PIN kód. Z bezpečnostních důvodů se žádná z těchto přihlašovacích údajů neukládá v čitelné podobě do databáze služby. Existuje mnoho způsobu ověření totožnosti uživatele jako je heslové </w:t>
-      </w:r>
+        <w:t xml:space="preserve">SQL </w:t>
+      </w:r>
+      <w:proofErr w:type="spellStart"/>
+      <w:r>
+        <w:t>Injection</w:t>
+      </w:r>
+      <w:proofErr w:type="spellEnd"/>
+      <w:r>
+        <w:t xml:space="preserve"> je typ útoku, který zneužívá chyby zabezpečení ve webových aplikacích. Tento útok umožňuje pachateli vložit a spustit škodlivý kód SQL, čímž získá neoprávněný přístup k databázovému systému. K útoku dochází, když aplikace nedostatečně ověřuje nebo filtruje vstupní data od uživatele. Zneužitím této zranitelnosti může útočník provádět v databázi různé akce s vážnými dopady, jako je manipulace s daty, jejich odstranění nebo dokonce získání administrátorských oprávnění. Závažnost tohoto útoku plyne z jeho potenciálu způsobit vážné škody jednotlivcům i velkým společnostem. Krádež osobních údajů nebo informací o</w:t>
+      </w:r>
+      <w:r>
+        <w:t> </w:t>
+      </w:r>
+      <w:r>
+        <w:t xml:space="preserve">platebních kartách může uživatele vážně poškodit, zatímco společnosti čelí poškození reputace, právním problémům a finančním ztrátám. Útoky typu SQL </w:t>
+      </w:r>
+      <w:proofErr w:type="spellStart"/>
+      <w:r>
+        <w:t>Injection</w:t>
+      </w:r>
+      <w:proofErr w:type="spellEnd"/>
+      <w:r>
+        <w:t xml:space="preserve"> tak jasně ukazují, jak je bezpečnost databází zásadní. Útočníci používají různé metody SQL </w:t>
+      </w:r>
+      <w:proofErr w:type="spellStart"/>
+      <w:r>
+        <w:t>Injection</w:t>
+      </w:r>
+      <w:proofErr w:type="spellEnd"/>
+      <w:r>
+        <w:t xml:space="preserve"> v závislosti na konkrétní chybě v aplikaci a struktuře databázového systému. </w:t>
+      </w:r>
+      <w:r>
+        <w:fldChar w:fldCharType="begin"/>
+      </w:r>
+      <w:r>
+        <w:instrText xml:space="preserve"> REF _Ref221174463 \r \h </w:instrText>
+      </w:r>
+      <w:r>
+        <w:fldChar w:fldCharType="separate"/>
+      </w:r>
+      <w:r>
+        <w:t>[16]</w:t>
+      </w:r>
+      <w:r>
+        <w:fldChar w:fldCharType="end"/>
+      </w:r>
+    </w:p>
+    <w:p>
+      <w:pPr>
+        <w:pStyle w:val="Pokraovn"/>
+      </w:pPr>
       <w:r>
         <w:lastRenderedPageBreak/>
-        <w:t xml:space="preserve">ověřování, certifikátové ověřování, biometrické ověřování, </w:t>
-      </w:r>
-      <w:proofErr w:type="spellStart"/>
-      <w:r>
-        <w:t>tokenové</w:t>
-      </w:r>
-      <w:proofErr w:type="spellEnd"/>
-      <w:r>
-        <w:t xml:space="preserve"> ověřování, jednorázové heslo, </w:t>
-      </w:r>
-      <w:proofErr w:type="spellStart"/>
-      <w:r>
-        <w:t>push</w:t>
-      </w:r>
-      <w:proofErr w:type="spellEnd"/>
-      <w:r>
-        <w:t xml:space="preserve"> oznámení, hlasové ověřování a </w:t>
-      </w:r>
-      <w:proofErr w:type="spellStart"/>
-      <w:r>
-        <w:t>vícefaktorové</w:t>
-      </w:r>
-      <w:proofErr w:type="spellEnd"/>
-      <w:r>
-        <w:t xml:space="preserve"> ověřování.</w:t>
-      </w:r>
-      <w:r>
-        <w:t xml:space="preserve"> </w:t>
+        <w:t xml:space="preserve">Mezi hlavní metody patří </w:t>
       </w:r>
       <w:r>
         <w:fldChar w:fldCharType="begin"/>
       </w:r>
       <w:r>
-        <w:instrText xml:space="preserve"> REF _Ref218865124 \r \h </w:instrText>
+        <w:instrText xml:space="preserve"> REF _Ref218422289 \r \h </w:instrText>
       </w:r>
       <w:r>
         <w:fldChar w:fldCharType="separate"/>
       </w:r>
       <w:r>
-        <w:t>[14]</w:t>
+        <w:t>[16]</w:t>
       </w:r>
       <w:r>
         <w:fldChar w:fldCharType="end"/>
       </w:r>
-    </w:p>
-    <w:p>
-      <w:r>
-        <w:t>Ověřování (</w:t>
-      </w:r>
-      <w:proofErr w:type="spellStart"/>
-      <w:r>
-        <w:t>AuthN</w:t>
-      </w:r>
-      <w:proofErr w:type="spellEnd"/>
-      <w:r>
-        <w:t>) potvrzuje totožnost uživatele – zda je skutečně tím, za koho se vydává, například pomocí hesla nebo biometrie. Autorizace (</w:t>
-      </w:r>
-      <w:proofErr w:type="spellStart"/>
-      <w:r>
-        <w:t>AuthZ</w:t>
-      </w:r>
-      <w:proofErr w:type="spellEnd"/>
-      <w:r>
-        <w:t xml:space="preserve">) následně určuje, k jakým zdrojům a akcím má ověřený uživatel právo přistupovat. </w:t>
-      </w:r>
-      <w:r>
-        <w:rPr>
-          <w:color w:val="EE0000"/>
-        </w:rPr>
-        <w:fldChar w:fldCharType="begin"/>
-      </w:r>
-      <w:r>
-        <w:instrText xml:space="preserve"> REF _Ref218865124 \r \h </w:instrText>
-      </w:r>
-      <w:r>
-        <w:rPr>
-          <w:color w:val="EE0000"/>
-        </w:rPr>
-      </w:r>
-      <w:r>
-        <w:rPr>
-          <w:color w:val="EE0000"/>
-        </w:rPr>
-        <w:fldChar w:fldCharType="separate"/>
-      </w:r>
-      <w:r>
-        <w:t>[14]</w:t>
-      </w:r>
-      <w:r>
-        <w:rPr>
-          <w:color w:val="EE0000"/>
-        </w:rPr>
-        <w:fldChar w:fldCharType="end"/>
-      </w:r>
-    </w:p>
-    <w:p>
-      <w:pPr>
-        <w:pStyle w:val="Nadpis3"/>
-      </w:pPr>
-      <w:bookmarkStart w:id="35" w:name="_Toc220153176"/>
-      <w:r>
-        <w:t>CAPTCHA ochrana</w:t>
-      </w:r>
-      <w:bookmarkEnd w:id="35"/>
-      <w:r>
-        <w:t xml:space="preserve"> </w:t>
-      </w:r>
-    </w:p>
-    <w:p>
-      <w:pPr>
-        <w:pStyle w:val="Pokraovn"/>
-      </w:pPr>
-      <w:r>
-        <w:t>CAPTCHA je bezpečnostní systém určený k rozlišení skutečného člověka od automatizovaného počítačového programu (bota). Tato zkratka znamená "</w:t>
-      </w:r>
-      <w:proofErr w:type="spellStart"/>
-      <w:r>
-        <w:t>Completely</w:t>
-      </w:r>
-      <w:proofErr w:type="spellEnd"/>
-      <w:r>
-        <w:t xml:space="preserve"> </w:t>
-      </w:r>
-      <w:proofErr w:type="spellStart"/>
-      <w:r>
-        <w:t>Automated</w:t>
-      </w:r>
-      <w:proofErr w:type="spellEnd"/>
-      <w:r>
-        <w:t xml:space="preserve"> Public </w:t>
-      </w:r>
-      <w:proofErr w:type="spellStart"/>
-      <w:r>
-        <w:t>Turing</w:t>
-      </w:r>
-      <w:proofErr w:type="spellEnd"/>
-      <w:r>
-        <w:t xml:space="preserve"> test to </w:t>
-      </w:r>
-      <w:proofErr w:type="spellStart"/>
-      <w:r>
-        <w:t>tell</w:t>
-      </w:r>
-      <w:proofErr w:type="spellEnd"/>
-      <w:r>
-        <w:t xml:space="preserve"> </w:t>
-      </w:r>
-      <w:proofErr w:type="spellStart"/>
-      <w:r>
-        <w:t>Computers</w:t>
-      </w:r>
-      <w:proofErr w:type="spellEnd"/>
-      <w:r>
-        <w:t xml:space="preserve"> and </w:t>
-      </w:r>
-      <w:proofErr w:type="spellStart"/>
-      <w:r>
-        <w:t>Humans</w:t>
-      </w:r>
-      <w:proofErr w:type="spellEnd"/>
-      <w:r>
-        <w:t xml:space="preserve"> </w:t>
-      </w:r>
-      <w:proofErr w:type="spellStart"/>
-      <w:r>
-        <w:t>Apart</w:t>
-      </w:r>
-      <w:proofErr w:type="spellEnd"/>
-      <w:r>
-        <w:t xml:space="preserve">", tedy veřejný, plně automatizovaný </w:t>
-      </w:r>
-      <w:proofErr w:type="spellStart"/>
-      <w:r>
-        <w:t>Turingův</w:t>
-      </w:r>
-      <w:proofErr w:type="spellEnd"/>
-      <w:r>
-        <w:t xml:space="preserve"> test k rozpoznání počítačů a lidí. Funguje tak, že uživateli předloží úkol, který je pro člověka jednoduchý, ale pro současné počítačové algoritmy obtížný. Typicky jde o přepis zkresleného textu, výběr obrázků podle zadání (např. "klikněte na všechny semafory") nebo vyřešení základní matematické úlohy. Dokud uživatel úkol nevyřeší správně, systém jej považuje za robota. Dnešní situace je však jiná díky pokroku v umělé inteligenci, neuronových sítích a strojovém učení. Tyto technologie se staly natolik vyspělými, že dokážou spolehlivě překonat i moderní typy CAPTCHA. Například již v roce 2016 společnost Google zavedla metodu, kde stačilo kliknout na zaškrtávací políčko "Nejsem robot". Ovšem velmi brzy poté dokázala neuronová síť od stejné společnosti tento mechanismus úspěšně obejít. Teď se objevuje spousta různých typů CAPTCHA jako například textová, zvuková, obrázková, logická, </w:t>
-      </w:r>
-      <w:proofErr w:type="spellStart"/>
-      <w:r>
-        <w:t>reCAPTCHA</w:t>
-      </w:r>
-      <w:proofErr w:type="spellEnd"/>
-      <w:r>
-        <w:t>, herní, tvarová, se skrytým polem a s děleným obrázkem.</w:t>
-      </w:r>
-      <w:r>
-        <w:t xml:space="preserve"> </w:t>
-      </w:r>
-      <w:r>
-        <w:fldChar w:fldCharType="begin"/>
-      </w:r>
-      <w:r>
-        <w:instrText xml:space="preserve"> REF _Ref218422153 \r \h </w:instrText>
-      </w:r>
-      <w:r>
-        <w:fldChar w:fldCharType="separate"/>
-      </w:r>
-      <w:r>
-        <w:t>[15]</w:t>
-      </w:r>
-      <w:r>
-        <w:fldChar w:fldCharType="end"/>
-      </w:r>
-    </w:p>
-    <w:p>
-      <w:pPr>
-        <w:pStyle w:val="Nadpis3"/>
-      </w:pPr>
-      <w:bookmarkStart w:id="36" w:name="_Toc220153177"/>
-      <w:r>
-        <w:t xml:space="preserve">SQL </w:t>
-      </w:r>
-      <w:proofErr w:type="spellStart"/>
-      <w:r>
-        <w:t>injection</w:t>
-      </w:r>
-      <w:proofErr w:type="spellEnd"/>
-      <w:r>
-        <w:t xml:space="preserve"> obrana</w:t>
-      </w:r>
-      <w:bookmarkEnd w:id="36"/>
-    </w:p>
-    <w:p>
-      <w:pPr>
-        <w:pStyle w:val="Pokraovn"/>
-      </w:pPr>
-      <w:r>
-        <w:t xml:space="preserve">SQL </w:t>
-      </w:r>
-      <w:proofErr w:type="spellStart"/>
-      <w:r>
-        <w:t>Injection</w:t>
-      </w:r>
-      <w:proofErr w:type="spellEnd"/>
-      <w:r>
-        <w:t xml:space="preserve"> je typ útoku, který zneužívá chyby zabezpečení ve webových aplikacích. Tento útok umožňuje pachateli vložit a spustit škodlivý kód SQL, čímž získá neoprávněný přístup k databázovému systému. K útoku dochází, když aplikace nedostatečně ověřuje nebo filtruje vstupní data od uživatele. Zneužitím této zranitelnosti může útočník provádět v databázi různé akce s vážnými dopady, jako je manipulace s daty, jejich odstranění nebo dokonce získání administrátorských oprávnění. Závažnost tohoto útoku plyne z jeho potenciálu způsobit vážné škody jednotlivcům i velkým společnostem. Krádež osobních údajů nebo informací </w:t>
-      </w:r>
-      <w:r>
-        <w:lastRenderedPageBreak/>
-        <w:t>o</w:t>
-      </w:r>
-      <w:r>
-        <w:t> </w:t>
-      </w:r>
-      <w:r>
-        <w:t xml:space="preserve">platebních kartách může uživatele vážně poškodit, zatímco společnosti čelí poškození reputace, právním problémům a finančním ztrátám. Útoky typu SQL </w:t>
-      </w:r>
-      <w:proofErr w:type="spellStart"/>
-      <w:r>
-        <w:t>Injection</w:t>
-      </w:r>
-      <w:proofErr w:type="spellEnd"/>
-      <w:r>
-        <w:t xml:space="preserve"> tak jasně ukazují, jak je bezpečnost databází zásadní. Útočníci používají různé metody SQL </w:t>
-      </w:r>
-      <w:proofErr w:type="spellStart"/>
-      <w:r>
-        <w:t>Injection</w:t>
-      </w:r>
-      <w:proofErr w:type="spellEnd"/>
-      <w:r>
-        <w:t xml:space="preserve"> v závislosti na konkrétní chybě v aplikaci a struktuře databázového systému. Mezi hlavní metody patří </w:t>
-      </w:r>
-      <w:r>
-        <w:fldChar w:fldCharType="begin"/>
-      </w:r>
-      <w:r>
-        <w:instrText xml:space="preserve"> REF _Ref218422289 \r \h </w:instrText>
-      </w:r>
-      <w:r>
-        <w:fldChar w:fldCharType="separate"/>
-      </w:r>
-      <w:r>
-        <w:t>[16]</w:t>
-      </w:r>
-      <w:r>
-        <w:fldChar w:fldCharType="end"/>
-      </w:r>
-      <w:r>
-        <w:t xml:space="preserve">: </w:t>
+      <w:r>
+        <w:t>:</w:t>
       </w:r>
     </w:p>
     <w:p>
@@ -7753,7 +7783,7 @@
         </w:numPr>
       </w:pPr>
       <w:r>
-        <w:t xml:space="preserve">Injekce založená na chybových hláškách: Získávání informací pomocí chyb, které databáze vrací. </w:t>
+        <w:t>Injekce založená na chybových hláškách: Získávání informací pomocí chyb, které databáze vrací.</w:t>
       </w:r>
     </w:p>
     <w:p>
@@ -7773,7 +7803,7 @@
       </w:r>
       <w:proofErr w:type="spellEnd"/>
       <w:r>
-        <w:t xml:space="preserve"> injekce: Načítání dat spojením (UNION) výsledků více SQL dotazů. </w:t>
+        <w:t xml:space="preserve"> injekce: Načítání dat spojením (UNION) výsledků více SQL dotazů.</w:t>
       </w:r>
     </w:p>
     <w:p>
@@ -7785,7 +7815,7 @@
         </w:numPr>
       </w:pPr>
       <w:r>
-        <w:t xml:space="preserve">Blind (slepá) injekce: Vyvozování informací analýzou chování aplikace, aniž by databáze přímo vracela data. </w:t>
+        <w:t>Blind (slepá) injekce: Vyvozování informací analýzou chování aplikace, aniž by databáze přímo vracela data.</w:t>
       </w:r>
     </w:p>
     <w:p>
@@ -7899,7 +7929,6 @@
     </w:p>
     <w:p>
       <w:r>
-        <w:lastRenderedPageBreak/>
         <w:t xml:space="preserve">Ovládnutí základních příkazů je klíčové pro efektivní práci s </w:t>
       </w:r>
       <w:proofErr w:type="spellStart"/>
@@ -7998,6 +8027,7 @@
       </w:pPr>
       <w:proofErr w:type="spellStart"/>
       <w:r>
+        <w:lastRenderedPageBreak/>
         <w:t>git</w:t>
       </w:r>
       <w:proofErr w:type="spellEnd"/>
@@ -8043,7 +8073,7 @@
       </w:r>
       <w:proofErr w:type="spellEnd"/>
       <w:r>
-        <w:t xml:space="preserve"> status – Zobrazí stav souborů (změněné, připravené k uložení, nové). </w:t>
+        <w:t xml:space="preserve"> status – Zobrazí stav souborů (změněné, připravené k uložení, nové).</w:t>
       </w:r>
     </w:p>
     <w:p>
@@ -8082,7 +8112,7 @@
         <w:t> </w:t>
       </w:r>
       <w:r>
-        <w:t xml:space="preserve">uložení. </w:t>
+        <w:t>uložení.</w:t>
       </w:r>
     </w:p>
     <w:p>
@@ -8102,12 +8132,17 @@
         <w:t xml:space="preserve"> </w:t>
       </w:r>
       <w:proofErr w:type="spellStart"/>
+      <w:proofErr w:type="gramStart"/>
       <w:r>
         <w:t>commit</w:t>
       </w:r>
       <w:proofErr w:type="spellEnd"/>
       <w:r>
-        <w:t xml:space="preserve"> -m "zpráva" – Trvale uloží připravené změny do historie s popisnou zprávou. </w:t>
+        <w:t xml:space="preserve"> -m</w:t>
+      </w:r>
+      <w:proofErr w:type="gramEnd"/>
+      <w:r>
+        <w:t xml:space="preserve"> "zpráva" – Trvale uloží připravené změny do historie s popisnou zprávou.</w:t>
       </w:r>
     </w:p>
     <w:p>
@@ -8148,7 +8183,7 @@
       </w:r>
       <w:proofErr w:type="spellEnd"/>
       <w:r>
-        <w:t xml:space="preserve">. </w:t>
+        <w:t>.</w:t>
       </w:r>
     </w:p>
     <w:p>
@@ -8181,7 +8216,7 @@
       </w:r>
       <w:proofErr w:type="spellEnd"/>
       <w:r>
-        <w:t xml:space="preserve"> a sloučí je s vaší pracovní verzí. </w:t>
+        <w:t xml:space="preserve"> a sloučí je s vaší pracovní verzí.</w:t>
       </w:r>
     </w:p>
     <w:p>
@@ -8222,7 +8257,7 @@
       </w:r>
       <w:proofErr w:type="spellEnd"/>
       <w:r>
-        <w:t xml:space="preserve"> &lt;větev&gt; – Přepne vás do zvolené větve. </w:t>
+        <w:t xml:space="preserve"> &lt;větev&gt; – Přepne vás do zvolené větve.</w:t>
       </w:r>
     </w:p>
     <w:p>
@@ -8373,26 +8408,29 @@
       </w:pPr>
       <w:bookmarkStart w:id="40" w:name="_Toc220153181"/>
       <w:r>
+        <w:t>Metodika</w:t>
+      </w:r>
+      <w:r>
+        <w:t xml:space="preserve"> Kanban</w:t>
+      </w:r>
+      <w:bookmarkEnd w:id="40"/>
+    </w:p>
+    <w:p>
+      <w:pPr>
+        <w:pStyle w:val="Pokraovn"/>
+      </w:pPr>
+      <w:r>
+        <w:t>Kanban je způsob organizace práce, který využívá vizuální tabuli (fyzickou nebo digitální) s několika sloupci pro sledování postupu úkolů. Jednotlivé úkoly se v</w:t>
+      </w:r>
+      <w:r>
+        <w:t> </w:t>
+      </w:r>
+      <w:r>
+        <w:t xml:space="preserve">průběhu zpracování posouvají z jednoho sloupce do druhého. Klíčovou zásadou Kanbanu je, že se nové úkoly začínají řešit teprve tehdy, když na ně tým má kapacitu, namísto zahájení všech úkolů najednou. Tento přístup pomáhá předcházet zahlcení </w:t>
+      </w:r>
+      <w:r>
         <w:lastRenderedPageBreak/>
-        <w:t>Metodika</w:t>
-      </w:r>
-      <w:r>
-        <w:t xml:space="preserve"> Kanban</w:t>
-      </w:r>
-      <w:bookmarkEnd w:id="40"/>
-    </w:p>
-    <w:p>
-      <w:pPr>
-        <w:pStyle w:val="Pokraovn"/>
-      </w:pPr>
-      <w:r>
-        <w:t>Kanban je způsob organizace práce, který využívá vizuální tabuli (fyzickou nebo digitální) s několika sloupci pro sledování postupu úkolů. Jednotlivé úkoly se v</w:t>
-      </w:r>
-      <w:r>
-        <w:t> </w:t>
-      </w:r>
-      <w:r>
-        <w:t>průběhu zpracování posouvají z jednoho sloupce do druhého. Klíčovou zásadou Kanbanu je, že se nové úkoly začínají řešit teprve tehdy, když na ně tým má kapacitu, namísto zahájení všech úkolů najednou. Tento přístup pomáhá předcházet zahlcení a</w:t>
+        <w:t>a</w:t>
       </w:r>
       <w:r>
         <w:t> </w:t>
@@ -8497,7 +8535,19 @@
         <w:rPr>
           <w:rFonts w:eastAsiaTheme="minorEastAsia"/>
         </w:rPr>
-        <w:t xml:space="preserve">Praktická část opisuje zvolený postup při tvorbě desktopové aplikace </w:t>
+        <w:t xml:space="preserve">Praktická část </w:t>
+      </w:r>
+      <w:r>
+        <w:rPr>
+          <w:rFonts w:eastAsiaTheme="minorEastAsia"/>
+        </w:rPr>
+        <w:t>p</w:t>
+      </w:r>
+      <w:r>
+        <w:rPr>
+          <w:rFonts w:eastAsiaTheme="minorEastAsia"/>
+        </w:rPr>
+        <w:t xml:space="preserve">opisuje zvolený postup při tvorbě desktopové aplikace </w:t>
       </w:r>
       <w:proofErr w:type="spellStart"/>
       <w:r>
@@ -8629,7 +8679,7 @@
         <w:t>Slouží ke správě uložených přihlašovacích údajů, jejich přehlednému zobrazení, filtrování a základním operacím</w:t>
       </w:r>
       <w:r>
-        <w:t xml:space="preserve"> </w:t>
+        <w:t>.</w:t>
       </w:r>
     </w:p>
     <w:p>
@@ -8721,7 +8771,13 @@
         <w:t xml:space="preserve">– </w:t>
       </w:r>
       <w:r>
-        <w:t>Přijatá sdílení. Tento formulář zobrazuje kompletní přehled všech hesel, která uživateli sdílí ostatní, včetně informace o původním vlastníkovi.</w:t>
+        <w:t>Přijatá sdílení. Tento formulář zobrazuje kompletní přehled všech hesel, která uživateli sdílí ostatní</w:t>
+      </w:r>
+      <w:r>
+        <w:t>m</w:t>
+      </w:r>
+      <w:r>
+        <w:t>, včetně informace o původním vlastníkovi.</w:t>
       </w:r>
     </w:p>
     <w:p>
@@ -8957,10 +9013,12 @@
         <w:t xml:space="preserve"> databázi hostovanou na platformě Endora.cz v rámci jejich free hostingového plánu. Pro komunikaci s databází je použita knihovna </w:t>
       </w:r>
       <w:proofErr w:type="spellStart"/>
+      <w:proofErr w:type="gramStart"/>
       <w:r>
         <w:t>MySql.Data.MySqlClient</w:t>
       </w:r>
       <w:proofErr w:type="spellEnd"/>
+      <w:proofErr w:type="gramEnd"/>
       <w:r>
         <w:t>, která umožňuje přímé provádění SQL dotazů z</w:t>
       </w:r>
@@ -8981,7 +9039,13 @@
       </w:r>
       <w:proofErr w:type="spellEnd"/>
       <w:r>
-        <w:t xml:space="preserve"> Manager se neházejí</w:t>
+        <w:t xml:space="preserve"> Manager se n</w:t>
+      </w:r>
+      <w:r>
+        <w:t>ac</w:t>
+      </w:r>
+      <w:r>
+        <w:t>házejí</w:t>
       </w:r>
       <w:r>
         <w:t xml:space="preserve"> tabulky </w:t>
@@ -9203,13 +9267,7 @@
       </w:r>
       <w:proofErr w:type="spellEnd"/>
       <w:r>
-        <w:t xml:space="preserve"> (32), které slouží k uložení náhodně generované soli (salt) pro zvýšení bezpečnosti </w:t>
-      </w:r>
-      <w:r>
-        <w:t>hashovaní</w:t>
-      </w:r>
-      <w:r>
-        <w:t xml:space="preserve"> hesla uživatele.</w:t>
+        <w:t xml:space="preserve"> (32), které slouží k uložení náhodně generované soli (salt) pro zvýšení bezpečnosti hashovaní hesla uživatele.</w:t>
       </w:r>
     </w:p>
     <w:p>
@@ -9546,21 +9604,11 @@
       <w:r>
         <w:t xml:space="preserve">Tabulka </w:t>
       </w:r>
-      <w:r>
-        <w:fldChar w:fldCharType="begin"/>
-      </w:r>
-      <w:r>
-        <w:instrText xml:space="preserve"> SEQ Tabulka \* ARABIC </w:instrText>
-      </w:r>
-      <w:r>
-        <w:fldChar w:fldCharType="separate"/>
-      </w:r>
-      <w:r>
-        <w:t>1</w:t>
-      </w:r>
-      <w:r>
-        <w:fldChar w:fldCharType="end"/>
-      </w:r>
+      <w:fldSimple w:instr=" SEQ Tabulka \* ARABIC ">
+        <w:r>
+          <w:t>1</w:t>
+        </w:r>
+      </w:fldSimple>
       <w:r>
         <w:t xml:space="preserve"> </w:t>
       </w:r>
@@ -10269,21 +10317,11 @@
       <w:r>
         <w:t xml:space="preserve">Tabulka </w:t>
       </w:r>
-      <w:r>
-        <w:fldChar w:fldCharType="begin"/>
-      </w:r>
-      <w:r>
-        <w:instrText xml:space="preserve"> SEQ Tabulka \* ARABIC </w:instrText>
-      </w:r>
-      <w:r>
-        <w:fldChar w:fldCharType="separate"/>
-      </w:r>
-      <w:r>
-        <w:t>2</w:t>
-      </w:r>
-      <w:r>
-        <w:fldChar w:fldCharType="end"/>
-      </w:r>
+      <w:fldSimple w:instr=" SEQ Tabulka \* ARABIC ">
+        <w:r>
+          <w:t>2</w:t>
+        </w:r>
+      </w:fldSimple>
       <w:r>
         <w:t xml:space="preserve"> </w:t>
       </w:r>
@@ -10416,11 +10454,6 @@
       <w:r>
         <w:t xml:space="preserve"> a určuje uživatele, který skupinu vytvořil.</w:t>
       </w:r>
-    </w:p>
-    <w:p>
-      <w:pPr>
-        <w:pStyle w:val="Pokraovn"/>
-      </w:pPr>
     </w:p>
     <w:tbl>
       <w:tblPr>
@@ -10704,21 +10737,11 @@
       <w:r>
         <w:t xml:space="preserve">Tabulka </w:t>
       </w:r>
-      <w:r>
-        <w:fldChar w:fldCharType="begin"/>
-      </w:r>
-      <w:r>
-        <w:instrText xml:space="preserve"> SEQ Tabulka \* ARABIC </w:instrText>
-      </w:r>
-      <w:r>
-        <w:fldChar w:fldCharType="separate"/>
-      </w:r>
-      <w:r>
-        <w:t>3</w:t>
-      </w:r>
-      <w:r>
-        <w:fldChar w:fldCharType="end"/>
-      </w:r>
+      <w:fldSimple w:instr=" SEQ Tabulka \* ARABIC ">
+        <w:r>
+          <w:t>3</w:t>
+        </w:r>
+      </w:fldSimple>
       <w:r>
         <w:t xml:space="preserve"> </w:t>
       </w:r>
@@ -10871,6 +10894,7 @@
                 <w:b/>
                 <w:bCs/>
               </w:rPr>
+              <w:lastRenderedPageBreak/>
               <w:t>Název sloupce</w:t>
             </w:r>
           </w:p>
@@ -11034,21 +11058,11 @@
       <w:r>
         <w:t xml:space="preserve">Tabulka </w:t>
       </w:r>
-      <w:r>
-        <w:fldChar w:fldCharType="begin"/>
-      </w:r>
-      <w:r>
-        <w:instrText xml:space="preserve"> SEQ Tabulka \* ARABIC </w:instrText>
-      </w:r>
-      <w:r>
-        <w:fldChar w:fldCharType="separate"/>
-      </w:r>
-      <w:r>
-        <w:t>4</w:t>
-      </w:r>
-      <w:r>
-        <w:fldChar w:fldCharType="end"/>
-      </w:r>
+      <w:fldSimple w:instr=" SEQ Tabulka \* ARABIC ">
+        <w:r>
+          <w:t>4</w:t>
+        </w:r>
+      </w:fldSimple>
       <w:r>
         <w:t xml:space="preserve"> </w:t>
       </w:r>
@@ -11538,21 +11552,11 @@
       <w:r>
         <w:t xml:space="preserve">Tabulka </w:t>
       </w:r>
-      <w:r>
-        <w:fldChar w:fldCharType="begin"/>
-      </w:r>
-      <w:r>
-        <w:instrText xml:space="preserve"> SEQ Tabulka \* ARABIC </w:instrText>
-      </w:r>
-      <w:r>
-        <w:fldChar w:fldCharType="separate"/>
-      </w:r>
-      <w:r>
-        <w:t>5</w:t>
-      </w:r>
-      <w:r>
-        <w:fldChar w:fldCharType="end"/>
-      </w:r>
+      <w:fldSimple w:instr=" SEQ Tabulka \* ARABIC ">
+        <w:r>
+          <w:t>5</w:t>
+        </w:r>
+      </w:fldSimple>
       <w:r>
         <w:t xml:space="preserve"> </w:t>
       </w:r>
@@ -11643,6 +11647,9 @@
     </w:p>
     <w:p>
       <w:r>
+        <w:rPr>
+          <w:noProof/>
+        </w:rPr>
         <w:drawing>
           <wp:inline distT="0" distB="0" distL="0" distR="0" wp14:anchorId="4A2C074E" wp14:editId="16A343DE">
             <wp:extent cx="5219700" cy="3816985"/>
@@ -11961,7 +11968,13 @@
       </w:r>
       <w:proofErr w:type="spellEnd"/>
       <w:r>
-        <w:t xml:space="preserve"> databázi jako je Aiven.io, kde jsem moc nepochopil, jak se ta aplikace používá nebo Freehosting.com, který po vytvoření databáze a tabulek oznámil, že není kompatibilní s .Net frameworkem. Nakonec jsem našel českou web stránku Endora.cz, která ponouká free hosting </w:t>
+        <w:t xml:space="preserve"> databázi jako je Aiven.io, kde jsem moc nepochopil, jak se ta aplikace používá nebo Freehosting.com, který po vytvoření databáze a tabulek oznámil, že není kompatibilní s .Net frameworkem. Nakonec jsem našel českou web stránku Endora.cz, která </w:t>
+      </w:r>
+      <w:r>
+        <w:t>nabízí</w:t>
+      </w:r>
+      <w:r>
+        <w:t xml:space="preserve"> free hosting </w:t>
       </w:r>
       <w:proofErr w:type="spellStart"/>
       <w:r>
@@ -12001,7 +12014,13 @@
       </w:r>
       <w:proofErr w:type="spellEnd"/>
       <w:r>
-        <w:t xml:space="preserve"> balíček, co jsem nečekal, že bude fungovat, protože jsem tokové něco dělal poprvé.</w:t>
+        <w:t xml:space="preserve"> balíček, co jsem nečekal, že bude fungovat, protože jsem t</w:t>
+      </w:r>
+      <w:r>
+        <w:t>a</w:t>
+      </w:r>
+      <w:r>
+        <w:t>kové něco dělal poprvé.</w:t>
       </w:r>
       <w:r>
         <w:t xml:space="preserve"> Pak jsem ho přidal na začátek formulářů, kde používám data z databáze </w:t>
@@ -12015,16 +12034,24 @@
         <w:t xml:space="preserve"> </w:t>
       </w:r>
       <w:proofErr w:type="spellStart"/>
+      <w:proofErr w:type="gramStart"/>
       <w:r>
         <w:t>MySql.Data.MySqlClient</w:t>
       </w:r>
       <w:proofErr w:type="spellEnd"/>
+      <w:proofErr w:type="gramEnd"/>
       <w:r>
         <w:t>.</w:t>
       </w:r>
     </w:p>
     <w:p>
-      <w:r>
+      <w:pPr>
+        <w:jc w:val="center"/>
+      </w:pPr>
+      <w:r>
+        <w:rPr>
+          <w:noProof/>
+        </w:rPr>
         <w:lastRenderedPageBreak/>
         <w:drawing>
           <wp:inline distT="0" distB="0" distL="0" distR="0" wp14:anchorId="1FB22E37" wp14:editId="28A834E6">
@@ -12138,7 +12165,13 @@
       </w:r>
     </w:p>
     <w:p>
-      <w:r>
+      <w:pPr>
+        <w:jc w:val="center"/>
+      </w:pPr>
+      <w:r>
+        <w:rPr>
+          <w:noProof/>
+        </w:rPr>
         <w:drawing>
           <wp:inline distT="0" distB="0" distL="0" distR="0" wp14:anchorId="702EA2A5" wp14:editId="48229125">
             <wp:extent cx="2638793" cy="409632"/>
@@ -12217,6 +12250,9 @@
     </w:p>
     <w:p>
       <w:r>
+        <w:rPr>
+          <w:noProof/>
+        </w:rPr>
         <w:drawing>
           <wp:inline distT="0" distB="0" distL="0" distR="0" wp14:anchorId="3CDC2F44" wp14:editId="211E29A5">
             <wp:extent cx="5219700" cy="438150"/>
@@ -12392,6 +12428,9 @@
     </w:p>
     <w:p>
       <w:r>
+        <w:rPr>
+          <w:noProof/>
+        </w:rPr>
         <w:lastRenderedPageBreak/>
         <w:drawing>
           <wp:inline distT="0" distB="0" distL="0" distR="0" wp14:anchorId="7503D7D5" wp14:editId="0104A818">
@@ -12494,6 +12533,9 @@
         <w:t>). Následně ověřím, zda jsou pole pro uživatelské jméno a heslo vyplněna. Pokud ne, zobrazím upozornění. Poté zkontroluji, zda se zadané heslo shoduje s jeho opakováním.</w:t>
       </w:r>
       <w:r>
+        <w:rPr>
+          <w:noProof/>
+        </w:rPr>
         <w:drawing>
           <wp:inline distT="0" distB="0" distL="0" distR="0" wp14:anchorId="3EB000E8" wp14:editId="6CAD5A35">
             <wp:extent cx="5219700" cy="2181225"/>
@@ -12546,6 +12588,9 @@
     </w:p>
     <w:p>
       <w:r>
+        <w:rPr>
+          <w:noProof/>
+        </w:rPr>
         <w:lastRenderedPageBreak/>
         <w:drawing>
           <wp:inline distT="0" distB="0" distL="0" distR="0" wp14:anchorId="3D9E9AEA" wp14:editId="403534E7">
@@ -12598,21 +12643,39 @@
         <w:t>sůl</w:t>
       </w:r>
       <w:r>
-        <w:t>. Jedná se o unikátní řadu bajtů pro odvození šifrovacího klíče z hlavního hesla. Tato sůl se ukládá do databáze a je unikátní pro každého uživatele. Pro generování používám vlastní metodu </w:t>
-      </w:r>
-      <w:proofErr w:type="spellStart"/>
+        <w:t>. Jedná se o unikátní řadu bajtů pro odvození šifrovacího klíče z hlavního hesla. Tato sůl se ukládá do databáze a je unikátní pro každého uživatele. Pro generování používám vlastní metodu</w:t>
+      </w:r>
+      <w:r>
+        <w:t xml:space="preserve"> </w:t>
+      </w:r>
+      <w:proofErr w:type="spellStart"/>
+      <w:proofErr w:type="gramStart"/>
       <w:r>
         <w:t>GenerateRandomSalt</w:t>
       </w:r>
       <w:proofErr w:type="spellEnd"/>
       <w:r>
-        <w:t>(), která využívá kryptograficky bezpečný generátor náhodných čísel z </w:t>
-      </w:r>
-      <w:proofErr w:type="spellStart"/>
+        <w:t>(</w:t>
+      </w:r>
+      <w:proofErr w:type="gramEnd"/>
+      <w:r>
+        <w:t xml:space="preserve">), která využívá kryptograficky bezpečný generátor náhodných čísel </w:t>
+      </w:r>
+      <w:proofErr w:type="gramStart"/>
+      <w:r>
+        <w:t>z</w:t>
+      </w:r>
+      <w:proofErr w:type="gramEnd"/>
+      <w:r>
+        <w:t xml:space="preserve"> </w:t>
+      </w:r>
+      <w:proofErr w:type="spellStart"/>
+      <w:proofErr w:type="gramStart"/>
       <w:r>
         <w:t>System.Security.Cryptography</w:t>
       </w:r>
       <w:proofErr w:type="spellEnd"/>
+      <w:proofErr w:type="gramEnd"/>
       <w:r>
         <w:t>.</w:t>
       </w:r>
@@ -12620,6 +12683,9 @@
         <w:t xml:space="preserve"> </w:t>
       </w:r>
       <w:r>
+        <w:rPr>
+          <w:noProof/>
+        </w:rPr>
         <w:drawing>
           <wp:inline distT="0" distB="0" distL="0" distR="0" wp14:anchorId="3011EBEB" wp14:editId="683BA458">
             <wp:extent cx="5219700" cy="2148840"/>
@@ -12686,6 +12752,9 @@
     </w:p>
     <w:p>
       <w:r>
+        <w:rPr>
+          <w:noProof/>
+        </w:rPr>
         <w:drawing>
           <wp:inline distT="0" distB="0" distL="0" distR="0" wp14:anchorId="53FE802A" wp14:editId="6587AD0A">
             <wp:extent cx="5134692" cy="714475"/>
@@ -12728,18 +12797,26 @@
         <w:t>Poté vytvořím INSERT dotaz pro vložení nového uživatele včetně jeho hashovaného hesla a soli. Po provedení dotazu ověřím počet ovlivněných řádků. Pokud byl uživatel úspěšně vytvořen (tj. </w:t>
       </w:r>
       <w:proofErr w:type="spellStart"/>
+      <w:proofErr w:type="gramStart"/>
       <w:r>
         <w:t>rowsAffected</w:t>
       </w:r>
       <w:proofErr w:type="spellEnd"/>
       <w:r>
-        <w:t xml:space="preserve"> &gt; 0), zobrazím potvrzovací zprávu, přesměruji </w:t>
+        <w:t xml:space="preserve"> &gt;</w:t>
+      </w:r>
+      <w:proofErr w:type="gramEnd"/>
+      <w:r>
+        <w:t xml:space="preserve"> 0), zobrazím potvrzovací zprávu, přesměruji </w:t>
       </w:r>
       <w:r>
         <w:lastRenderedPageBreak/>
         <w:t>uživatele na přihlašovací formulář a vyčistím vstupní pole.</w:t>
       </w:r>
       <w:r>
+        <w:rPr>
+          <w:noProof/>
+        </w:rPr>
         <w:drawing>
           <wp:inline distT="0" distB="0" distL="0" distR="0" wp14:anchorId="06DD24BD" wp14:editId="79D912F2">
             <wp:extent cx="5219700" cy="2407920"/>
@@ -12782,6 +12859,9 @@
         <w:t>Pro úspěšné odeslání formuláře je nutné splnit požadavky na silné heslo: minimálně 12 znaků, alespoň 1 velké písmeno, 1 speciální znak a 1 číslice. Dále je nutné správně vyplnit textovou CAPTCHA, která ověřuje, že registrující se subjekt je skutečný člověk. Validace hesla probíhá dynamicky při každé změně v textovém poli – při splnění konkrétní podmínky se příslušný indikátor (Label) zabarví zeleně, jinak zůstává červený. Pro dokončení registrace musí být všechny čtyři indikátory hesla zelené a CAPTCHA musí být vyplněna správně.</w:t>
       </w:r>
       <w:r>
+        <w:rPr>
+          <w:noProof/>
+        </w:rPr>
         <w:drawing>
           <wp:inline distT="0" distB="0" distL="0" distR="0" wp14:anchorId="5CB6469C" wp14:editId="57BFA3CA">
             <wp:extent cx="4010585" cy="1952898"/>
@@ -12904,6 +12984,9 @@
     </w:p>
     <w:p>
       <w:r>
+        <w:rPr>
+          <w:noProof/>
+        </w:rPr>
         <w:drawing>
           <wp:inline distT="0" distB="0" distL="0" distR="0" wp14:anchorId="209A0DA2" wp14:editId="21348D72">
             <wp:extent cx="5219700" cy="997585"/>
@@ -12956,6 +13039,9 @@
     </w:p>
     <w:p>
       <w:r>
+        <w:rPr>
+          <w:noProof/>
+        </w:rPr>
         <w:drawing>
           <wp:inline distT="0" distB="0" distL="0" distR="0" wp14:anchorId="78C41ED5" wp14:editId="12AC4B69">
             <wp:extent cx="5219700" cy="1890395"/>
@@ -13020,6 +13106,9 @@
     </w:p>
     <w:p>
       <w:r>
+        <w:rPr>
+          <w:noProof/>
+        </w:rPr>
         <w:lastRenderedPageBreak/>
         <w:drawing>
           <wp:inline distT="0" distB="0" distL="0" distR="0" wp14:anchorId="38967635" wp14:editId="2DD59C8D">
@@ -13060,13 +13149,7 @@
     </w:p>
     <w:p>
       <w:r>
-        <w:t xml:space="preserve">Popisovaná implementace CAPTCHA zajišťuje, že při registraci se ověřuje, zda akci provádí skutečný </w:t>
-      </w:r>
-      <w:r>
-        <w:t>uživatel,</w:t>
-      </w:r>
-      <w:r>
-        <w:t xml:space="preserve"> a ne automatizovaný program. Náhodné generování znaků, šum na pozadí a náhodné zobrazení znaků zvyšují obtížnost automatického rozpoznání kódu.</w:t>
+        <w:t>Popisovaná implementace CAPTCHA zajišťuje, že při registraci se ověřuje, zda akci provádí skutečný uživatel, a ne automatizovaný program. Náhodné generování znaků, šum na pozadí a náhodné zobrazení znaků zvyšují obtížnost automatického rozpoznání kódu.</w:t>
       </w:r>
     </w:p>
     <w:p>
@@ -13083,6 +13166,88 @@
       <w:pPr>
         <w:pStyle w:val="Pokraovn"/>
       </w:pPr>
+      <w:r>
+        <w:t xml:space="preserve">Přihlášení uživatele do aplikace se nachází na formuláři </w:t>
+      </w:r>
+      <w:proofErr w:type="spellStart"/>
+      <w:r>
+        <w:t>main.cs</w:t>
+      </w:r>
+      <w:proofErr w:type="spellEnd"/>
+      <w:r>
+        <w:t xml:space="preserve">, kde je i registrace pro uživatele. Tato funkce je nastavena na tlačítku button1. Na začátku si z textových polí textbox1 a textbox2 si uložím </w:t>
+      </w:r>
+      <w:r>
+        <w:t xml:space="preserve">data do proměnných user a </w:t>
+      </w:r>
+      <w:proofErr w:type="spellStart"/>
+      <w:r>
+        <w:t>pass</w:t>
+      </w:r>
+      <w:proofErr w:type="spellEnd"/>
+      <w:r>
+        <w:t xml:space="preserve">, které pak následně budu porovnávat s daty z databáze. Data z databáze s pomocí dotazu SELECT s podmínkou stejného uživatelského jména, když </w:t>
+      </w:r>
+      <w:proofErr w:type="spellStart"/>
+      <w:r>
+        <w:t>reader</w:t>
+      </w:r>
+      <w:proofErr w:type="spellEnd"/>
+      <w:r>
+        <w:t xml:space="preserve"> nic nezachytí znamená to, že se v databází nenachází účet s tímto uživatelským jménem a vy</w:t>
+      </w:r>
+      <w:r>
+        <w:t>volá</w:t>
+      </w:r>
+      <w:r>
+        <w:t xml:space="preserve"> se chybová správa.</w:t>
+      </w:r>
+      <w:r>
+        <w:t xml:space="preserve"> Jestli se takový účet najde v databáze pokračuje se na další krok s ověřením hesla. Heslo se do databázi ukládá za hashované tak se na jeho porovnání použije metoda z třídy </w:t>
+      </w:r>
+      <w:proofErr w:type="spellStart"/>
+      <w:r>
+        <w:t>BCrypt</w:t>
+      </w:r>
+      <w:proofErr w:type="spellEnd"/>
+      <w:r>
+        <w:t xml:space="preserve"> </w:t>
+      </w:r>
+      <w:proofErr w:type="spellStart"/>
+      <w:r>
+        <w:t>EnhacedVerify</w:t>
+      </w:r>
+      <w:proofErr w:type="spellEnd"/>
+      <w:r>
+        <w:t>. V případě že se heslo s </w:t>
+      </w:r>
+      <w:proofErr w:type="spellStart"/>
+      <w:r>
+        <w:t>hashem</w:t>
+      </w:r>
+      <w:proofErr w:type="spellEnd"/>
+      <w:r>
+        <w:t xml:space="preserve"> neshoduje vyvolá se chybová správa, naopak, když se heslo s </w:t>
+      </w:r>
+      <w:proofErr w:type="spellStart"/>
+      <w:r>
+        <w:t>hashem</w:t>
+      </w:r>
+      <w:proofErr w:type="spellEnd"/>
+      <w:r>
+        <w:t xml:space="preserve"> bude shodovat tak se přiradí heslo</w:t>
+      </w:r>
+      <w:r>
+        <w:t xml:space="preserve"> tak se uživatel vpusti na hlavní formulář s jeho uloženýma </w:t>
+      </w:r>
+      <w:proofErr w:type="spellStart"/>
+      <w:r>
+        <w:t>heslama</w:t>
+      </w:r>
+      <w:proofErr w:type="spellEnd"/>
+      <w:r>
+        <w:t>.</w:t>
+      </w:r>
     </w:p>
     <w:p>
       <w:pPr>
@@ -13090,6 +13255,7 @@
       </w:pPr>
       <w:bookmarkStart w:id="70" w:name="_Toc220153200"/>
       <w:r>
+        <w:lastRenderedPageBreak/>
         <w:t>Správa hesel</w:t>
       </w:r>
       <w:bookmarkEnd w:id="70"/>
@@ -13753,7 +13919,19 @@
           <w:rPr>
             <w:rStyle w:val="Hypertextovodkaz"/>
           </w:rPr>
-          <w:t>https://www.grappa.sk/blog/co-je-to-ux-a-ui-a-aky-je-medzi-nimi-rozdiel/</w:t>
+          <w:t>https://www.grappa.sk</w:t>
+        </w:r>
+        <w:r>
+          <w:rPr>
+            <w:rStyle w:val="Hypertextovodkaz"/>
+          </w:rPr>
+          <w:t>/</w:t>
+        </w:r>
+        <w:r>
+          <w:rPr>
+            <w:rStyle w:val="Hypertextovodkaz"/>
+          </w:rPr>
+          <w:t>blog/co-je-to-ux-a-ui-a-aky-je-medzi-nimi-rozdiel/</w:t>
         </w:r>
       </w:hyperlink>
       <w:r>
@@ -14079,9 +14257,9 @@
           <w:numId w:val="38"/>
         </w:numPr>
       </w:pPr>
-      <w:bookmarkStart w:id="99" w:name="_Ref218865124"/>
-      <w:bookmarkStart w:id="100" w:name="_Ref218422289"/>
-      <w:bookmarkStart w:id="101" w:name="_Ref220161767"/>
+      <w:bookmarkStart w:id="99" w:name="_Ref220161767"/>
+      <w:bookmarkStart w:id="100" w:name="_Ref218865124"/>
+      <w:bookmarkStart w:id="101" w:name="_Ref218422289"/>
       <w:r>
         <w:t>ŠTRÁFELDA, Jan. </w:t>
       </w:r>
@@ -14110,21 +14288,13 @@
           <w:rPr>
             <w:rStyle w:val="Hypertextovodkaz"/>
           </w:rPr>
-          <w:t>https://www.strafelda.cz/</w:t>
+          <w:t>https://www.strafelda.cz/hash</w:t>
         </w:r>
-        <w:proofErr w:type="spellStart"/>
-        <w:r>
-          <w:rPr>
-            <w:rStyle w:val="Hypertextovodkaz"/>
-          </w:rPr>
-          <w:t>hash</w:t>
-        </w:r>
-        <w:proofErr w:type="spellEnd"/>
       </w:hyperlink>
       <w:r>
         <w:t>. [cit. 2026-01-24].</w:t>
       </w:r>
-      <w:bookmarkEnd w:id="101"/>
+      <w:bookmarkEnd w:id="99"/>
     </w:p>
     <w:p>
       <w:pPr>
@@ -14180,7 +14350,7 @@
       <w:r>
         <w:t>. [cit. 2026-01-09].</w:t>
       </w:r>
-      <w:bookmarkEnd w:id="99"/>
+      <w:bookmarkEnd w:id="100"/>
     </w:p>
     <w:p>
       <w:pPr>
@@ -14314,6 +14484,7 @@
           <w:numId w:val="38"/>
         </w:numPr>
       </w:pPr>
+      <w:bookmarkStart w:id="102" w:name="_Ref221174463"/>
       <w:r>
         <w:rPr>
           <w:i/>
@@ -14381,7 +14552,8 @@
       <w:r>
         <w:t>. [cit. 2026-01-04].</w:t>
       </w:r>
-      <w:bookmarkEnd w:id="100"/>
+      <w:bookmarkEnd w:id="101"/>
+      <w:bookmarkEnd w:id="102"/>
     </w:p>
     <w:p>
       <w:pPr>
@@ -14391,7 +14563,7 @@
           <w:numId w:val="38"/>
         </w:numPr>
       </w:pPr>
-      <w:bookmarkStart w:id="102" w:name="_Ref218422443"/>
+      <w:bookmarkStart w:id="103" w:name="_Ref218422443"/>
       <w:r>
         <w:rPr>
           <w:i/>
@@ -14481,7 +14653,7 @@
       <w:r>
         <w:t>. [cit. 2026-01-04].</w:t>
       </w:r>
-      <w:bookmarkEnd w:id="102"/>
+      <w:bookmarkEnd w:id="103"/>
     </w:p>
     <w:p>
       <w:pPr>
@@ -14491,7 +14663,7 @@
           <w:numId w:val="38"/>
         </w:numPr>
       </w:pPr>
-      <w:bookmarkStart w:id="103" w:name="_Ref218422583"/>
+      <w:bookmarkStart w:id="104" w:name="_Ref218422583"/>
       <w:r>
         <w:rPr>
           <w:i/>
@@ -14591,7 +14763,7 @@
       <w:r>
         <w:t>. [cit. 2026-01-04].</w:t>
       </w:r>
-      <w:bookmarkEnd w:id="103"/>
+      <w:bookmarkEnd w:id="104"/>
     </w:p>
     <w:p>
       <w:pPr>
@@ -14601,7 +14773,7 @@
           <w:numId w:val="38"/>
         </w:numPr>
       </w:pPr>
-      <w:bookmarkStart w:id="104" w:name="_Ref218865168"/>
+      <w:bookmarkStart w:id="105" w:name="_Ref218865168"/>
       <w:proofErr w:type="spellStart"/>
       <w:r>
         <w:rPr>
@@ -14633,7 +14805,7 @@
       <w:r>
         <w:t>. [cit. 2026-01-09].</w:t>
       </w:r>
-      <w:bookmarkEnd w:id="104"/>
+      <w:bookmarkEnd w:id="105"/>
     </w:p>
     <w:p>
       <w:pPr>
@@ -14643,7 +14815,7 @@
           <w:numId w:val="38"/>
         </w:numPr>
       </w:pPr>
-      <w:bookmarkStart w:id="105" w:name="_Ref218422885"/>
+      <w:bookmarkStart w:id="106" w:name="_Ref218422885"/>
       <w:r>
         <w:t xml:space="preserve">WALTER, </w:t>
       </w:r>
@@ -14755,7 +14927,7 @@
       <w:r>
         <w:t>atec.com/sk/blog/kanban-defin%C3%ADcia-met%C3%B3da-princ%C3%ADpy-pr%C3%ADklady-a-kanban-tabula. [cit. 2026-01-04].</w:t>
       </w:r>
-      <w:bookmarkEnd w:id="105"/>
+      <w:bookmarkEnd w:id="106"/>
     </w:p>
     <w:p>
       <w:pPr>
@@ -14765,7 +14937,7 @@
           <w:numId w:val="38"/>
         </w:numPr>
       </w:pPr>
-      <w:bookmarkStart w:id="106" w:name="_Ref220162006"/>
+      <w:bookmarkStart w:id="107" w:name="_Ref220162006"/>
       <w:proofErr w:type="spellStart"/>
       <w:r>
         <w:rPr>
@@ -14820,7 +14992,7 @@
       <w:r>
         <w:t>. [cit. 2026-01-24].</w:t>
       </w:r>
-      <w:bookmarkEnd w:id="106"/>
+      <w:bookmarkEnd w:id="107"/>
     </w:p>
     <w:p>
       <w:pPr>
@@ -14836,21 +15008,21 @@
       <w:pPr>
         <w:pStyle w:val="uvodzaver"/>
       </w:pPr>
-      <w:bookmarkStart w:id="107" w:name="_Toc144753411"/>
-      <w:bookmarkStart w:id="108" w:name="_Toc144746942"/>
-      <w:bookmarkStart w:id="109" w:name="_Toc515880904"/>
-      <w:bookmarkStart w:id="110" w:name="_Toc220153213"/>
+      <w:bookmarkStart w:id="108" w:name="_Toc144753411"/>
+      <w:bookmarkStart w:id="109" w:name="_Toc144746942"/>
+      <w:bookmarkStart w:id="110" w:name="_Toc515880904"/>
+      <w:bookmarkStart w:id="111" w:name="_Toc220153213"/>
       <w:r>
         <w:lastRenderedPageBreak/>
         <w:t>S</w:t>
       </w:r>
-      <w:bookmarkEnd w:id="107"/>
       <w:bookmarkEnd w:id="108"/>
       <w:bookmarkEnd w:id="109"/>
+      <w:bookmarkEnd w:id="110"/>
       <w:r>
         <w:t>eznam použitých symbolů a zkratek</w:t>
       </w:r>
-      <w:bookmarkEnd w:id="110"/>
+      <w:bookmarkEnd w:id="111"/>
     </w:p>
     <w:tbl>
       <w:tblPr>
@@ -15236,21 +15408,21 @@
       <w:pPr>
         <w:pStyle w:val="uvodzaver"/>
       </w:pPr>
-      <w:bookmarkStart w:id="111" w:name="_Toc144753412"/>
-      <w:bookmarkStart w:id="112" w:name="_Toc144746943"/>
-      <w:bookmarkStart w:id="113" w:name="_Toc515880905"/>
-      <w:bookmarkStart w:id="114" w:name="_Toc220153214"/>
+      <w:bookmarkStart w:id="112" w:name="_Toc144753412"/>
+      <w:bookmarkStart w:id="113" w:name="_Toc144746943"/>
+      <w:bookmarkStart w:id="114" w:name="_Toc515880905"/>
+      <w:bookmarkStart w:id="115" w:name="_Toc220153214"/>
       <w:r>
         <w:lastRenderedPageBreak/>
         <w:t>S</w:t>
       </w:r>
-      <w:bookmarkEnd w:id="111"/>
       <w:bookmarkEnd w:id="112"/>
       <w:bookmarkEnd w:id="113"/>
+      <w:bookmarkEnd w:id="114"/>
       <w:r>
         <w:t>eznam obrázků</w:t>
       </w:r>
-      <w:bookmarkEnd w:id="114"/>
+      <w:bookmarkEnd w:id="115"/>
     </w:p>
     <w:p>
       <w:pPr>
@@ -15398,12 +15570,12 @@
       <w:pPr>
         <w:pStyle w:val="uvodzaver"/>
       </w:pPr>
-      <w:bookmarkStart w:id="115" w:name="_Toc220153215"/>
+      <w:bookmarkStart w:id="116" w:name="_Toc220153215"/>
       <w:r>
         <w:lastRenderedPageBreak/>
         <w:t>Seznam tabulek</w:t>
       </w:r>
-      <w:bookmarkEnd w:id="115"/>
+      <w:bookmarkEnd w:id="116"/>
     </w:p>
     <w:p>
       <w:pPr>
@@ -15504,29 +15676,29 @@
       <w:pPr>
         <w:pStyle w:val="uvodzaver"/>
       </w:pPr>
-      <w:bookmarkStart w:id="116" w:name="_Toc144753414"/>
-      <w:bookmarkStart w:id="117" w:name="_Toc144746945"/>
-      <w:bookmarkStart w:id="118" w:name="_Toc515880907"/>
-      <w:bookmarkStart w:id="119" w:name="_Toc220153216"/>
+      <w:bookmarkStart w:id="117" w:name="_Toc144753414"/>
+      <w:bookmarkStart w:id="118" w:name="_Toc144746945"/>
+      <w:bookmarkStart w:id="119" w:name="_Toc515880907"/>
+      <w:bookmarkStart w:id="120" w:name="_Toc220153216"/>
       <w:r>
         <w:lastRenderedPageBreak/>
         <w:t>S</w:t>
       </w:r>
-      <w:bookmarkEnd w:id="116"/>
       <w:bookmarkEnd w:id="117"/>
       <w:bookmarkEnd w:id="118"/>
+      <w:bookmarkEnd w:id="119"/>
       <w:r>
         <w:t>eznam příloh</w:t>
       </w:r>
-      <w:bookmarkEnd w:id="119"/>
+      <w:bookmarkEnd w:id="120"/>
     </w:p>
     <w:p>
       <w:r>
         <w:t>Prázdná šablona maturitní práce</w:t>
       </w:r>
-      <w:bookmarkStart w:id="120" w:name="_Toc144746946"/>
+      <w:bookmarkStart w:id="121" w:name="_Toc144746946"/>
       <w:bookmarkEnd w:id="1"/>
-      <w:bookmarkEnd w:id="120"/>
+      <w:bookmarkEnd w:id="121"/>
     </w:p>
     <w:sectPr>
       <w:footerReference w:type="default" r:id="rId44"/>
@@ -18780,9 +18952,9 @@
       <w:lvlJc w:val="left"/>
       <w:pPr>
         <w:tabs>
-          <w:tab w:val="num" w:pos="720"/>
+          <w:tab w:val="num" w:pos="360"/>
         </w:tabs>
-        <w:ind w:left="720" w:hanging="360"/>
+        <w:ind w:left="360" w:hanging="360"/>
       </w:pPr>
       <w:rPr>
         <w:rFonts w:ascii="Symbol" w:hAnsi="Symbol" w:hint="default"/>
@@ -18796,9 +18968,9 @@
       <w:lvlJc w:val="left"/>
       <w:pPr>
         <w:tabs>
-          <w:tab w:val="num" w:pos="1440"/>
+          <w:tab w:val="num" w:pos="1080"/>
         </w:tabs>
-        <w:ind w:left="1440" w:hanging="360"/>
+        <w:ind w:left="1080" w:hanging="360"/>
       </w:pPr>
       <w:rPr>
         <w:rFonts w:ascii="Courier New" w:hAnsi="Courier New" w:hint="default"/>
@@ -18812,9 +18984,9 @@
       <w:lvlJc w:val="left"/>
       <w:pPr>
         <w:tabs>
-          <w:tab w:val="num" w:pos="2160"/>
+          <w:tab w:val="num" w:pos="1800"/>
         </w:tabs>
-        <w:ind w:left="2160" w:hanging="360"/>
+        <w:ind w:left="1800" w:hanging="360"/>
       </w:pPr>
       <w:rPr>
         <w:rFonts w:ascii="Wingdings" w:hAnsi="Wingdings" w:hint="default"/>
@@ -18828,9 +19000,9 @@
       <w:lvlJc w:val="left"/>
       <w:pPr>
         <w:tabs>
-          <w:tab w:val="num" w:pos="2880"/>
+          <w:tab w:val="num" w:pos="2520"/>
         </w:tabs>
-        <w:ind w:left="2880" w:hanging="360"/>
+        <w:ind w:left="2520" w:hanging="360"/>
       </w:pPr>
       <w:rPr>
         <w:rFonts w:ascii="Wingdings" w:hAnsi="Wingdings" w:hint="default"/>
@@ -18844,9 +19016,9 @@
       <w:lvlJc w:val="left"/>
       <w:pPr>
         <w:tabs>
-          <w:tab w:val="num" w:pos="3600"/>
+          <w:tab w:val="num" w:pos="3240"/>
         </w:tabs>
-        <w:ind w:left="3600" w:hanging="360"/>
+        <w:ind w:left="3240" w:hanging="360"/>
       </w:pPr>
       <w:rPr>
         <w:rFonts w:ascii="Wingdings" w:hAnsi="Wingdings" w:hint="default"/>
@@ -18860,9 +19032,9 @@
       <w:lvlJc w:val="left"/>
       <w:pPr>
         <w:tabs>
-          <w:tab w:val="num" w:pos="4320"/>
+          <w:tab w:val="num" w:pos="3960"/>
         </w:tabs>
-        <w:ind w:left="4320" w:hanging="360"/>
+        <w:ind w:left="3960" w:hanging="360"/>
       </w:pPr>
       <w:rPr>
         <w:rFonts w:ascii="Wingdings" w:hAnsi="Wingdings" w:hint="default"/>
@@ -18876,9 +19048,9 @@
       <w:lvlJc w:val="left"/>
       <w:pPr>
         <w:tabs>
-          <w:tab w:val="num" w:pos="5040"/>
+          <w:tab w:val="num" w:pos="4680"/>
         </w:tabs>
-        <w:ind w:left="5040" w:hanging="360"/>
+        <w:ind w:left="4680" w:hanging="360"/>
       </w:pPr>
       <w:rPr>
         <w:rFonts w:ascii="Wingdings" w:hAnsi="Wingdings" w:hint="default"/>
@@ -18892,9 +19064,9 @@
       <w:lvlJc w:val="left"/>
       <w:pPr>
         <w:tabs>
-          <w:tab w:val="num" w:pos="5760"/>
+          <w:tab w:val="num" w:pos="5400"/>
         </w:tabs>
-        <w:ind w:left="5760" w:hanging="360"/>
+        <w:ind w:left="5400" w:hanging="360"/>
       </w:pPr>
       <w:rPr>
         <w:rFonts w:ascii="Wingdings" w:hAnsi="Wingdings" w:hint="default"/>
@@ -18908,9 +19080,9 @@
       <w:lvlJc w:val="left"/>
       <w:pPr>
         <w:tabs>
-          <w:tab w:val="num" w:pos="6480"/>
+          <w:tab w:val="num" w:pos="6120"/>
         </w:tabs>
-        <w:ind w:left="6480" w:hanging="360"/>
+        <w:ind w:left="6120" w:hanging="360"/>
       </w:pPr>
       <w:rPr>
         <w:rFonts w:ascii="Wingdings" w:hAnsi="Wingdings" w:hint="default"/>
@@ -19834,6 +20006,7 @@
   <w:style w:type="character" w:default="1" w:styleId="Standardnpsmoodstavce">
     <w:name w:val="Default Paragraph Font"/>
     <w:uiPriority w:val="1"/>
+    <w:semiHidden/>
     <w:unhideWhenUsed/>
   </w:style>
   <w:style w:type="table" w:default="1" w:styleId="Normlntabulka">

</xml_diff>

<commit_message>
5 normostran prakticke casti
</commit_message>
<xml_diff>
--- a/maturitni_prace.docx
+++ b/maturitni_prace.docx
@@ -973,7 +973,7 @@
         <w:rPr>
           <w:noProof/>
         </w:rPr>
-        <w:t>5. února 2026</w:t>
+        <w:t>26. února 2026</w:t>
       </w:r>
       <w:r>
         <w:fldChar w:fldCharType="end"/>
@@ -1035,7 +1035,7 @@
         <w:rPr>
           <w:noProof/>
         </w:rPr>
-        <w:t>5. února 2026</w:t>
+        <w:t>26. února 2026</w:t>
       </w:r>
       <w:r>
         <w:fldChar w:fldCharType="end"/>
@@ -6361,7 +6361,6 @@
       <w:r>
         <w:t xml:space="preserve"> </w:t>
       </w:r>
-      <w:proofErr w:type="gramStart"/>
       <w:r>
         <w:t>W</w:t>
       </w:r>
@@ -6369,7 +6368,6 @@
         <w:t>eb</w:t>
       </w:r>
       <w:bookmarkEnd w:id="25"/>
-      <w:proofErr w:type="gramEnd"/>
     </w:p>
     <w:p>
       <w:pPr>
@@ -6549,16 +6547,7 @@
         <w:t>použitelnost</w:t>
       </w:r>
       <w:r>
-        <w:t xml:space="preserve"> </w:t>
-      </w:r>
-      <w:r>
-        <w:t>s</w:t>
-      </w:r>
-      <w:r>
-        <w:t> </w:t>
-      </w:r>
-      <w:r>
-        <w:t>estetickou</w:t>
+        <w:t xml:space="preserve"> s estetickou</w:t>
       </w:r>
       <w:r>
         <w:t xml:space="preserve"> hodnotou a užitečností. Celý proces UX designu je založen na hlubokém porozumění cílovému uživateli, jeho potřebám, záměrům a</w:t>
@@ -6684,10 +6673,7 @@
         <w:fldChar w:fldCharType="separate"/>
       </w:r>
       <w:r>
-        <w:t>[7</w:t>
-      </w:r>
-      <w:r>
-        <w:t>]</w:t>
+        <w:t>[7]</w:t>
       </w:r>
       <w:r>
         <w:fldChar w:fldCharType="end"/>
@@ -7365,13 +7351,7 @@
       <w:bookmarkStart w:id="33" w:name="_Toc220153174"/>
       <w:proofErr w:type="spellStart"/>
       <w:r>
-        <w:t>Hashov</w:t>
-      </w:r>
-      <w:r>
-        <w:t>á</w:t>
-      </w:r>
-      <w:r>
-        <w:t>ní</w:t>
+        <w:t>Hashování</w:t>
       </w:r>
       <w:proofErr w:type="spellEnd"/>
       <w:r>
@@ -8132,17 +8112,12 @@
         <w:t xml:space="preserve"> </w:t>
       </w:r>
       <w:proofErr w:type="spellStart"/>
-      <w:proofErr w:type="gramStart"/>
       <w:r>
         <w:t>commit</w:t>
       </w:r>
       <w:proofErr w:type="spellEnd"/>
       <w:r>
-        <w:t xml:space="preserve"> -m</w:t>
-      </w:r>
-      <w:proofErr w:type="gramEnd"/>
-      <w:r>
-        <w:t xml:space="preserve"> "zpráva" – Trvale uloží připravené změny do historie s popisnou zprávou.</w:t>
+        <w:t xml:space="preserve"> -m "zpráva" – Trvale uloží připravené změny do historie s popisnou zprávou.</w:t>
       </w:r>
     </w:p>
     <w:p>
@@ -8868,7 +8843,13 @@
     </w:p>
     <w:p>
       <w:r>
-        <w:t xml:space="preserve">Aplikace se také skládá z třídy </w:t>
+        <w:t>Aplikace se také skládá z</w:t>
+      </w:r>
+      <w:r>
+        <w:t xml:space="preserve"> </w:t>
+      </w:r>
+      <w:r>
+        <w:t xml:space="preserve">třídy </w:t>
       </w:r>
       <w:proofErr w:type="spellStart"/>
       <w:r>
@@ -8959,7 +8940,13 @@
       </w:r>
       <w:proofErr w:type="spellEnd"/>
       <w:r>
-        <w:t xml:space="preserve"> databázi hostovanou na externím serveru, což umožňuje centralizované ukládání dat a jejich dostupnost z různých částí aplikace.</w:t>
+        <w:t xml:space="preserve"> databázi hostovanou na externím serveru, což umožňuje centralizované ukládání dat a jejich dostupnost z</w:t>
+      </w:r>
+      <w:r>
+        <w:t xml:space="preserve"> </w:t>
+      </w:r>
+      <w:r>
+        <w:t>různých částí aplikace.</w:t>
       </w:r>
     </w:p>
     <w:p>
@@ -9013,12 +9000,10 @@
         <w:t xml:space="preserve"> databázi hostovanou na platformě Endora.cz v rámci jejich free hostingového plánu. Pro komunikaci s databází je použita knihovna </w:t>
       </w:r>
       <w:proofErr w:type="spellStart"/>
-      <w:proofErr w:type="gramStart"/>
       <w:r>
         <w:t>MySql.Data.MySqlClient</w:t>
       </w:r>
       <w:proofErr w:type="spellEnd"/>
-      <w:proofErr w:type="gramEnd"/>
       <w:r>
         <w:t>, která umožňuje přímé provádění SQL dotazů z</w:t>
       </w:r>
@@ -9031,7 +9016,13 @@
     </w:p>
     <w:p>
       <w:r>
-        <w:t xml:space="preserve">V databázi pro aplikaci </w:t>
+        <w:t>V</w:t>
+      </w:r>
+      <w:r>
+        <w:t xml:space="preserve"> </w:t>
+      </w:r>
+      <w:r>
+        <w:t xml:space="preserve">databázi pro aplikaci </w:t>
       </w:r>
       <w:proofErr w:type="spellStart"/>
       <w:r>
@@ -9088,7 +9079,7 @@
       </w:r>
       <w:proofErr w:type="spellEnd"/>
       <w:r>
-        <w:t xml:space="preserve">. </w:t>
+        <w:t>.</w:t>
       </w:r>
     </w:p>
     <w:p>
@@ -9120,13 +9111,7 @@
       </w:r>
       <w:proofErr w:type="spellEnd"/>
       <w:r>
-        <w:t xml:space="preserve"> Manager. Tabulka obsahuje pole </w:t>
-      </w:r>
-      <w:r>
-        <w:t>id</w:t>
-      </w:r>
-      <w:r>
-        <w:t xml:space="preserve"> datového typu </w:t>
+        <w:t xml:space="preserve"> Manager. Tabulka obsahuje pole id datového typu </w:t>
       </w:r>
       <w:proofErr w:type="spellStart"/>
       <w:r>
@@ -9604,11 +9589,21 @@
       <w:r>
         <w:t xml:space="preserve">Tabulka </w:t>
       </w:r>
-      <w:fldSimple w:instr=" SEQ Tabulka \* ARABIC ">
-        <w:r>
-          <w:t>1</w:t>
-        </w:r>
-      </w:fldSimple>
+      <w:r>
+        <w:fldChar w:fldCharType="begin"/>
+      </w:r>
+      <w:r>
+        <w:instrText xml:space="preserve"> SEQ Tabulka \* ARABIC </w:instrText>
+      </w:r>
+      <w:r>
+        <w:fldChar w:fldCharType="separate"/>
+      </w:r>
+      <w:r>
+        <w:t>1</w:t>
+      </w:r>
+      <w:r>
+        <w:fldChar w:fldCharType="end"/>
+      </w:r>
       <w:r>
         <w:t xml:space="preserve"> </w:t>
       </w:r>
@@ -10317,11 +10312,21 @@
       <w:r>
         <w:t xml:space="preserve">Tabulka </w:t>
       </w:r>
-      <w:fldSimple w:instr=" SEQ Tabulka \* ARABIC ">
-        <w:r>
-          <w:t>2</w:t>
-        </w:r>
-      </w:fldSimple>
+      <w:r>
+        <w:fldChar w:fldCharType="begin"/>
+      </w:r>
+      <w:r>
+        <w:instrText xml:space="preserve"> SEQ Tabulka \* ARABIC </w:instrText>
+      </w:r>
+      <w:r>
+        <w:fldChar w:fldCharType="separate"/>
+      </w:r>
+      <w:r>
+        <w:t>2</w:t>
+      </w:r>
+      <w:r>
+        <w:fldChar w:fldCharType="end"/>
+      </w:r>
       <w:r>
         <w:t xml:space="preserve"> </w:t>
       </w:r>
@@ -10737,11 +10742,21 @@
       <w:r>
         <w:t xml:space="preserve">Tabulka </w:t>
       </w:r>
-      <w:fldSimple w:instr=" SEQ Tabulka \* ARABIC ">
-        <w:r>
-          <w:t>3</w:t>
-        </w:r>
-      </w:fldSimple>
+      <w:r>
+        <w:fldChar w:fldCharType="begin"/>
+      </w:r>
+      <w:r>
+        <w:instrText xml:space="preserve"> SEQ Tabulka \* ARABIC </w:instrText>
+      </w:r>
+      <w:r>
+        <w:fldChar w:fldCharType="separate"/>
+      </w:r>
+      <w:r>
+        <w:t>3</w:t>
+      </w:r>
+      <w:r>
+        <w:fldChar w:fldCharType="end"/>
+      </w:r>
       <w:r>
         <w:t xml:space="preserve"> </w:t>
       </w:r>
@@ -10861,11 +10876,6 @@
       <w:r>
         <w:t xml:space="preserve"> (100), ve kterém je uložen název role.</w:t>
       </w:r>
-    </w:p>
-    <w:p>
-      <w:pPr>
-        <w:pStyle w:val="Pokraovn"/>
-      </w:pPr>
     </w:p>
     <w:tbl>
       <w:tblPr>
@@ -11058,11 +11068,21 @@
       <w:r>
         <w:t xml:space="preserve">Tabulka </w:t>
       </w:r>
-      <w:fldSimple w:instr=" SEQ Tabulka \* ARABIC ">
-        <w:r>
-          <w:t>4</w:t>
-        </w:r>
-      </w:fldSimple>
+      <w:r>
+        <w:fldChar w:fldCharType="begin"/>
+      </w:r>
+      <w:r>
+        <w:instrText xml:space="preserve"> SEQ Tabulka \* ARABIC </w:instrText>
+      </w:r>
+      <w:r>
+        <w:fldChar w:fldCharType="separate"/>
+      </w:r>
+      <w:r>
+        <w:t>4</w:t>
+      </w:r>
+      <w:r>
+        <w:fldChar w:fldCharType="end"/>
+      </w:r>
       <w:r>
         <w:t xml:space="preserve"> </w:t>
       </w:r>
@@ -11552,11 +11572,21 @@
       <w:r>
         <w:t xml:space="preserve">Tabulka </w:t>
       </w:r>
-      <w:fldSimple w:instr=" SEQ Tabulka \* ARABIC ">
-        <w:r>
-          <w:t>5</w:t>
-        </w:r>
-      </w:fldSimple>
+      <w:r>
+        <w:fldChar w:fldCharType="begin"/>
+      </w:r>
+      <w:r>
+        <w:instrText xml:space="preserve"> SEQ Tabulka \* ARABIC </w:instrText>
+      </w:r>
+      <w:r>
+        <w:fldChar w:fldCharType="separate"/>
+      </w:r>
+      <w:r>
+        <w:t>5</w:t>
+      </w:r>
+      <w:r>
+        <w:fldChar w:fldCharType="end"/>
+      </w:r>
       <w:r>
         <w:t xml:space="preserve"> </w:t>
       </w:r>
@@ -11603,19 +11633,7 @@
         <w:pStyle w:val="Pokraovn"/>
       </w:pPr>
       <w:r>
-        <w:t>Po popisu jednotlivých tabulek je pro lepší přehlednost vhodné zobrazit jejich vzájemné vztahy graficky. ER</w:t>
-      </w:r>
-      <w:r>
-        <w:t xml:space="preserve"> </w:t>
-      </w:r>
-      <w:r>
-        <w:t>diagram</w:t>
-      </w:r>
-      <w:r>
-        <w:t xml:space="preserve"> (</w:t>
-      </w:r>
-      <w:r>
-        <w:t>Entity</w:t>
+        <w:t>Po popisu jednotlivých tabulek je pro lepší přehlednost vhodné zobrazit jejich vzájemné vztahy graficky. ER diagram (Entity</w:t>
       </w:r>
       <w:r>
         <w:rPr>
@@ -11630,16 +11648,7 @@
       </w:r>
       <w:proofErr w:type="spellEnd"/>
       <w:r>
-        <w:t xml:space="preserve"> </w:t>
-      </w:r>
-      <w:r>
-        <w:t>diagram</w:t>
-      </w:r>
-      <w:r>
-        <w:t>)</w:t>
-      </w:r>
-      <w:r>
-        <w:t xml:space="preserve"> poskytuje vizuální znázornění struktury databáze a ukazuje, jak jsou jednotlivé tabulky propojeny pomocí primárních a cizích klíčů</w:t>
+        <w:t xml:space="preserve"> diagram) poskytuje vizuální znázornění struktury databáze a ukazuje, jak jsou jednotlivé tabulky propojeny pomocí primárních a cizích klíčů</w:t>
       </w:r>
       <w:r>
         <w:t>.</w:t>
@@ -11851,7 +11860,10 @@
         <w:t> </w:t>
       </w:r>
       <w:r>
-        <w:t>existující skupině pomocí cizího klíče </w:t>
+        <w:t>existující skupině pomocí cizího klíče</w:t>
+      </w:r>
+      <w:r>
+        <w:t xml:space="preserve"> </w:t>
       </w:r>
       <w:proofErr w:type="spellStart"/>
       <w:r>
@@ -11877,7 +11889,10 @@
         <w:pStyle w:val="Pokraovn"/>
       </w:pPr>
       <w:r>
-        <w:t>Sdílení hesel mezi uživateli je realizováno přes spojovací tabulku </w:t>
+        <w:t>Sdílení hesel mezi uživateli je realizováno přes spojovací tabulku</w:t>
+      </w:r>
+      <w:r>
+        <w:t xml:space="preserve"> </w:t>
       </w:r>
       <w:proofErr w:type="spellStart"/>
       <w:r>
@@ -11945,7 +11960,13 @@
         <w:pStyle w:val="Pokraovn"/>
       </w:pPr>
       <w:r>
-        <w:t xml:space="preserve">V rámci vývoje aplikace jsem </w:t>
+        <w:t>V</w:t>
+      </w:r>
+      <w:r>
+        <w:t xml:space="preserve"> </w:t>
+      </w:r>
+      <w:r>
+        <w:t xml:space="preserve">rámci vývoje aplikace jsem </w:t>
       </w:r>
       <w:r>
         <w:t>z</w:t>
@@ -11990,7 +12011,13 @@
         <w:pStyle w:val="Pokraovn"/>
       </w:pPr>
       <w:r>
-        <w:t xml:space="preserve">K připojování do databáze jsem musel nainstalovat </w:t>
+        <w:t>K</w:t>
+      </w:r>
+      <w:r>
+        <w:t xml:space="preserve"> </w:t>
+      </w:r>
+      <w:r>
+        <w:t xml:space="preserve">připojování do databáze jsem musel nainstalovat </w:t>
       </w:r>
       <w:proofErr w:type="spellStart"/>
       <w:r>
@@ -12023,7 +12050,13 @@
         <w:t>kové něco dělal poprvé.</w:t>
       </w:r>
       <w:r>
-        <w:t xml:space="preserve"> Pak jsem ho přidal na začátek formulářů, kde používám data z databáze </w:t>
+        <w:t xml:space="preserve"> Pak jsem ho přidal na začátek formulářů, kde používám data z</w:t>
+      </w:r>
+      <w:r>
+        <w:t xml:space="preserve"> </w:t>
+      </w:r>
+      <w:r>
+        <w:t xml:space="preserve">databáze </w:t>
       </w:r>
       <w:proofErr w:type="spellStart"/>
       <w:r>
@@ -12034,12 +12067,10 @@
         <w:t xml:space="preserve"> </w:t>
       </w:r>
       <w:proofErr w:type="spellStart"/>
-      <w:proofErr w:type="gramStart"/>
       <w:r>
         <w:t>MySql.Data.MySqlClient</w:t>
       </w:r>
       <w:proofErr w:type="spellEnd"/>
-      <w:proofErr w:type="gramEnd"/>
       <w:r>
         <w:t>.</w:t>
       </w:r>
@@ -12134,7 +12165,13 @@
       </w:r>
       <w:proofErr w:type="spellEnd"/>
       <w:r>
-        <w:t xml:space="preserve">, co je datový typ z balíčku </w:t>
+        <w:t>, co je datový typ z</w:t>
+      </w:r>
+      <w:r>
+        <w:t xml:space="preserve"> </w:t>
+      </w:r>
+      <w:r>
+        <w:t xml:space="preserve">balíčku </w:t>
       </w:r>
       <w:proofErr w:type="spellStart"/>
       <w:r>
@@ -12223,7 +12260,7 @@
         <w:t xml:space="preserve"> formuláře jsem použil kód pro propojení aplikaci s</w:t>
       </w:r>
       <w:r>
-        <w:t> </w:t>
+        <w:t xml:space="preserve"> </w:t>
       </w:r>
       <w:r>
         <w:t>databází</w:t>
@@ -12237,7 +12274,13 @@
       </w:r>
       <w:proofErr w:type="spellEnd"/>
       <w:r>
-        <w:t xml:space="preserve"> uloženou v konfiguračním souboru </w:t>
+        <w:t xml:space="preserve"> uloženou v</w:t>
+      </w:r>
+      <w:r>
+        <w:t xml:space="preserve"> </w:t>
+      </w:r>
+      <w:r>
+        <w:t xml:space="preserve">konfiguračním souboru </w:t>
       </w:r>
       <w:proofErr w:type="spellStart"/>
       <w:r>
@@ -12245,7 +12288,13 @@
       </w:r>
       <w:proofErr w:type="spellEnd"/>
       <w:r>
-        <w:t>. Pak jsem vytvořil spojení s databází.</w:t>
+        <w:t>. Pak jsem vytvořil spojení s</w:t>
+      </w:r>
+      <w:r>
+        <w:t xml:space="preserve"> </w:t>
+      </w:r>
+      <w:r>
+        <w:t>databází.</w:t>
       </w:r>
     </w:p>
     <w:p>
@@ -12292,7 +12341,13 @@
     </w:p>
     <w:p>
       <w:r>
-        <w:t xml:space="preserve">V konfiguračním souboru </w:t>
+        <w:t>V</w:t>
+      </w:r>
+      <w:r>
+        <w:t xml:space="preserve"> </w:t>
+      </w:r>
+      <w:r>
+        <w:t xml:space="preserve">konfiguračním souboru </w:t>
       </w:r>
       <w:proofErr w:type="spellStart"/>
       <w:r>
@@ -12300,7 +12355,13 @@
       </w:r>
       <w:proofErr w:type="spellEnd"/>
       <w:r>
-        <w:t xml:space="preserve"> jsou uložený klíčové parametry k připojení k databáze:</w:t>
+        <w:t xml:space="preserve"> jsou uložený klíčové parametry k</w:t>
+      </w:r>
+      <w:r>
+        <w:t xml:space="preserve"> </w:t>
+      </w:r>
+      <w:r>
+        <w:t>připojení k databáze:</w:t>
       </w:r>
     </w:p>
     <w:p>
@@ -12471,20 +12532,11 @@
     </w:p>
     <w:p>
       <w:r>
-        <w:t xml:space="preserve">Na </w:t>
-      </w:r>
-      <w:r>
-        <w:t xml:space="preserve">obrázku je ukázka souboru </w:t>
-      </w:r>
-      <w:proofErr w:type="spellStart"/>
-      <w:r>
-        <w:t>App</w:t>
-      </w:r>
-      <w:r>
-        <w:t>.</w:t>
-      </w:r>
-      <w:r>
-        <w:t>config</w:t>
+        <w:t xml:space="preserve">Na obrázku je ukázka souboru </w:t>
+      </w:r>
+      <w:proofErr w:type="spellStart"/>
+      <w:r>
+        <w:t>App.config</w:t>
       </w:r>
       <w:proofErr w:type="spellEnd"/>
       <w:r>
@@ -12575,7 +12627,10 @@
     </w:p>
     <w:p>
       <w:r>
-        <w:t>Následně otevřu připojení k databázi, které je inicializováno v konstruktoru formuláře </w:t>
+        <w:t>Následně otevřu připojení k databázi, které je inicializováno v konstruktoru formuláře</w:t>
+      </w:r>
+      <w:r>
+        <w:t xml:space="preserve"> </w:t>
       </w:r>
       <w:proofErr w:type="spellStart"/>
       <w:r>
@@ -12631,51 +12686,33 @@
     </w:p>
     <w:p>
       <w:r>
-        <w:t>Po úspěšném ověření unikátnosti uživatelského jména vygeneruji </w:t>
-      </w:r>
-      <w:r>
-        <w:t>náhodnou</w:t>
+        <w:t>Po úspěšném ověření unikátnosti uživatelského jména vygeneruji náhodnou</w:t>
       </w:r>
       <w:r>
         <w:t xml:space="preserve"> </w:t>
       </w:r>
       <w:r>
-        <w:t>sůl</w:t>
-      </w:r>
-      <w:r>
-        <w:t>. Jedná se o unikátní řadu bajtů pro odvození šifrovacího klíče z hlavního hesla. Tato sůl se ukládá do databáze a je unikátní pro každého uživatele. Pro generování používám vlastní metodu</w:t>
+        <w:t>sůl. Jedná se o unikátní řadu bajtů pro odvození šifrovacího klíče z hlavního hesla. Tato sůl se ukládá do databáze a je unikátní pro každého uživatele. Pro generování používám vlastní metodu</w:t>
       </w:r>
       <w:r>
         <w:t xml:space="preserve"> </w:t>
       </w:r>
       <w:proofErr w:type="spellStart"/>
-      <w:proofErr w:type="gramStart"/>
       <w:r>
         <w:t>GenerateRandomSalt</w:t>
       </w:r>
       <w:proofErr w:type="spellEnd"/>
       <w:r>
-        <w:t>(</w:t>
-      </w:r>
-      <w:proofErr w:type="gramEnd"/>
-      <w:r>
-        <w:t xml:space="preserve">), která využívá kryptograficky bezpečný generátor náhodných čísel </w:t>
-      </w:r>
-      <w:proofErr w:type="gramStart"/>
-      <w:r>
-        <w:t>z</w:t>
-      </w:r>
-      <w:proofErr w:type="gramEnd"/>
+        <w:t>(), která využívá kryptograficky bezpečný generátor náhodných čísel z</w:t>
+      </w:r>
       <w:r>
         <w:t xml:space="preserve"> </w:t>
       </w:r>
       <w:proofErr w:type="spellStart"/>
-      <w:proofErr w:type="gramStart"/>
       <w:r>
         <w:t>System.Security.Cryptography</w:t>
       </w:r>
       <w:proofErr w:type="spellEnd"/>
-      <w:proofErr w:type="gramEnd"/>
       <w:r>
         <w:t>.</w:t>
       </w:r>
@@ -12794,20 +12831,18 @@
     </w:p>
     <w:p>
       <w:r>
-        <w:t>Poté vytvořím INSERT dotaz pro vložení nového uživatele včetně jeho hashovaného hesla a soli. Po provedení dotazu ověřím počet ovlivněných řádků. Pokud byl uživatel úspěšně vytvořen (tj. </w:t>
-      </w:r>
-      <w:proofErr w:type="spellStart"/>
-      <w:proofErr w:type="gramStart"/>
+        <w:t>Poté vytvořím INSERT dotaz pro vložení nového uživatele včetně jeho hashovaného hesla a soli. Po provedení dotazu ověřím počet ovlivněných řádků. Pokud byl uživatel úspěšně vytvořen (tj.</w:t>
+      </w:r>
+      <w:r>
+        <w:t xml:space="preserve"> </w:t>
+      </w:r>
+      <w:proofErr w:type="spellStart"/>
       <w:r>
         <w:t>rowsAffected</w:t>
       </w:r>
       <w:proofErr w:type="spellEnd"/>
       <w:r>
-        <w:t xml:space="preserve"> &gt;</w:t>
-      </w:r>
-      <w:proofErr w:type="gramEnd"/>
-      <w:r>
-        <w:t xml:space="preserve"> 0), zobrazím potvrzovací zprávu, přesměruji </w:t>
+        <w:t xml:space="preserve"> &gt; 0), zobrazím potvrzovací zprávu, přesměruji </w:t>
       </w:r>
       <w:r>
         <w:lastRenderedPageBreak/>
@@ -12856,8 +12891,16 @@
     </w:p>
     <w:p>
       <w:r>
-        <w:t>Pro úspěšné odeslání formuláře je nutné splnit požadavky na silné heslo: minimálně 12 znaků, alespoň 1 velké písmeno, 1 speciální znak a 1 číslice. Dále je nutné správně vyplnit textovou CAPTCHA, která ověřuje, že registrující se subjekt je skutečný člověk. Validace hesla probíhá dynamicky při každé změně v textovém poli – při splnění konkrétní podmínky se příslušný indikátor (Label) zabarví zeleně, jinak zůstává červený. Pro dokončení registrace musí být všechny čtyři indikátory hesla zelené a CAPTCHA musí být vyplněna správně.</w:t>
-      </w:r>
+        <w:t>Pro úspěšné odeslání formuláře je nutné splnit požadavky na silné heslo: minimálně 12 znaků, alespoň 1 velké písmeno, 1 speciální znak a 1 číslice. Dále je nutné správně vyplnit textovou</w:t>
+      </w:r>
+      <w:r>
+        <w:t xml:space="preserve"> </w:t>
+      </w:r>
+      <w:r>
+        <w:t>CAPTCHA, která ověřuje, že registrující se subjekt je skutečný člověk. Validace hesla probíhá dynamicky při každé změně v textovém poli – při splnění konkrétní podmínky se příslušný indikátor (Label) zabarví zeleně, jinak zůstává červený. Pro dokončení registrace musí být všechny čtyři indikátory hesla zelené a CAPTCHA musí být vyplněna správně.</w:t>
+      </w:r>
+    </w:p>
+    <w:p>
       <w:r>
         <w:rPr>
           <w:noProof/>
@@ -12928,7 +12971,13 @@
         <w:pStyle w:val="Pokraovn"/>
       </w:pPr>
       <w:r>
-        <w:t xml:space="preserve">Formulář s CAPTCHA ověřením je nutné vyplnit při registraci nového uživatele. V tomto </w:t>
+        <w:t>Formulář s</w:t>
+      </w:r>
+      <w:r>
+        <w:t xml:space="preserve"> </w:t>
+      </w:r>
+      <w:r>
+        <w:t xml:space="preserve">CAPTCHA ověřením je nutné vyplnit při registraci nového uživatele. V tomto </w:t>
       </w:r>
       <w:r>
         <w:t>kóde</w:t>
@@ -12965,7 +13014,13 @@
         <w:t>er</w:t>
       </w:r>
       <w:r>
-        <w:t xml:space="preserve">ů z tohoto </w:t>
+        <w:t>ů z</w:t>
+      </w:r>
+      <w:r>
+        <w:t xml:space="preserve"> </w:t>
+      </w:r>
+      <w:r>
+        <w:t xml:space="preserve">tohoto </w:t>
       </w:r>
       <w:proofErr w:type="spellStart"/>
       <w:r>
@@ -13093,7 +13148,10 @@
         <w:t xml:space="preserve"> aby nebyl na první pohled čitelný.</w:t>
       </w:r>
       <w:r>
-        <w:t xml:space="preserve"> Začal jsem určením polohy znaku a jeho náklonem. Pak jsem vygeneroval náhodnou barvu. Nakonec jsem vykreslil znak do bitmapy a obnovil transformační matici, aby se další znak kreslil znovu od výchozí pozice. Tento proces jsem zopakoval pro všech 6 znaků CAPTCHA kódu. Nakonec jsem výsledný obrázek přiřadil do </w:t>
+        <w:t xml:space="preserve"> Začal jsem určením polohy znaku a jeho náklonem. Pak jsem vygeneroval náhodnou barvu. Nakonec jsem vykreslil znak do bitmapy a obnovil transformační matici, aby se další znak kreslil znovu od výchozí pozice. Tento proces jsem zopakoval pro všech 6 znaků CAPTCHA kódu. Nakonec jsem výsledný obrázek přiřadil do</w:t>
+      </w:r>
+      <w:r>
+        <w:t xml:space="preserve"> </w:t>
       </w:r>
       <w:proofErr w:type="spellStart"/>
       <w:r>
@@ -13164,50 +13222,198 @@
     </w:p>
     <w:p>
       <w:pPr>
+        <w:pStyle w:val="Normlnweb"/>
+        <w:spacing w:line="360" w:lineRule="auto"/>
+        <w:jc w:val="both"/>
+        <w:rPr>
+          <w:color w:val="000000"/>
+          <w:szCs w:val="20"/>
+          <w:lang w:val="cs-CZ" w:eastAsia="cs-CZ"/>
+        </w:rPr>
+      </w:pPr>
+      <w:bookmarkStart w:id="70" w:name="_Toc220153200"/>
+      <w:r>
+        <w:rPr>
+          <w:color w:val="000000"/>
+          <w:szCs w:val="20"/>
+          <w:lang w:val="cs-CZ" w:eastAsia="cs-CZ"/>
+        </w:rPr>
+        <w:t xml:space="preserve">Přihlášení uživatele do aplikace je realizováno na formuláři </w:t>
+      </w:r>
+      <w:proofErr w:type="spellStart"/>
+      <w:r>
+        <w:rPr>
+          <w:color w:val="000000"/>
+          <w:szCs w:val="20"/>
+          <w:lang w:val="cs-CZ" w:eastAsia="cs-CZ"/>
+        </w:rPr>
+        <w:t>Main</w:t>
+      </w:r>
+      <w:r>
+        <w:rPr>
+          <w:b/>
+          <w:bCs/>
+          <w:color w:val="000000"/>
+          <w:szCs w:val="20"/>
+          <w:lang w:val="cs-CZ" w:eastAsia="cs-CZ"/>
+        </w:rPr>
+        <w:t>.</w:t>
+      </w:r>
+      <w:r>
+        <w:rPr>
+          <w:color w:val="000000"/>
+          <w:szCs w:val="20"/>
+          <w:lang w:val="cs-CZ" w:eastAsia="cs-CZ"/>
+        </w:rPr>
+        <w:t>cs</w:t>
+      </w:r>
+      <w:proofErr w:type="spellEnd"/>
+      <w:r>
+        <w:rPr>
+          <w:color w:val="000000"/>
+          <w:szCs w:val="20"/>
+          <w:lang w:val="cs-CZ" w:eastAsia="cs-CZ"/>
+        </w:rPr>
+        <w:t xml:space="preserve">, kde se zároveň nachází i registrace nového uživatele. Tato funkce je navázána na tlačítko button1. Na začátku se z textových polí textbox1 a textbox2 uloží zadané údaje do proměnných user a </w:t>
+      </w:r>
+      <w:proofErr w:type="spellStart"/>
+      <w:r>
+        <w:rPr>
+          <w:color w:val="000000"/>
+          <w:szCs w:val="20"/>
+          <w:lang w:val="cs-CZ" w:eastAsia="cs-CZ"/>
+        </w:rPr>
+        <w:t>pass</w:t>
+      </w:r>
+      <w:proofErr w:type="spellEnd"/>
+      <w:r>
+        <w:rPr>
+          <w:color w:val="000000"/>
+          <w:szCs w:val="20"/>
+          <w:lang w:val="cs-CZ" w:eastAsia="cs-CZ"/>
+        </w:rPr>
+        <w:t xml:space="preserve">, které se následně porovnávají s daty uloženými v databázi. Z databáze se pomocí SQL dotazu SELECT vyhledá uživatel se zadaným uživatelským jménem. Pokud </w:t>
+      </w:r>
+      <w:proofErr w:type="spellStart"/>
+      <w:r>
+        <w:rPr>
+          <w:color w:val="000000"/>
+          <w:lang w:val="cs-CZ" w:eastAsia="cs-CZ"/>
+        </w:rPr>
+        <w:t>reader</w:t>
+      </w:r>
+      <w:proofErr w:type="spellEnd"/>
+      <w:r>
+        <w:rPr>
+          <w:color w:val="000000"/>
+          <w:szCs w:val="20"/>
+          <w:lang w:val="cs-CZ" w:eastAsia="cs-CZ"/>
+        </w:rPr>
+        <w:t xml:space="preserve"> nevrátí žádný záznam, znamená to, že účet s daným uživatelským jménem v databázi neexistuje, a zobrazí se chybová zpráva. Pokud je účet nalezen, pokračuje se dalším krokem – ověřením hesla. Heslo je v databázi uloženo v hashované podobě, proto se pro jeho ověření používá metoda </w:t>
+      </w:r>
+      <w:proofErr w:type="spellStart"/>
+      <w:r>
+        <w:rPr>
+          <w:color w:val="000000"/>
+          <w:szCs w:val="20"/>
+          <w:lang w:val="cs-CZ" w:eastAsia="cs-CZ"/>
+        </w:rPr>
+        <w:t>EnhancedVerify</w:t>
+      </w:r>
+      <w:proofErr w:type="spellEnd"/>
+      <w:r>
+        <w:rPr>
+          <w:color w:val="000000"/>
+          <w:szCs w:val="20"/>
+          <w:lang w:val="cs-CZ" w:eastAsia="cs-CZ"/>
+        </w:rPr>
+        <w:t xml:space="preserve"> z třídy </w:t>
+      </w:r>
+      <w:proofErr w:type="spellStart"/>
+      <w:r>
+        <w:rPr>
+          <w:color w:val="000000"/>
+          <w:szCs w:val="20"/>
+          <w:lang w:val="cs-CZ" w:eastAsia="cs-CZ"/>
+        </w:rPr>
+        <w:t>BCrypt</w:t>
+      </w:r>
+      <w:proofErr w:type="spellEnd"/>
+      <w:r>
+        <w:rPr>
+          <w:color w:val="000000"/>
+          <w:szCs w:val="20"/>
+          <w:lang w:val="cs-CZ" w:eastAsia="cs-CZ"/>
+        </w:rPr>
+        <w:t xml:space="preserve">. V případě, že se zadané heslo s uloženým </w:t>
+      </w:r>
+      <w:proofErr w:type="spellStart"/>
+      <w:r>
+        <w:rPr>
+          <w:color w:val="000000"/>
+          <w:szCs w:val="20"/>
+          <w:lang w:val="cs-CZ" w:eastAsia="cs-CZ"/>
+        </w:rPr>
+        <w:t>hashem</w:t>
+      </w:r>
+      <w:proofErr w:type="spellEnd"/>
+      <w:r>
+        <w:rPr>
+          <w:color w:val="000000"/>
+          <w:szCs w:val="20"/>
+          <w:lang w:val="cs-CZ" w:eastAsia="cs-CZ"/>
+        </w:rPr>
+        <w:t xml:space="preserve"> neshoduje, zobrazí se chybová zpráva. Pokud se heslo s </w:t>
+      </w:r>
+      <w:proofErr w:type="spellStart"/>
+      <w:r>
+        <w:rPr>
+          <w:color w:val="000000"/>
+          <w:szCs w:val="20"/>
+          <w:lang w:val="cs-CZ" w:eastAsia="cs-CZ"/>
+        </w:rPr>
+        <w:t>hashem</w:t>
+      </w:r>
+      <w:proofErr w:type="spellEnd"/>
+      <w:r>
+        <w:rPr>
+          <w:color w:val="000000"/>
+          <w:szCs w:val="20"/>
+          <w:lang w:val="cs-CZ" w:eastAsia="cs-CZ"/>
+        </w:rPr>
+        <w:t xml:space="preserve"> shoduje, uživatel je úspěšně přihlášen a je přesměrován na hlavní formulář, kde se načtou jeho uložená hesla.</w:t>
+      </w:r>
+    </w:p>
+    <w:p>
+      <w:pPr>
+        <w:pStyle w:val="Nadpis3"/>
+      </w:pPr>
+      <w:r>
+        <w:t xml:space="preserve">Zobrazení </w:t>
+      </w:r>
+      <w:r>
+        <w:t>hesel</w:t>
+      </w:r>
+      <w:bookmarkEnd w:id="70"/>
+    </w:p>
+    <w:p>
+      <w:pPr>
         <w:pStyle w:val="Pokraovn"/>
       </w:pPr>
       <w:r>
-        <w:t xml:space="preserve">Přihlášení uživatele do aplikace se nachází na formuláři </w:t>
-      </w:r>
-      <w:proofErr w:type="spellStart"/>
-      <w:r>
-        <w:t>main.cs</w:t>
-      </w:r>
-      <w:proofErr w:type="spellEnd"/>
-      <w:r>
-        <w:t xml:space="preserve">, kde je i registrace pro uživatele. Tato funkce je nastavena na tlačítku button1. Na začátku si z textových polí textbox1 a textbox2 si uložím </w:t>
-      </w:r>
-      <w:r>
-        <w:t xml:space="preserve">data do proměnných user a </w:t>
-      </w:r>
-      <w:proofErr w:type="spellStart"/>
-      <w:r>
-        <w:t>pass</w:t>
-      </w:r>
-      <w:proofErr w:type="spellEnd"/>
-      <w:r>
-        <w:t xml:space="preserve">, které pak následně budu porovnávat s daty z databáze. Data z databáze s pomocí dotazu SELECT s podmínkou stejného uživatelského jména, když </w:t>
-      </w:r>
-      <w:proofErr w:type="spellStart"/>
-      <w:r>
-        <w:t>reader</w:t>
-      </w:r>
-      <w:proofErr w:type="spellEnd"/>
-      <w:r>
-        <w:t xml:space="preserve"> nic nezachytí znamená to, že se v databází nenachází účet s tímto uživatelským jménem a vy</w:t>
-      </w:r>
-      <w:r>
-        <w:t>volá</w:t>
-      </w:r>
-      <w:r>
-        <w:t xml:space="preserve"> se chybová správa.</w:t>
-      </w:r>
-      <w:r>
-        <w:t xml:space="preserve"> Jestli se takový účet najde v databáze pokračuje se na další krok s ověřením hesla. Heslo se do databázi ukládá za hashované tak se na jeho porovnání použije metoda z třídy </w:t>
-      </w:r>
-      <w:proofErr w:type="spellStart"/>
-      <w:r>
-        <w:t>BCrypt</w:t>
+        <w:t xml:space="preserve">Zobrazení hesle se nachází na formuláři </w:t>
+      </w:r>
+      <w:proofErr w:type="spellStart"/>
+      <w:r>
+        <w:t>Credentials.cs</w:t>
+      </w:r>
+      <w:proofErr w:type="spellEnd"/>
+      <w:r>
+        <w:t xml:space="preserve">, </w:t>
+      </w:r>
+      <w:proofErr w:type="spellStart"/>
+      <w:r>
+        <w:t>kerý</w:t>
       </w:r>
       <w:proofErr w:type="spellEnd"/>
       <w:r>
@@ -13215,79 +13421,833 @@
       </w:r>
       <w:proofErr w:type="spellStart"/>
       <w:r>
-        <w:t>EnhacedVerify</w:t>
-      </w:r>
-      <w:proofErr w:type="spellEnd"/>
-      <w:r>
-        <w:t>. V případě že se heslo s </w:t>
-      </w:r>
-      <w:proofErr w:type="spellStart"/>
-      <w:r>
-        <w:t>hashem</w:t>
-      </w:r>
-      <w:proofErr w:type="spellEnd"/>
-      <w:r>
-        <w:t xml:space="preserve"> neshoduje vyvolá se chybová správa, naopak, když se heslo s </w:t>
-      </w:r>
-      <w:proofErr w:type="spellStart"/>
-      <w:r>
-        <w:t>hashem</w:t>
-      </w:r>
-      <w:proofErr w:type="spellEnd"/>
-      <w:r>
-        <w:t xml:space="preserve"> bude shodovat tak se přiradí heslo</w:t>
-      </w:r>
-      <w:r>
-        <w:t xml:space="preserve"> tak se uživatel vpusti na hlavní formulář s jeho uloženýma </w:t>
-      </w:r>
-      <w:proofErr w:type="spellStart"/>
-      <w:r>
-        <w:t>heslama</w:t>
-      </w:r>
-      <w:proofErr w:type="spellEnd"/>
+        <w:t>působý</w:t>
+      </w:r>
+      <w:proofErr w:type="spellEnd"/>
+      <w:r>
+        <w:t xml:space="preserve"> jako takové hlavní okno. Pro zobrazení uložených dat přihlášeného uživatele jsem zvolil komponentu </w:t>
+      </w:r>
+      <w:proofErr w:type="spellStart"/>
+      <w:r>
+        <w:t>datagridview</w:t>
+      </w:r>
+      <w:proofErr w:type="spellEnd"/>
+      <w:r>
+        <w:t xml:space="preserve">, která mi přišla </w:t>
+      </w:r>
+      <w:r>
+        <w:t>ideální pro toto využití.</w:t>
+      </w:r>
+    </w:p>
+    <w:p>
+      <w:r>
+        <w:rPr>
+          <w:noProof/>
+        </w:rPr>
+        <w:lastRenderedPageBreak/>
+        <w:drawing>
+          <wp:inline distT="0" distB="0" distL="0" distR="0" wp14:anchorId="3EB0375C" wp14:editId="50FD3A57">
+            <wp:extent cx="5219700" cy="3104515"/>
+            <wp:effectExtent l="0" t="0" r="0" b="635"/>
+            <wp:docPr id="606325904" name="Obrázek 1"/>
+            <wp:cNvGraphicFramePr>
+              <a:graphicFrameLocks xmlns:a="http://schemas.openxmlformats.org/drawingml/2006/main" noChangeAspect="1"/>
+            </wp:cNvGraphicFramePr>
+            <a:graphic xmlns:a="http://schemas.openxmlformats.org/drawingml/2006/main">
+              <a:graphicData uri="http://schemas.openxmlformats.org/drawingml/2006/picture">
+                <pic:pic xmlns:pic="http://schemas.openxmlformats.org/drawingml/2006/picture">
+                  <pic:nvPicPr>
+                    <pic:cNvPr id="606325904" name=""/>
+                    <pic:cNvPicPr/>
+                  </pic:nvPicPr>
+                  <pic:blipFill>
+                    <a:blip r:embed="rId24"/>
+                    <a:stretch>
+                      <a:fillRect/>
+                    </a:stretch>
+                  </pic:blipFill>
+                  <pic:spPr>
+                    <a:xfrm>
+                      <a:off x="0" y="0"/>
+                      <a:ext cx="5219700" cy="3104515"/>
+                    </a:xfrm>
+                    <a:prstGeom prst="rect">
+                      <a:avLst/>
+                    </a:prstGeom>
+                  </pic:spPr>
+                </pic:pic>
+              </a:graphicData>
+            </a:graphic>
+          </wp:inline>
+        </w:drawing>
+      </w:r>
+    </w:p>
+    <w:p>
+      <w:r>
+        <w:t>V</w:t>
+      </w:r>
+      <w:r>
+        <w:t xml:space="preserve"> </w:t>
+      </w:r>
+      <w:proofErr w:type="spellStart"/>
+      <w:r>
+        <w:t>datagridview</w:t>
+      </w:r>
+      <w:proofErr w:type="spellEnd"/>
+      <w:r>
+        <w:t xml:space="preserve"> jsou zobrazeny údaje k přihlášení do různých webovek nebo aplikacích, jako uživatelské jméno, heslo, které je zakryté tečkami, a dá se odhalit až po kliknutí na ně. Pak dále je tam </w:t>
+      </w:r>
+      <w:proofErr w:type="spellStart"/>
+      <w:r>
+        <w:t>url</w:t>
+      </w:r>
+      <w:proofErr w:type="spellEnd"/>
+      <w:r>
+        <w:t xml:space="preserve"> webové stránky nebo název aplikace a jméno skupiny, do které </w:t>
+      </w:r>
+      <w:r>
+        <w:t>si uživatel přidal tyto údaje.</w:t>
+      </w:r>
+    </w:p>
+    <w:p>
+      <w:r>
+        <w:t xml:space="preserve">Dále se na formuláři </w:t>
+      </w:r>
+      <w:proofErr w:type="spellStart"/>
+      <w:r>
+        <w:t>Credentials.cs</w:t>
+      </w:r>
+      <w:proofErr w:type="spellEnd"/>
+      <w:r>
+        <w:t xml:space="preserve"> nachází tlačítko pro přidávání nových přihlašovacích údajů do </w:t>
+      </w:r>
+      <w:proofErr w:type="spellStart"/>
+      <w:r>
+        <w:t>datagridview</w:t>
+      </w:r>
+      <w:proofErr w:type="spellEnd"/>
+      <w:r>
+        <w:t xml:space="preserve"> a do databáze.</w:t>
+      </w:r>
+      <w:r>
+        <w:t xml:space="preserve"> Toto tlačítko otevře nový formulář </w:t>
+      </w:r>
+      <w:proofErr w:type="spellStart"/>
+      <w:r>
+        <w:t>Credentials_add.cs</w:t>
+      </w:r>
+      <w:proofErr w:type="spellEnd"/>
+      <w:r>
+        <w:t>, který slouží pro tvorbu nových přihlašovacích údajů.</w:t>
+      </w:r>
+    </w:p>
+    <w:p>
+      <w:r>
+        <w:rPr>
+          <w:noProof/>
+        </w:rPr>
+        <w:drawing>
+          <wp:inline distT="0" distB="0" distL="0" distR="0" wp14:anchorId="2F11496E" wp14:editId="7C958B67">
+            <wp:extent cx="4143953" cy="1514686"/>
+            <wp:effectExtent l="0" t="0" r="9525" b="9525"/>
+            <wp:docPr id="233959466" name="Obrázek 1" descr="Obsah obrázku text, snímek obrazovky, Písmo, software&#10;&#10;Obsah generovaný pomocí AI může být nesprávný."/>
+            <wp:cNvGraphicFramePr>
+              <a:graphicFrameLocks xmlns:a="http://schemas.openxmlformats.org/drawingml/2006/main" noChangeAspect="1"/>
+            </wp:cNvGraphicFramePr>
+            <a:graphic xmlns:a="http://schemas.openxmlformats.org/drawingml/2006/main">
+              <a:graphicData uri="http://schemas.openxmlformats.org/drawingml/2006/picture">
+                <pic:pic xmlns:pic="http://schemas.openxmlformats.org/drawingml/2006/picture">
+                  <pic:nvPicPr>
+                    <pic:cNvPr id="233959466" name="Obrázek 1" descr="Obsah obrázku text, snímek obrazovky, Písmo, software&#10;&#10;Obsah generovaný pomocí AI může být nesprávný."/>
+                    <pic:cNvPicPr/>
+                  </pic:nvPicPr>
+                  <pic:blipFill>
+                    <a:blip r:embed="rId25"/>
+                    <a:stretch>
+                      <a:fillRect/>
+                    </a:stretch>
+                  </pic:blipFill>
+                  <pic:spPr>
+                    <a:xfrm>
+                      <a:off x="0" y="0"/>
+                      <a:ext cx="4143953" cy="1514686"/>
+                    </a:xfrm>
+                    <a:prstGeom prst="rect">
+                      <a:avLst/>
+                    </a:prstGeom>
+                  </pic:spPr>
+                </pic:pic>
+              </a:graphicData>
+            </a:graphic>
+          </wp:inline>
+        </w:drawing>
+      </w:r>
+    </w:p>
+    <w:p>
+      <w:r>
+        <w:t xml:space="preserve">Na formuláři se nacházejí tři </w:t>
+      </w:r>
+      <w:proofErr w:type="spellStart"/>
+      <w:r>
+        <w:t>textboxi</w:t>
+      </w:r>
+      <w:proofErr w:type="spellEnd"/>
+      <w:r>
+        <w:t xml:space="preserve"> pro vložení uživatelského jména, hesla a názvu aplikace nebo </w:t>
+      </w:r>
+      <w:proofErr w:type="spellStart"/>
+      <w:r>
+        <w:t>url</w:t>
+      </w:r>
+      <w:proofErr w:type="spellEnd"/>
+      <w:r>
+        <w:t xml:space="preserve"> web stránky. Dále se na formuláři nachází tlačítko pro uložení. Po zmáčknutí tlačítka pro uložení se nejdřív zkontrolují textová pole, jestli </w:t>
+      </w:r>
+      <w:r>
+        <w:t>obsahuji</w:t>
+      </w:r>
+      <w:r>
+        <w:t xml:space="preserve"> nějakou </w:t>
+      </w:r>
+      <w:r>
+        <w:t>hodnotu</w:t>
+      </w:r>
       <w:r>
         <w:t>.</w:t>
       </w:r>
+      <w:r>
+        <w:t xml:space="preserve"> </w:t>
+      </w:r>
+    </w:p>
+    <w:p>
+      <w:r>
+        <w:rPr>
+          <w:noProof/>
+        </w:rPr>
+        <w:lastRenderedPageBreak/>
+        <w:drawing>
+          <wp:inline distT="0" distB="0" distL="0" distR="0" wp14:anchorId="51DF98D1" wp14:editId="02A9B03D">
+            <wp:extent cx="5219700" cy="2992120"/>
+            <wp:effectExtent l="0" t="0" r="0" b="0"/>
+            <wp:docPr id="697208188" name="Obrázek 1" descr="Obsah obrázku text, snímek obrazovky&#10;&#10;Obsah generovaný pomocí AI může být nesprávný."/>
+            <wp:cNvGraphicFramePr>
+              <a:graphicFrameLocks xmlns:a="http://schemas.openxmlformats.org/drawingml/2006/main" noChangeAspect="1"/>
+            </wp:cNvGraphicFramePr>
+            <a:graphic xmlns:a="http://schemas.openxmlformats.org/drawingml/2006/main">
+              <a:graphicData uri="http://schemas.openxmlformats.org/drawingml/2006/picture">
+                <pic:pic xmlns:pic="http://schemas.openxmlformats.org/drawingml/2006/picture">
+                  <pic:nvPicPr>
+                    <pic:cNvPr id="697208188" name="Obrázek 1" descr="Obsah obrázku text, snímek obrazovky&#10;&#10;Obsah generovaný pomocí AI může být nesprávný."/>
+                    <pic:cNvPicPr/>
+                  </pic:nvPicPr>
+                  <pic:blipFill>
+                    <a:blip r:embed="rId26"/>
+                    <a:stretch>
+                      <a:fillRect/>
+                    </a:stretch>
+                  </pic:blipFill>
+                  <pic:spPr>
+                    <a:xfrm>
+                      <a:off x="0" y="0"/>
+                      <a:ext cx="5219700" cy="2992120"/>
+                    </a:xfrm>
+                    <a:prstGeom prst="rect">
+                      <a:avLst/>
+                    </a:prstGeom>
+                  </pic:spPr>
+                </pic:pic>
+              </a:graphicData>
+            </a:graphic>
+          </wp:inline>
+        </w:drawing>
+      </w:r>
+    </w:p>
+    <w:p>
+      <w:pPr>
+        <w:rPr>
+          <w:noProof/>
+        </w:rPr>
+      </w:pPr>
+      <w:r>
+        <w:t>Potom se v</w:t>
+      </w:r>
+      <w:r>
+        <w:rPr>
+          <w:noProof/>
+        </w:rPr>
+        <w:t xml:space="preserve"> kódu jsou deklarovány dvě proměnné: masterPassword (řetězec) a userSalt (pole bajtů), které jsou nastaveny na výchozí hodnotu null. Následuje blok try, ve kterém se nejprve získají přihlašovací údaje. Do proměnné masterPassword se načte hlavní heslo pomocí metody SecurePasswordManager.GetMasterPasswordAsString() a do proměnné userSalt se načte sůl uživatele z vlastnosti SecurePasswordManager.UserSalt.</w:t>
+      </w:r>
+      <w:r>
+        <w:rPr>
+          <w:noProof/>
+        </w:rPr>
+        <w:drawing>
+          <wp:inline distT="0" distB="0" distL="0" distR="0" wp14:anchorId="6D383939" wp14:editId="69FE75E9">
+            <wp:extent cx="5077534" cy="1143160"/>
+            <wp:effectExtent l="0" t="0" r="0" b="0"/>
+            <wp:docPr id="1132003600" name="Obrázek 1" descr="Obsah obrázku text, snímek obrazovky, Písmo, řada/pruh&#10;&#10;Obsah generovaný pomocí AI může být nesprávný."/>
+            <wp:cNvGraphicFramePr>
+              <a:graphicFrameLocks xmlns:a="http://schemas.openxmlformats.org/drawingml/2006/main" noChangeAspect="1"/>
+            </wp:cNvGraphicFramePr>
+            <a:graphic xmlns:a="http://schemas.openxmlformats.org/drawingml/2006/main">
+              <a:graphicData uri="http://schemas.openxmlformats.org/drawingml/2006/picture">
+                <pic:pic xmlns:pic="http://schemas.openxmlformats.org/drawingml/2006/picture">
+                  <pic:nvPicPr>
+                    <pic:cNvPr id="1132003600" name="Obrázek 1" descr="Obsah obrázku text, snímek obrazovky, Písmo, řada/pruh&#10;&#10;Obsah generovaný pomocí AI může být nesprávný."/>
+                    <pic:cNvPicPr/>
+                  </pic:nvPicPr>
+                  <pic:blipFill>
+                    <a:blip r:embed="rId27"/>
+                    <a:stretch>
+                      <a:fillRect/>
+                    </a:stretch>
+                  </pic:blipFill>
+                  <pic:spPr>
+                    <a:xfrm>
+                      <a:off x="0" y="0"/>
+                      <a:ext cx="5077534" cy="1143160"/>
+                    </a:xfrm>
+                    <a:prstGeom prst="rect">
+                      <a:avLst/>
+                    </a:prstGeom>
+                  </pic:spPr>
+                </pic:pic>
+              </a:graphicData>
+            </a:graphic>
+          </wp:inline>
+        </w:drawing>
+      </w:r>
+    </w:p>
+    <w:p>
+      <w:pPr>
+        <w:rPr>
+          <w:noProof/>
+        </w:rPr>
+      </w:pPr>
+      <w:r>
+        <w:rPr>
+          <w:noProof/>
+        </w:rPr>
+        <w:t>Poté se provede kontrola, zda je hlavní heslo prázdné nebo null, nebo zda je sůl uživatele null. Pokud je některá z těchto podmínek splněna, zobrazí se chybové okno.</w:t>
+      </w:r>
+    </w:p>
+    <w:p>
+      <w:pPr>
+        <w:rPr>
+          <w:noProof/>
+        </w:rPr>
+      </w:pPr>
+      <w:r>
+        <w:rPr>
+          <w:noProof/>
+        </w:rPr>
+        <w:drawing>
+          <wp:inline distT="0" distB="0" distL="0" distR="0" wp14:anchorId="34B85864" wp14:editId="4BE43DAC">
+            <wp:extent cx="5219700" cy="666115"/>
+            <wp:effectExtent l="0" t="0" r="0" b="635"/>
+            <wp:docPr id="1947299" name="Obrázek 1" descr="Obsah obrázku snímek obrazovky, text, řada/pruh&#10;&#10;Obsah generovaný pomocí AI může být nesprávný."/>
+            <wp:cNvGraphicFramePr>
+              <a:graphicFrameLocks xmlns:a="http://schemas.openxmlformats.org/drawingml/2006/main" noChangeAspect="1"/>
+            </wp:cNvGraphicFramePr>
+            <a:graphic xmlns:a="http://schemas.openxmlformats.org/drawingml/2006/main">
+              <a:graphicData uri="http://schemas.openxmlformats.org/drawingml/2006/picture">
+                <pic:pic xmlns:pic="http://schemas.openxmlformats.org/drawingml/2006/picture">
+                  <pic:nvPicPr>
+                    <pic:cNvPr id="1947299" name="Obrázek 1" descr="Obsah obrázku snímek obrazovky, text, řada/pruh&#10;&#10;Obsah generovaný pomocí AI může být nesprávný."/>
+                    <pic:cNvPicPr/>
+                  </pic:nvPicPr>
+                  <pic:blipFill>
+                    <a:blip r:embed="rId28"/>
+                    <a:stretch>
+                      <a:fillRect/>
+                    </a:stretch>
+                  </pic:blipFill>
+                  <pic:spPr>
+                    <a:xfrm>
+                      <a:off x="0" y="0"/>
+                      <a:ext cx="5219700" cy="666115"/>
+                    </a:xfrm>
+                    <a:prstGeom prst="rect">
+                      <a:avLst/>
+                    </a:prstGeom>
+                  </pic:spPr>
+                </pic:pic>
+              </a:graphicData>
+            </a:graphic>
+          </wp:inline>
+        </w:drawing>
+      </w:r>
+    </w:p>
+    <w:p>
+      <w:pPr>
+        <w:rPr>
+          <w:noProof/>
+        </w:rPr>
+      </w:pPr>
+      <w:r>
+        <w:rPr>
+          <w:noProof/>
+        </w:rPr>
+        <w:t xml:space="preserve">Pokud jsou přihlašovací údaje v pořádku, pokračuje se vytvořením šifrovacího klíče. Pomocí metody SecureEncryptor.DeriveKeyFromPassword se z hlavního hesla a soli uživatele odvodí šifrovací klíč, který se uloží do proměnné key. Následně se metodou SecureEncryptor.GenerateRandomIV() vygeneruje náhodný inicializační vektor a </w:t>
+      </w:r>
+      <w:r>
+        <w:rPr>
+          <w:noProof/>
+        </w:rPr>
+        <w:lastRenderedPageBreak/>
+        <w:t>uloží se do proměnné iv. Nakonec se provede samotné šifrování – metodě SecureEncryptor.Encrypt se předá heslo určené k zašifrování, vytvořený klíč a inicializační vektor, a výsledná zašifrovaná data se uloží do proměnné encryptedBytes.</w:t>
+      </w:r>
+    </w:p>
+    <w:p>
+      <w:r>
+        <w:rPr>
+          <w:noProof/>
+        </w:rPr>
+        <w:drawing>
+          <wp:inline distT="0" distB="0" distL="0" distR="0" wp14:anchorId="7F4F0DB1" wp14:editId="14006B3F">
+            <wp:extent cx="5219700" cy="481965"/>
+            <wp:effectExtent l="0" t="0" r="0" b="0"/>
+            <wp:docPr id="1537838877" name="Obrázek 1"/>
+            <wp:cNvGraphicFramePr>
+              <a:graphicFrameLocks xmlns:a="http://schemas.openxmlformats.org/drawingml/2006/main" noChangeAspect="1"/>
+            </wp:cNvGraphicFramePr>
+            <a:graphic xmlns:a="http://schemas.openxmlformats.org/drawingml/2006/main">
+              <a:graphicData uri="http://schemas.openxmlformats.org/drawingml/2006/picture">
+                <pic:pic xmlns:pic="http://schemas.openxmlformats.org/drawingml/2006/picture">
+                  <pic:nvPicPr>
+                    <pic:cNvPr id="1537838877" name=""/>
+                    <pic:cNvPicPr/>
+                  </pic:nvPicPr>
+                  <pic:blipFill>
+                    <a:blip r:embed="rId29"/>
+                    <a:stretch>
+                      <a:fillRect/>
+                    </a:stretch>
+                  </pic:blipFill>
+                  <pic:spPr>
+                    <a:xfrm>
+                      <a:off x="0" y="0"/>
+                      <a:ext cx="5219700" cy="481965"/>
+                    </a:xfrm>
+                    <a:prstGeom prst="rect">
+                      <a:avLst/>
+                    </a:prstGeom>
+                  </pic:spPr>
+                </pic:pic>
+              </a:graphicData>
+            </a:graphic>
+          </wp:inline>
+        </w:drawing>
+      </w:r>
+    </w:p>
+    <w:p>
+      <w:r>
+        <w:t xml:space="preserve">Po úspěšném zašifrování hesla následuje uložení všech údajů do databáze. Nejprve se otevře databázové připojení pomocí metody </w:t>
+      </w:r>
+      <w:proofErr w:type="spellStart"/>
+      <w:r>
+        <w:t>conn.Open</w:t>
+      </w:r>
+      <w:proofErr w:type="spellEnd"/>
+      <w:r>
+        <w:t xml:space="preserve">(). Následně se připraví SQL příkaz pro vložení nového záznamu do tabulky </w:t>
+      </w:r>
+      <w:proofErr w:type="spellStart"/>
+      <w:r>
+        <w:t>credentials</w:t>
+      </w:r>
+      <w:proofErr w:type="spellEnd"/>
+      <w:r>
+        <w:t xml:space="preserve">. Do tabulky se vkládají hodnoty pro sloupce </w:t>
+      </w:r>
+      <w:proofErr w:type="spellStart"/>
+      <w:r>
+        <w:t>username</w:t>
+      </w:r>
+      <w:proofErr w:type="spellEnd"/>
+      <w:r>
+        <w:t xml:space="preserve"> (uživatelské jméno), </w:t>
+      </w:r>
+      <w:proofErr w:type="spellStart"/>
+      <w:r>
+        <w:t>password</w:t>
+      </w:r>
+      <w:proofErr w:type="spellEnd"/>
+      <w:r>
+        <w:t xml:space="preserve"> (zašifrované heslo), </w:t>
+      </w:r>
+      <w:proofErr w:type="spellStart"/>
+      <w:r>
+        <w:t>url</w:t>
+      </w:r>
+      <w:proofErr w:type="spellEnd"/>
+      <w:r>
+        <w:t xml:space="preserve"> (adresa webu), </w:t>
+      </w:r>
+      <w:proofErr w:type="spellStart"/>
+      <w:r>
+        <w:t>user_id</w:t>
+      </w:r>
+      <w:proofErr w:type="spellEnd"/>
+      <w:r>
+        <w:t xml:space="preserve"> (identifikátor uživatele) a </w:t>
+      </w:r>
+      <w:proofErr w:type="spellStart"/>
+      <w:r>
+        <w:t>iv</w:t>
+      </w:r>
+      <w:proofErr w:type="spellEnd"/>
+      <w:r>
+        <w:t xml:space="preserve"> (inicializační vektor). Pomocí konstrukce </w:t>
+      </w:r>
+      <w:proofErr w:type="spellStart"/>
+      <w:r>
+        <w:t>using</w:t>
+      </w:r>
+      <w:proofErr w:type="spellEnd"/>
+      <w:r>
+        <w:t xml:space="preserve"> se vytvoří příkaz </w:t>
+      </w:r>
+      <w:proofErr w:type="spellStart"/>
+      <w:r>
+        <w:t>MySqlCommand</w:t>
+      </w:r>
+      <w:proofErr w:type="spellEnd"/>
+      <w:r>
+        <w:t>, kterému se předá SQL dotaz a otevřené databázové připojení. Do tohoto příkazu se následně pomocí parametrů vloží konkrétní hodnoty.</w:t>
+      </w:r>
+      <w:r>
+        <w:rPr>
+          <w:rFonts w:ascii="Segoe UI" w:hAnsi="Segoe UI" w:cs="Segoe UI"/>
+          <w:color w:val="F9FAFB"/>
+          <w:szCs w:val="24"/>
+          <w:lang w:eastAsia="sk-SK"/>
+        </w:rPr>
+        <w:t xml:space="preserve"> </w:t>
+      </w:r>
+      <w:r>
+        <w:t xml:space="preserve">Po nastavení všech parametrů se provede samotný dotaz příkazem </w:t>
+      </w:r>
+      <w:proofErr w:type="spellStart"/>
+      <w:r>
+        <w:t>command.ExecuteNonQuery</w:t>
+      </w:r>
+      <w:proofErr w:type="spellEnd"/>
+      <w:r>
+        <w:t>(), který vloží nový řádek do databáze.</w:t>
+      </w:r>
+    </w:p>
+    <w:p>
+      <w:r>
+        <w:rPr>
+          <w:noProof/>
+        </w:rPr>
+        <w:drawing>
+          <wp:inline distT="0" distB="0" distL="0" distR="0" wp14:anchorId="2D1D3056" wp14:editId="2EFDCCE6">
+            <wp:extent cx="5219700" cy="2346960"/>
+            <wp:effectExtent l="0" t="0" r="0" b="0"/>
+            <wp:docPr id="1652203355" name="Obrázek 1" descr="Obsah obrázku text, snímek obrazovky, software, Písmo&#10;&#10;Obsah generovaný pomocí AI může být nesprávný."/>
+            <wp:cNvGraphicFramePr>
+              <a:graphicFrameLocks xmlns:a="http://schemas.openxmlformats.org/drawingml/2006/main" noChangeAspect="1"/>
+            </wp:cNvGraphicFramePr>
+            <a:graphic xmlns:a="http://schemas.openxmlformats.org/drawingml/2006/main">
+              <a:graphicData uri="http://schemas.openxmlformats.org/drawingml/2006/picture">
+                <pic:pic xmlns:pic="http://schemas.openxmlformats.org/drawingml/2006/picture">
+                  <pic:nvPicPr>
+                    <pic:cNvPr id="1652203355" name="Obrázek 1" descr="Obsah obrázku text, snímek obrazovky, software, Písmo&#10;&#10;Obsah generovaný pomocí AI může být nesprávný."/>
+                    <pic:cNvPicPr/>
+                  </pic:nvPicPr>
+                  <pic:blipFill>
+                    <a:blip r:embed="rId30"/>
+                    <a:stretch>
+                      <a:fillRect/>
+                    </a:stretch>
+                  </pic:blipFill>
+                  <pic:spPr>
+                    <a:xfrm>
+                      <a:off x="0" y="0"/>
+                      <a:ext cx="5219700" cy="2346960"/>
+                    </a:xfrm>
+                    <a:prstGeom prst="rect">
+                      <a:avLst/>
+                    </a:prstGeom>
+                  </pic:spPr>
+                </pic:pic>
+              </a:graphicData>
+            </a:graphic>
+          </wp:inline>
+        </w:drawing>
+      </w:r>
+    </w:p>
+    <w:p>
+      <w:r>
+        <w:t xml:space="preserve">Pokud vše proběhne v pořádku, zobrazí se informační okno a formulář se zavře. </w:t>
+      </w:r>
+      <w:r>
+        <w:t xml:space="preserve">Po zavření formuláře </w:t>
+      </w:r>
+      <w:proofErr w:type="spellStart"/>
+      <w:r>
+        <w:t>Credentials_add.cs</w:t>
+      </w:r>
+      <w:proofErr w:type="spellEnd"/>
+      <w:r>
+        <w:t xml:space="preserve"> se znovu načte </w:t>
+      </w:r>
+      <w:proofErr w:type="spellStart"/>
+      <w:r>
+        <w:t>datagridview</w:t>
+      </w:r>
+      <w:proofErr w:type="spellEnd"/>
+      <w:r>
+        <w:t>.</w:t>
+      </w:r>
+    </w:p>
+    <w:p>
+      <w:r>
+        <w:t xml:space="preserve">Na formuláři </w:t>
+      </w:r>
+      <w:proofErr w:type="spellStart"/>
+      <w:r>
+        <w:t>Credentials.cs</w:t>
+      </w:r>
+      <w:proofErr w:type="spellEnd"/>
+      <w:r>
+        <w:t xml:space="preserve"> se taky nachází tlačítko pro mazání už nepotřebných přihlašovacích údajů</w:t>
+      </w:r>
+      <w:r>
+        <w:t xml:space="preserve"> </w:t>
+      </w:r>
+      <w:r>
+        <w:t>z</w:t>
+      </w:r>
+      <w:r>
+        <w:t xml:space="preserve"> </w:t>
+      </w:r>
+      <w:proofErr w:type="spellStart"/>
+      <w:r>
+        <w:t>datagridview</w:t>
+      </w:r>
+      <w:proofErr w:type="spellEnd"/>
+      <w:r>
+        <w:t xml:space="preserve"> a z</w:t>
+      </w:r>
+      <w:r>
+        <w:t xml:space="preserve"> </w:t>
+      </w:r>
+      <w:r>
+        <w:t>databáze.</w:t>
+      </w:r>
+      <w:r>
+        <w:t xml:space="preserve"> Pro zmazání údajů je potřeba odstranit řádek nebo řádky, které chcete odstranit, když je neoznačíte vyskočí na vás oznámení, že nejdříve musíte označit řádky k smazání a pak ještě potvrdit, že je chcete opravdu smazat. </w:t>
+      </w:r>
+      <w:r>
+        <w:t xml:space="preserve">Pro každý vybraný řádek se nejprve pokusí získat hodnotu z prvního </w:t>
+      </w:r>
+      <w:r>
+        <w:lastRenderedPageBreak/>
+        <w:t>sloupce (index 0) a převést ji na celé číslo. Pokud se převod nezdaří, řádek se přeskočí a pokračuje se dalším vybraným řádkem.</w:t>
+      </w:r>
+    </w:p>
+    <w:p>
+      <w:r>
+        <w:t xml:space="preserve">Pokud se podaří hodnotu úspěšně převést na číslo id, program se pokusí otevřít databázové připojení </w:t>
+      </w:r>
+      <w:proofErr w:type="spellStart"/>
+      <w:r>
+        <w:t>conn.Open</w:t>
+      </w:r>
+      <w:proofErr w:type="spellEnd"/>
+      <w:r>
+        <w:t>().</w:t>
+      </w:r>
+      <w:r>
+        <w:t xml:space="preserve"> Pak </w:t>
+      </w:r>
+      <w:r>
+        <w:t>program přistoupí k samotnému mazání. Nejprve je definován SQL příkaz pro smazání záznamu:</w:t>
+      </w:r>
+      <w:r>
+        <w:t xml:space="preserve"> </w:t>
+      </w:r>
+      <w:r>
+        <w:t xml:space="preserve">"DELETE FROM </w:t>
+      </w:r>
+      <w:proofErr w:type="spellStart"/>
+      <w:r>
+        <w:t>credentials</w:t>
+      </w:r>
+      <w:proofErr w:type="spellEnd"/>
+      <w:r>
+        <w:t xml:space="preserve"> WHERE id = @id". Tento příkaz maže řádek v</w:t>
+      </w:r>
+      <w:r>
+        <w:t xml:space="preserve"> </w:t>
+      </w:r>
+      <w:r>
+        <w:t>tabulce</w:t>
+      </w:r>
+      <w:r>
+        <w:t xml:space="preserve"> </w:t>
+      </w:r>
+      <w:proofErr w:type="spellStart"/>
+      <w:r>
+        <w:t>credentials</w:t>
+      </w:r>
+      <w:proofErr w:type="spellEnd"/>
+      <w:r>
+        <w:t>, jehož sloupec</w:t>
+      </w:r>
+      <w:r>
+        <w:t xml:space="preserve"> </w:t>
+      </w:r>
+      <w:r>
+        <w:t>id</w:t>
+      </w:r>
+      <w:r>
+        <w:t xml:space="preserve"> </w:t>
+      </w:r>
+      <w:r>
+        <w:t xml:space="preserve">se shoduje </w:t>
+      </w:r>
+      <w:r>
+        <w:t>se</w:t>
+      </w:r>
+      <w:r>
+        <w:t xml:space="preserve"> zadanou hodnotou.</w:t>
+      </w:r>
+    </w:p>
+    <w:p>
+      <w:r>
+        <w:t>Pomocí konstrukce</w:t>
+      </w:r>
+      <w:r>
+        <w:t xml:space="preserve"> </w:t>
+      </w:r>
+      <w:proofErr w:type="spellStart"/>
+      <w:r>
+        <w:t>using</w:t>
+      </w:r>
+      <w:proofErr w:type="spellEnd"/>
+      <w:r>
+        <w:t xml:space="preserve"> j</w:t>
+      </w:r>
+      <w:r>
+        <w:t>e vytvořen databázový příkaz (</w:t>
+      </w:r>
+      <w:proofErr w:type="spellStart"/>
+      <w:r>
+        <w:t>MySqlCommand</w:t>
+      </w:r>
+      <w:proofErr w:type="spellEnd"/>
+      <w:r>
+        <w:t>), kterému se předá SQL dotaz a otevřené připojení</w:t>
+      </w:r>
+      <w:r>
+        <w:t xml:space="preserve"> </w:t>
+      </w:r>
+      <w:proofErr w:type="spellStart"/>
+      <w:r>
+        <w:t>conn</w:t>
+      </w:r>
+      <w:proofErr w:type="spellEnd"/>
+      <w:r>
+        <w:t>. Následně je do dotazu doplněn parametr</w:t>
+      </w:r>
+      <w:r>
+        <w:t xml:space="preserve"> </w:t>
+      </w:r>
+      <w:r>
+        <w:t>@id, a to konkrétně hodnotou</w:t>
+      </w:r>
+      <w:r>
+        <w:t xml:space="preserve"> </w:t>
+      </w:r>
+      <w:r>
+        <w:t>id, která byla získána z vybraného řádku tabulky. Parametr se vkládá metodou</w:t>
+      </w:r>
+      <w:r>
+        <w:t xml:space="preserve"> </w:t>
+      </w:r>
+      <w:proofErr w:type="spellStart"/>
+      <w:r>
+        <w:t>AddWithValue</w:t>
+      </w:r>
+      <w:proofErr w:type="spellEnd"/>
+      <w:r>
+        <w:t>, která automaticky určí datový typ podle vkládané hodnoty.</w:t>
+      </w:r>
+    </w:p>
+    <w:p>
+      <w:r>
+        <w:t>Poté je příkaz spuštěn metodou</w:t>
+      </w:r>
+      <w:r>
+        <w:t xml:space="preserve"> </w:t>
+      </w:r>
+      <w:proofErr w:type="spellStart"/>
+      <w:r>
+        <w:t>ExecuteNonQuery</w:t>
+      </w:r>
+      <w:proofErr w:type="spellEnd"/>
+      <w:r>
+        <w:t>(), která provede samotné smazání záznamu v databázi. Po úspěšném smazání z databáze je třeba aktualizovat i samotné zobrazení v tabulce – proto je z</w:t>
+      </w:r>
+      <w:r>
+        <w:t xml:space="preserve"> </w:t>
+      </w:r>
+      <w:proofErr w:type="spellStart"/>
+      <w:r>
+        <w:t>DataGridView</w:t>
+      </w:r>
+      <w:proofErr w:type="spellEnd"/>
+      <w:r>
+        <w:t xml:space="preserve"> </w:t>
+      </w:r>
+      <w:r>
+        <w:t>odstraněn i příslušný řádek (</w:t>
+      </w:r>
+      <w:proofErr w:type="gramStart"/>
+      <w:r>
+        <w:t>dataGridView1.Rows.Remove</w:t>
+      </w:r>
+      <w:proofErr w:type="gramEnd"/>
+      <w:r>
+        <w:t>(</w:t>
+      </w:r>
+      <w:proofErr w:type="spellStart"/>
+      <w:r>
+        <w:t>row</w:t>
+      </w:r>
+      <w:proofErr w:type="spellEnd"/>
+      <w:r>
+        <w:t>)).</w:t>
+      </w:r>
     </w:p>
     <w:p>
       <w:pPr>
         <w:pStyle w:val="Nadpis3"/>
       </w:pPr>
-      <w:bookmarkStart w:id="70" w:name="_Toc220153200"/>
-      <w:r>
-        <w:lastRenderedPageBreak/>
-        <w:t>Správa hesel</w:t>
-      </w:r>
-      <w:bookmarkEnd w:id="70"/>
-      <w:r>
-        <w:t xml:space="preserve"> </w:t>
-      </w:r>
+      <w:bookmarkStart w:id="71" w:name="_Toc220153201"/>
+      <w:r>
+        <w:t>Kategorie hesel</w:t>
+      </w:r>
+      <w:bookmarkEnd w:id="71"/>
+    </w:p>
+    <w:p>
+      <w:pPr>
+        <w:pStyle w:val="Pokraovn"/>
+      </w:pPr>
     </w:p>
     <w:p>
       <w:pPr>
         <w:pStyle w:val="Nadpis3"/>
       </w:pPr>
-      <w:bookmarkStart w:id="71" w:name="_Toc220153201"/>
-      <w:r>
-        <w:t>Kategorie hesel</w:t>
-      </w:r>
-      <w:bookmarkEnd w:id="71"/>
-      <w:r>
-        <w:t xml:space="preserve"> </w:t>
-      </w:r>
-    </w:p>
-    <w:p>
-      <w:pPr>
-        <w:pStyle w:val="Nadpis3"/>
-      </w:pPr>
       <w:bookmarkStart w:id="72" w:name="_Toc220153202"/>
       <w:r>
         <w:t>Kontrola duplicit</w:t>
       </w:r>
       <w:bookmarkEnd w:id="72"/>
-      <w:r>
-        <w:t xml:space="preserve"> </w:t>
-      </w:r>
     </w:p>
     <w:p>
       <w:pPr>
@@ -13513,7 +14473,7 @@
       <w:r>
         <w:t xml:space="preserve"> Online. Microsoft. 2022. Dostupné z: </w:t>
       </w:r>
-      <w:hyperlink r:id="rId24" w:tgtFrame="_blank" w:history="1">
+      <w:hyperlink r:id="rId31" w:tgtFrame="_blank" w:history="1">
         <w:r>
           <w:rPr>
             <w:rStyle w:val="Hypertextovodkaz"/>
@@ -13579,7 +14539,7 @@
       <w:r>
         <w:t>. Online. Microsoft. 2020. Dostupné z: </w:t>
       </w:r>
-      <w:hyperlink r:id="rId25" w:history="1">
+      <w:hyperlink r:id="rId32" w:history="1">
         <w:r>
           <w:rPr>
             <w:rStyle w:val="Hypertextovodkaz"/>
@@ -13664,13 +14624,21 @@
       <w:r>
         <w:t xml:space="preserve"> 2023, 18.8.2023. Dostupné z: </w:t>
       </w:r>
-      <w:hyperlink r:id="rId26" w:history="1">
+      <w:hyperlink r:id="rId33" w:history="1">
         <w:r>
           <w:rPr>
             <w:rStyle w:val="Hypertextovodkaz"/>
           </w:rPr>
-          <w:t>https://ssd.eff.org/module/creating-strong-passwords</w:t>
+          <w:t>https://ssd.eff.org/module/</w:t>
         </w:r>
+        <w:proofErr w:type="spellStart"/>
+        <w:r>
+          <w:rPr>
+            <w:rStyle w:val="Hypertextovodkaz"/>
+          </w:rPr>
+          <w:t>creating-strong-passwords</w:t>
+        </w:r>
+        <w:proofErr w:type="spellEnd"/>
       </w:hyperlink>
       <w:r>
         <w:t>. [cit. 2026-01-09].</w:t>
@@ -13730,7 +14698,7 @@
       <w:r>
         <w:t>. Online. Microsoft. 2023. Dostupné z: </w:t>
       </w:r>
-      <w:hyperlink r:id="rId27" w:history="1">
+      <w:hyperlink r:id="rId34" w:history="1">
         <w:r>
           <w:rPr>
             <w:rStyle w:val="Hypertextovodkaz"/>
@@ -13770,13 +14738,63 @@
       <w:r>
         <w:t>. Online. Microsoft. 2024, 10.1.2024. Dostupné z: </w:t>
       </w:r>
-      <w:hyperlink r:id="rId28" w:history="1">
+      <w:hyperlink r:id="rId35" w:history="1">
         <w:r>
           <w:rPr>
             <w:rStyle w:val="Hypertextovodkaz"/>
           </w:rPr>
-          <w:t>https://learn.microsoft.com/en-us/dotnet/core/introduction</w:t>
+          <w:t>https://learn.microsoft.com/en-</w:t>
         </w:r>
+        <w:proofErr w:type="spellStart"/>
+        <w:r>
+          <w:rPr>
+            <w:rStyle w:val="Hypertextovodkaz"/>
+          </w:rPr>
+          <w:t>us</w:t>
+        </w:r>
+        <w:proofErr w:type="spellEnd"/>
+        <w:r>
+          <w:rPr>
+            <w:rStyle w:val="Hypertextovodkaz"/>
+          </w:rPr>
+          <w:t>/</w:t>
+        </w:r>
+        <w:proofErr w:type="spellStart"/>
+        <w:r>
+          <w:rPr>
+            <w:rStyle w:val="Hypertextovodkaz"/>
+          </w:rPr>
+          <w:t>dotnet</w:t>
+        </w:r>
+        <w:proofErr w:type="spellEnd"/>
+        <w:r>
+          <w:rPr>
+            <w:rStyle w:val="Hypertextovodkaz"/>
+          </w:rPr>
+          <w:t>/</w:t>
+        </w:r>
+        <w:proofErr w:type="spellStart"/>
+        <w:r>
+          <w:rPr>
+            <w:rStyle w:val="Hypertextovodkaz"/>
+          </w:rPr>
+          <w:t>core</w:t>
+        </w:r>
+        <w:proofErr w:type="spellEnd"/>
+        <w:r>
+          <w:rPr>
+            <w:rStyle w:val="Hypertextovodkaz"/>
+          </w:rPr>
+          <w:t>/</w:t>
+        </w:r>
+        <w:proofErr w:type="spellStart"/>
+        <w:r>
+          <w:rPr>
+            <w:rStyle w:val="Hypertextovodkaz"/>
+          </w:rPr>
+          <w:t>introduction</w:t>
+        </w:r>
+        <w:proofErr w:type="spellEnd"/>
       </w:hyperlink>
       <w:r>
         <w:t>. [cit. 2026-01-09].</w:t>
@@ -13857,7 +14875,7 @@
       <w:r>
         <w:t>. Online. Medium. 2024. Dostupné z: </w:t>
       </w:r>
-      <w:hyperlink r:id="rId29" w:history="1">
+      <w:hyperlink r:id="rId36" w:history="1">
         <w:r>
           <w:rPr>
             <w:rStyle w:val="Hypertextovodkaz"/>
@@ -13914,24 +14932,12 @@
       <w:r>
         <w:t xml:space="preserve"> 2014. Dostupné z: </w:t>
       </w:r>
-      <w:hyperlink r:id="rId30" w:history="1">
+      <w:hyperlink r:id="rId37" w:history="1">
         <w:r>
           <w:rPr>
             <w:rStyle w:val="Hypertextovodkaz"/>
           </w:rPr>
-          <w:t>https://www.grappa.sk</w:t>
-        </w:r>
-        <w:r>
-          <w:rPr>
-            <w:rStyle w:val="Hypertextovodkaz"/>
-          </w:rPr>
-          <w:t>/</w:t>
-        </w:r>
-        <w:r>
-          <w:rPr>
-            <w:rStyle w:val="Hypertextovodkaz"/>
-          </w:rPr>
-          <w:t>blog/co-je-to-ux-a-ui-a-aky-je-medzi-nimi-rozdiel/</w:t>
+          <w:t>https://www.grappa.sk/blog/co-je-to-ux-a-ui-a-aky-je-medzi-nimi-rozdiel/</w:t>
         </w:r>
       </w:hyperlink>
       <w:r>
@@ -13967,7 +14973,7 @@
       <w:r>
         <w:t>. 2014. Dostupné z: </w:t>
       </w:r>
-      <w:hyperlink r:id="rId31" w:history="1">
+      <w:hyperlink r:id="rId38" w:history="1">
         <w:r>
           <w:rPr>
             <w:rStyle w:val="Hypertextovodkaz"/>
@@ -14028,7 +15034,7 @@
       <w:r>
         <w:t>2013. Dostupné z: </w:t>
       </w:r>
-      <w:hyperlink r:id="rId32" w:history="1">
+      <w:hyperlink r:id="rId39" w:history="1">
         <w:r>
           <w:rPr>
             <w:rStyle w:val="Hypertextovodkaz"/>
@@ -14137,7 +15143,7 @@
       <w:r>
         <w:t xml:space="preserve"> 2022. Dostupné z: </w:t>
       </w:r>
-      <w:hyperlink r:id="rId33" w:history="1">
+      <w:hyperlink r:id="rId40" w:history="1">
         <w:r>
           <w:rPr>
             <w:rStyle w:val="Hypertextovodkaz"/>
@@ -14193,7 +15199,7 @@
       <w:r>
         <w:t>2023, 14.3.2023. Dostupné z: </w:t>
       </w:r>
-      <w:hyperlink r:id="rId34" w:history="1">
+      <w:hyperlink r:id="rId41" w:history="1">
         <w:r>
           <w:rPr>
             <w:rStyle w:val="Hypertextovodkaz"/>
@@ -14236,7 +15242,7 @@
       <w:r>
         <w:t>Online. 2025. Dostupné z: </w:t>
       </w:r>
-      <w:hyperlink r:id="rId35" w:history="1">
+      <w:hyperlink r:id="rId42" w:history="1">
         <w:r>
           <w:rPr>
             <w:rStyle w:val="Hypertextovodkaz"/>
@@ -14283,13 +15289,21 @@
       <w:r>
         <w:t>. 2024. Dostupné z: </w:t>
       </w:r>
-      <w:hyperlink r:id="rId36" w:history="1">
+      <w:hyperlink r:id="rId43" w:history="1">
         <w:r>
           <w:rPr>
             <w:rStyle w:val="Hypertextovodkaz"/>
           </w:rPr>
-          <w:t>https://www.strafelda.cz/hash</w:t>
+          <w:t>https://www.strafelda.cz/</w:t>
         </w:r>
+        <w:proofErr w:type="spellStart"/>
+        <w:r>
+          <w:rPr>
+            <w:rStyle w:val="Hypertextovodkaz"/>
+          </w:rPr>
+          <w:t>hash</w:t>
+        </w:r>
+        <w:proofErr w:type="spellEnd"/>
       </w:hyperlink>
       <w:r>
         <w:t>. [cit. 2026-01-24].</w:t>
@@ -14339,7 +15353,7 @@
       <w:r>
         <w:t> Online. Microsoft. 2026. Dostupné z: </w:t>
       </w:r>
-      <w:hyperlink r:id="rId37" w:history="1">
+      <w:hyperlink r:id="rId44" w:history="1">
         <w:r>
           <w:rPr>
             <w:rStyle w:val="Hypertextovodkaz"/>
@@ -14454,7 +15468,7 @@
       <w:r>
         <w:t>. 2016. Dostupné z: </w:t>
       </w:r>
-      <w:hyperlink r:id="rId38" w:history="1">
+      <w:hyperlink r:id="rId45" w:history="1">
         <w:r>
           <w:rPr>
             <w:rStyle w:val="Hypertextovodkaz"/>
@@ -14541,7 +15555,7 @@
       <w:r>
         <w:t xml:space="preserve"> 2025. Dostupné z: </w:t>
       </w:r>
-      <w:hyperlink r:id="rId39" w:anchor="SQL_Enjeksiyon_Saldirisinin_Tanimi_ve_Onemi" w:history="1">
+      <w:hyperlink r:id="rId46" w:anchor="SQL_Enjeksiyon_Saldirisinin_Tanimi_ve_Onemi" w:history="1">
         <w:r>
           <w:rPr>
             <w:rStyle w:val="Hypertextovodkaz"/>
@@ -14642,7 +15656,7 @@
       <w:r>
         <w:t>2013. Dostupné z: </w:t>
       </w:r>
-      <w:hyperlink r:id="rId40" w:history="1">
+      <w:hyperlink r:id="rId47" w:history="1">
         <w:r>
           <w:rPr>
             <w:rStyle w:val="Hypertextovodkaz"/>
@@ -14752,7 +15766,7 @@
       <w:r>
         <w:t xml:space="preserve"> 2025, 18.3.2025. Dostupné z: </w:t>
       </w:r>
-      <w:hyperlink r:id="rId41" w:history="1">
+      <w:hyperlink r:id="rId48" w:history="1">
         <w:r>
           <w:rPr>
             <w:rStyle w:val="Hypertextovodkaz"/>
@@ -14794,12 +15808,40 @@
       <w:r>
         <w:t>. 2024. Dostupné z: </w:t>
       </w:r>
-      <w:hyperlink r:id="rId42" w:history="1">
+      <w:hyperlink r:id="rId49" w:history="1">
         <w:r>
           <w:rPr>
             <w:rStyle w:val="Hypertextovodkaz"/>
           </w:rPr>
-          <w:t>https://www.eea.sk/slovnik/backlog/</w:t>
+          <w:t>https://www.eea.sk/</w:t>
+        </w:r>
+        <w:proofErr w:type="spellStart"/>
+        <w:r>
+          <w:rPr>
+            <w:rStyle w:val="Hypertextovodkaz"/>
+          </w:rPr>
+          <w:t>slovnik</w:t>
+        </w:r>
+        <w:proofErr w:type="spellEnd"/>
+        <w:r>
+          <w:rPr>
+            <w:rStyle w:val="Hypertextovodkaz"/>
+          </w:rPr>
+          <w:t>/</w:t>
+        </w:r>
+        <w:proofErr w:type="spellStart"/>
+        <w:r>
+          <w:rPr>
+            <w:rStyle w:val="Hypertextovodkaz"/>
+          </w:rPr>
+          <w:t>backlog</w:t>
+        </w:r>
+        <w:proofErr w:type="spellEnd"/>
+        <w:r>
+          <w:rPr>
+            <w:rStyle w:val="Hypertextovodkaz"/>
+          </w:rPr>
+          <w:t>/</w:t>
         </w:r>
       </w:hyperlink>
       <w:r>
@@ -14981,7 +16023,7 @@
       <w:r>
         <w:t>. 2021, 8.8.2025. Dostupné z: </w:t>
       </w:r>
-      <w:hyperlink r:id="rId43" w:history="1">
+      <w:hyperlink r:id="rId50" w:history="1">
         <w:r>
           <w:rPr>
             <w:rStyle w:val="Hypertextovodkaz"/>
@@ -15701,7 +16743,7 @@
       <w:bookmarkEnd w:id="121"/>
     </w:p>
     <w:sectPr>
-      <w:footerReference w:type="default" r:id="rId44"/>
+      <w:footerReference w:type="default" r:id="rId51"/>
       <w:pgSz w:w="11906" w:h="16838"/>
       <w:pgMar w:top="1701" w:right="1418" w:bottom="1701" w:left="2268" w:header="709" w:footer="709" w:gutter="0"/>
       <w:cols w:space="708"/>
@@ -21159,7 +22201,6 @@
     <w:name w:val="Normal (Web)"/>
     <w:basedOn w:val="Normln"/>
     <w:uiPriority w:val="99"/>
-    <w:semiHidden/>
     <w:unhideWhenUsed/>
     <w:rsid w:val="000577A7"/>
     <w:pPr>
@@ -21269,6 +22310,17 @@
     <w:name w:val="hljs-string"/>
     <w:basedOn w:val="Standardnpsmoodstavce"/>
     <w:rsid w:val="009253BB"/>
+  </w:style>
+  <w:style w:type="character" w:styleId="Zdraznn">
+    <w:name w:val="Emphasis"/>
+    <w:basedOn w:val="Standardnpsmoodstavce"/>
+    <w:uiPriority w:val="20"/>
+    <w:qFormat/>
+    <w:rsid w:val="004C5F69"/>
+    <w:rPr>
+      <w:i/>
+      <w:iCs/>
+    </w:rPr>
   </w:style>
 </w:styles>
 </file>

</xml_diff>